<commit_message>
Week 4 - Update
</commit_message>
<xml_diff>
--- a/LABlogbook.docx
+++ b/LABlogbook.docx
@@ -753,6 +753,7 @@
       </w:pPr>
       <w:r>
         <w:rPr>
+          <w:noProof/>
           <w:sz w:val="44"/>
           <w:szCs w:val="44"/>
           <w:u w:val="single"/>
@@ -824,14 +825,199 @@
           <w:sz w:val="28"/>
           <w:szCs w:val="28"/>
         </w:rPr>
-        <w:t>s 0.</w:t>
-      </w:r>
-      <w:r>
-        <w:rPr>
-          <w:sz w:val="28"/>
-          <w:szCs w:val="28"/>
-        </w:rPr>
-        <w:t>887</w:t>
+        <w:t>s 0.887</w:t>
+      </w:r>
+    </w:p>
+    <w:p>
+      <w:pPr>
+        <w:jc w:val="both"/>
+        <w:rPr>
+          <w:sz w:val="44"/>
+          <w:szCs w:val="44"/>
+          <w:u w:val="single"/>
+        </w:rPr>
+      </w:pPr>
+    </w:p>
+    <w:p>
+      <w:pPr>
+        <w:jc w:val="both"/>
+        <w:rPr>
+          <w:sz w:val="44"/>
+          <w:szCs w:val="44"/>
+          <w:u w:val="single"/>
+        </w:rPr>
+      </w:pPr>
+    </w:p>
+    <w:p>
+      <w:pPr>
+        <w:jc w:val="both"/>
+        <w:rPr>
+          <w:sz w:val="44"/>
+          <w:szCs w:val="44"/>
+          <w:u w:val="single"/>
+        </w:rPr>
+      </w:pPr>
+    </w:p>
+    <w:p>
+      <w:pPr>
+        <w:jc w:val="both"/>
+        <w:rPr>
+          <w:sz w:val="44"/>
+          <w:szCs w:val="44"/>
+          <w:u w:val="single"/>
+        </w:rPr>
+      </w:pPr>
+    </w:p>
+    <w:p>
+      <w:pPr>
+        <w:jc w:val="both"/>
+        <w:rPr>
+          <w:sz w:val="44"/>
+          <w:szCs w:val="44"/>
+          <w:u w:val="single"/>
+        </w:rPr>
+      </w:pPr>
+    </w:p>
+    <w:p>
+      <w:pPr>
+        <w:jc w:val="both"/>
+        <w:rPr>
+          <w:sz w:val="44"/>
+          <w:szCs w:val="44"/>
+          <w:u w:val="single"/>
+        </w:rPr>
+      </w:pPr>
+      <w:r>
+        <w:rPr>
+          <w:sz w:val="44"/>
+          <w:szCs w:val="44"/>
+          <w:u w:val="single"/>
+        </w:rPr>
+        <w:lastRenderedPageBreak/>
+        <w:t>Lab 4</w:t>
+      </w:r>
+    </w:p>
+    <w:p>
+      <w:pPr>
+        <w:jc w:val="center"/>
+        <w:rPr>
+          <w:sz w:val="44"/>
+          <w:szCs w:val="44"/>
+          <w:u w:val="single"/>
+        </w:rPr>
+      </w:pPr>
+      <w:r>
+        <w:rPr>
+          <w:sz w:val="44"/>
+          <w:szCs w:val="44"/>
+          <w:u w:val="single"/>
+        </w:rPr>
+        <w:drawing>
+          <wp:inline distT="0" distB="0" distL="0" distR="0" wp14:anchorId="379B03DD" wp14:editId="2EAB2B9C">
+            <wp:extent cx="5162550" cy="3459812"/>
+            <wp:effectExtent l="0" t="0" r="0" b="7620"/>
+            <wp:docPr id="1070603458" name="Picture 1"/>
+            <wp:cNvGraphicFramePr>
+              <a:graphicFrameLocks xmlns:a="http://schemas.openxmlformats.org/drawingml/2006/main" noChangeAspect="1"/>
+            </wp:cNvGraphicFramePr>
+            <a:graphic xmlns:a="http://schemas.openxmlformats.org/drawingml/2006/main">
+              <a:graphicData uri="http://schemas.openxmlformats.org/drawingml/2006/picture">
+                <pic:pic xmlns:pic="http://schemas.openxmlformats.org/drawingml/2006/picture">
+                  <pic:nvPicPr>
+                    <pic:cNvPr id="1070603458" name=""/>
+                    <pic:cNvPicPr/>
+                  </pic:nvPicPr>
+                  <pic:blipFill>
+                    <a:blip r:embed="rId11"/>
+                    <a:stretch>
+                      <a:fillRect/>
+                    </a:stretch>
+                  </pic:blipFill>
+                  <pic:spPr>
+                    <a:xfrm>
+                      <a:off x="0" y="0"/>
+                      <a:ext cx="5169698" cy="3464602"/>
+                    </a:xfrm>
+                    <a:prstGeom prst="rect">
+                      <a:avLst/>
+                    </a:prstGeom>
+                  </pic:spPr>
+                </pic:pic>
+              </a:graphicData>
+            </a:graphic>
+          </wp:inline>
+        </w:drawing>
+      </w:r>
+    </w:p>
+    <w:p>
+      <w:pPr>
+        <w:jc w:val="center"/>
+        <w:rPr>
+          <w:sz w:val="44"/>
+          <w:szCs w:val="44"/>
+          <w:u w:val="single"/>
+        </w:rPr>
+      </w:pPr>
+      <w:r>
+        <w:rPr>
+          <w:sz w:val="44"/>
+          <w:szCs w:val="44"/>
+          <w:u w:val="single"/>
+        </w:rPr>
+        <w:drawing>
+          <wp:inline distT="0" distB="0" distL="0" distR="0" wp14:anchorId="5B4A4736" wp14:editId="12BF15F3">
+            <wp:extent cx="5119828" cy="4581525"/>
+            <wp:effectExtent l="0" t="0" r="5080" b="0"/>
+            <wp:docPr id="1595346770" name="Picture 1"/>
+            <wp:cNvGraphicFramePr>
+              <a:graphicFrameLocks xmlns:a="http://schemas.openxmlformats.org/drawingml/2006/main" noChangeAspect="1"/>
+            </wp:cNvGraphicFramePr>
+            <a:graphic xmlns:a="http://schemas.openxmlformats.org/drawingml/2006/main">
+              <a:graphicData uri="http://schemas.openxmlformats.org/drawingml/2006/picture">
+                <pic:pic xmlns:pic="http://schemas.openxmlformats.org/drawingml/2006/picture">
+                  <pic:nvPicPr>
+                    <pic:cNvPr id="1595346770" name=""/>
+                    <pic:cNvPicPr/>
+                  </pic:nvPicPr>
+                  <pic:blipFill>
+                    <a:blip r:embed="rId12"/>
+                    <a:stretch>
+                      <a:fillRect/>
+                    </a:stretch>
+                  </pic:blipFill>
+                  <pic:spPr>
+                    <a:xfrm>
+                      <a:off x="0" y="0"/>
+                      <a:ext cx="5125850" cy="4586913"/>
+                    </a:xfrm>
+                    <a:prstGeom prst="rect">
+                      <a:avLst/>
+                    </a:prstGeom>
+                  </pic:spPr>
+                </pic:pic>
+              </a:graphicData>
+            </a:graphic>
+          </wp:inline>
+        </w:drawing>
+      </w:r>
+    </w:p>
+    <w:p>
+      <w:pPr>
+        <w:jc w:val="both"/>
+        <w:rPr>
+          <w:sz w:val="44"/>
+          <w:szCs w:val="44"/>
+          <w:u w:val="single"/>
+        </w:rPr>
+      </w:pPr>
+      <w:r>
+        <w:rPr>
+          <w:sz w:val="44"/>
+          <w:szCs w:val="44"/>
+          <w:u w:val="single"/>
+        </w:rPr>
+        <w:lastRenderedPageBreak/>
+        <w:t>Lab 5</w:t>
       </w:r>
     </w:p>
     <w:p>
@@ -861,69 +1047,6 @@
           <w:u w:val="single"/>
           <w:lang w:val="de-DE"/>
         </w:rPr>
-        <w:t>Lab 4</w:t>
-      </w:r>
-    </w:p>
-    <w:p>
-      <w:pPr>
-        <w:jc w:val="both"/>
-        <w:rPr>
-          <w:sz w:val="44"/>
-          <w:szCs w:val="44"/>
-          <w:u w:val="single"/>
-          <w:lang w:val="de-DE"/>
-        </w:rPr>
-      </w:pPr>
-    </w:p>
-    <w:p>
-      <w:pPr>
-        <w:jc w:val="both"/>
-        <w:rPr>
-          <w:sz w:val="44"/>
-          <w:szCs w:val="44"/>
-          <w:u w:val="single"/>
-          <w:lang w:val="de-DE"/>
-        </w:rPr>
-      </w:pPr>
-      <w:r>
-        <w:rPr>
-          <w:sz w:val="44"/>
-          <w:szCs w:val="44"/>
-          <w:u w:val="single"/>
-          <w:lang w:val="de-DE"/>
-        </w:rPr>
-        <w:t>Lab 5</w:t>
-      </w:r>
-    </w:p>
-    <w:p>
-      <w:pPr>
-        <w:jc w:val="both"/>
-        <w:rPr>
-          <w:sz w:val="44"/>
-          <w:szCs w:val="44"/>
-          <w:u w:val="single"/>
-          <w:lang w:val="de-DE"/>
-        </w:rPr>
-      </w:pPr>
-    </w:p>
-    <w:p>
-      <w:pPr>
-        <w:jc w:val="both"/>
-        <w:rPr>
-          <w:sz w:val="44"/>
-          <w:szCs w:val="44"/>
-          <w:u w:val="single"/>
-          <w:lang w:val="de-DE"/>
-        </w:rPr>
-      </w:pPr>
-      <w:r>
-        <w:rPr>
-          <w:sz w:val="44"/>
-          <w:szCs w:val="44"/>
-          <w:u w:val="single"/>
-          <w:lang w:val="de-DE"/>
-        </w:rPr>
-        <w:lastRenderedPageBreak/>
         <w:t>Lab 6</w:t>
       </w:r>
     </w:p>

</xml_diff>

<commit_message>
Lab 6 - Updated
</commit_message>
<xml_diff>
--- a/LABlogbook.docx
+++ b/LABlogbook.docx
@@ -1152,6 +1152,7 @@
       </w:pPr>
       <w:r>
         <w:rPr>
+          <w:noProof/>
           <w:sz w:val="44"/>
           <w:szCs w:val="44"/>
           <w:u w:val="single"/>
@@ -1206,6 +1207,7 @@
       </w:pPr>
       <w:r>
         <w:rPr>
+          <w:noProof/>
           <w:sz w:val="44"/>
           <w:szCs w:val="44"/>
           <w:u w:val="single"/>
@@ -1260,6 +1262,7 @@
       </w:pPr>
       <w:r>
         <w:rPr>
+          <w:noProof/>
           <w:sz w:val="44"/>
           <w:szCs w:val="44"/>
           <w:u w:val="single"/>
@@ -1326,6 +1329,7 @@
       </w:pPr>
       <w:r>
         <w:rPr>
+          <w:noProof/>
           <w:sz w:val="44"/>
           <w:szCs w:val="44"/>
           <w:u w:val="single"/>
@@ -1402,6 +1406,7 @@
       </w:pPr>
       <w:r>
         <w:rPr>
+          <w:noProof/>
           <w:sz w:val="44"/>
           <w:szCs w:val="44"/>
           <w:u w:val="single"/>
@@ -1468,6 +1473,7 @@
       </w:pPr>
       <w:r>
         <w:rPr>
+          <w:noProof/>
           <w:sz w:val="44"/>
           <w:szCs w:val="44"/>
           <w:u w:val="single"/>
@@ -1571,6 +1577,7 @@
       </w:pPr>
       <w:r>
         <w:rPr>
+          <w:noProof/>
           <w:sz w:val="32"/>
           <w:szCs w:val="32"/>
         </w:rPr>
@@ -1621,6 +1628,7 @@
       </w:pPr>
       <w:r>
         <w:rPr>
+          <w:noProof/>
           <w:sz w:val="32"/>
           <w:szCs w:val="32"/>
         </w:rPr>
@@ -1665,26 +1673,20 @@
       <w:pPr>
         <w:jc w:val="both"/>
         <w:rPr>
-          <w:sz w:val="32"/>
-          <w:szCs w:val="32"/>
-        </w:rPr>
-      </w:pPr>
-    </w:p>
-    <w:p>
-      <w:pPr>
-        <w:jc w:val="both"/>
-        <w:rPr>
-          <w:sz w:val="44"/>
-          <w:szCs w:val="44"/>
-          <w:u w:val="single"/>
-        </w:rPr>
-      </w:pPr>
-      <w:r>
-        <w:rPr>
-          <w:sz w:val="44"/>
-          <w:szCs w:val="44"/>
-          <w:u w:val="single"/>
-        </w:rPr>
+          <w:sz w:val="44"/>
+          <w:szCs w:val="44"/>
+          <w:u w:val="single"/>
+          <w:lang w:val="de-DE"/>
+        </w:rPr>
+      </w:pPr>
+      <w:r>
+        <w:rPr>
+          <w:sz w:val="44"/>
+          <w:szCs w:val="44"/>
+          <w:u w:val="single"/>
+          <w:lang w:val="de-DE"/>
+        </w:rPr>
+        <w:lastRenderedPageBreak/>
         <w:t>Lab 6</w:t>
       </w:r>
     </w:p>
@@ -1692,6 +1694,546 @@
       <w:pPr>
         <w:jc w:val="both"/>
         <w:rPr>
+          <w:sz w:val="36"/>
+          <w:szCs w:val="36"/>
+        </w:rPr>
+      </w:pPr>
+      <w:r>
+        <w:rPr>
+          <w:sz w:val="36"/>
+          <w:szCs w:val="36"/>
+        </w:rPr>
+        <w:t>1. Record the 2nd model's code &amp; plot the summary()</w:t>
+      </w:r>
+    </w:p>
+    <w:p>
+      <w:pPr>
+        <w:jc w:val="both"/>
+        <w:rPr>
+          <w:sz w:val="44"/>
+          <w:szCs w:val="44"/>
+          <w:u w:val="single"/>
+          <w:lang w:val="de-DE"/>
+        </w:rPr>
+      </w:pPr>
+      <w:r>
+        <w:rPr>
+          <w:sz w:val="44"/>
+          <w:szCs w:val="44"/>
+          <w:u w:val="single"/>
+          <w:lang w:val="de-DE"/>
+        </w:rPr>
+        <w:drawing>
+          <wp:inline distT="0" distB="0" distL="0" distR="0" wp14:anchorId="57033706" wp14:editId="131EE41F">
+            <wp:extent cx="5731510" cy="1144270"/>
+            <wp:effectExtent l="0" t="0" r="2540" b="0"/>
+            <wp:docPr id="444488271" name="Picture 1"/>
+            <wp:cNvGraphicFramePr>
+              <a:graphicFrameLocks xmlns:a="http://schemas.openxmlformats.org/drawingml/2006/main" noChangeAspect="1"/>
+            </wp:cNvGraphicFramePr>
+            <a:graphic xmlns:a="http://schemas.openxmlformats.org/drawingml/2006/main">
+              <a:graphicData uri="http://schemas.openxmlformats.org/drawingml/2006/picture">
+                <pic:pic xmlns:pic="http://schemas.openxmlformats.org/drawingml/2006/picture">
+                  <pic:nvPicPr>
+                    <pic:cNvPr id="444488271" name=""/>
+                    <pic:cNvPicPr/>
+                  </pic:nvPicPr>
+                  <pic:blipFill>
+                    <a:blip r:embed="rId24"/>
+                    <a:stretch>
+                      <a:fillRect/>
+                    </a:stretch>
+                  </pic:blipFill>
+                  <pic:spPr>
+                    <a:xfrm>
+                      <a:off x="0" y="0"/>
+                      <a:ext cx="5731510" cy="1144270"/>
+                    </a:xfrm>
+                    <a:prstGeom prst="rect">
+                      <a:avLst/>
+                    </a:prstGeom>
+                  </pic:spPr>
+                </pic:pic>
+              </a:graphicData>
+            </a:graphic>
+          </wp:inline>
+        </w:drawing>
+      </w:r>
+    </w:p>
+    <w:p>
+      <w:pPr>
+        <w:jc w:val="both"/>
+        <w:rPr>
+          <w:sz w:val="44"/>
+          <w:szCs w:val="44"/>
+          <w:u w:val="single"/>
+          <w:lang w:val="de-DE"/>
+        </w:rPr>
+      </w:pPr>
+    </w:p>
+    <w:p>
+      <w:pPr>
+        <w:jc w:val="both"/>
+        <w:rPr>
+          <w:sz w:val="44"/>
+          <w:szCs w:val="44"/>
+          <w:u w:val="single"/>
+          <w:lang w:val="de-DE"/>
+        </w:rPr>
+      </w:pPr>
+      <w:r>
+        <w:rPr>
+          <w:sz w:val="44"/>
+          <w:szCs w:val="44"/>
+          <w:u w:val="single"/>
+          <w:lang w:val="de-DE"/>
+        </w:rPr>
+        <w:drawing>
+          <wp:inline distT="0" distB="0" distL="0" distR="0" wp14:anchorId="7978F8EE" wp14:editId="4C5D7690">
+            <wp:extent cx="5731510" cy="4157345"/>
+            <wp:effectExtent l="0" t="0" r="2540" b="0"/>
+            <wp:docPr id="1466469152" name="Picture 1"/>
+            <wp:cNvGraphicFramePr>
+              <a:graphicFrameLocks xmlns:a="http://schemas.openxmlformats.org/drawingml/2006/main" noChangeAspect="1"/>
+            </wp:cNvGraphicFramePr>
+            <a:graphic xmlns:a="http://schemas.openxmlformats.org/drawingml/2006/main">
+              <a:graphicData uri="http://schemas.openxmlformats.org/drawingml/2006/picture">
+                <pic:pic xmlns:pic="http://schemas.openxmlformats.org/drawingml/2006/picture">
+                  <pic:nvPicPr>
+                    <pic:cNvPr id="1466469152" name=""/>
+                    <pic:cNvPicPr/>
+                  </pic:nvPicPr>
+                  <pic:blipFill>
+                    <a:blip r:embed="rId25"/>
+                    <a:stretch>
+                      <a:fillRect/>
+                    </a:stretch>
+                  </pic:blipFill>
+                  <pic:spPr>
+                    <a:xfrm>
+                      <a:off x="0" y="0"/>
+                      <a:ext cx="5731510" cy="4157345"/>
+                    </a:xfrm>
+                    <a:prstGeom prst="rect">
+                      <a:avLst/>
+                    </a:prstGeom>
+                  </pic:spPr>
+                </pic:pic>
+              </a:graphicData>
+            </a:graphic>
+          </wp:inline>
+        </w:drawing>
+      </w:r>
+    </w:p>
+    <w:p>
+      <w:pPr>
+        <w:jc w:val="both"/>
+        <w:rPr>
+          <w:sz w:val="44"/>
+          <w:szCs w:val="44"/>
+          <w:u w:val="single"/>
+          <w:lang w:val="de-DE"/>
+        </w:rPr>
+      </w:pPr>
+    </w:p>
+    <w:p>
+      <w:pPr>
+        <w:jc w:val="both"/>
+        <w:rPr>
+          <w:sz w:val="44"/>
+          <w:szCs w:val="44"/>
+          <w:u w:val="single"/>
+          <w:lang w:val="de-DE"/>
+        </w:rPr>
+      </w:pPr>
+    </w:p>
+    <w:p>
+      <w:pPr>
+        <w:jc w:val="both"/>
+        <w:rPr>
+          <w:sz w:val="44"/>
+          <w:szCs w:val="44"/>
+          <w:u w:val="single"/>
+          <w:lang w:val="de-DE"/>
+        </w:rPr>
+      </w:pPr>
+    </w:p>
+    <w:p>
+      <w:pPr>
+        <w:jc w:val="both"/>
+        <w:rPr>
+          <w:sz w:val="44"/>
+          <w:szCs w:val="44"/>
+          <w:u w:val="single"/>
+          <w:lang w:val="de-DE"/>
+        </w:rPr>
+      </w:pPr>
+    </w:p>
+    <w:p>
+      <w:pPr>
+        <w:jc w:val="both"/>
+        <w:rPr>
+          <w:sz w:val="36"/>
+          <w:szCs w:val="36"/>
+        </w:rPr>
+      </w:pPr>
+      <w:r>
+        <w:rPr>
+          <w:sz w:val="36"/>
+          <w:szCs w:val="36"/>
+        </w:rPr>
+        <w:lastRenderedPageBreak/>
+        <w:t>2. Copy your early-stop code and history_2 fit-training-process</w:t>
+      </w:r>
+    </w:p>
+    <w:p>
+      <w:pPr>
+        <w:jc w:val="both"/>
+        <w:rPr>
+          <w:sz w:val="36"/>
+          <w:szCs w:val="36"/>
+        </w:rPr>
+      </w:pPr>
+      <w:r>
+        <w:rPr>
+          <w:sz w:val="36"/>
+          <w:szCs w:val="36"/>
+        </w:rPr>
+        <w:drawing>
+          <wp:inline distT="0" distB="0" distL="0" distR="0" wp14:anchorId="45E4AEF1" wp14:editId="31D527A0">
+            <wp:extent cx="5731510" cy="1093470"/>
+            <wp:effectExtent l="0" t="0" r="2540" b="0"/>
+            <wp:docPr id="865566453" name="Picture 1"/>
+            <wp:cNvGraphicFramePr>
+              <a:graphicFrameLocks xmlns:a="http://schemas.openxmlformats.org/drawingml/2006/main" noChangeAspect="1"/>
+            </wp:cNvGraphicFramePr>
+            <a:graphic xmlns:a="http://schemas.openxmlformats.org/drawingml/2006/main">
+              <a:graphicData uri="http://schemas.openxmlformats.org/drawingml/2006/picture">
+                <pic:pic xmlns:pic="http://schemas.openxmlformats.org/drawingml/2006/picture">
+                  <pic:nvPicPr>
+                    <pic:cNvPr id="865566453" name=""/>
+                    <pic:cNvPicPr/>
+                  </pic:nvPicPr>
+                  <pic:blipFill>
+                    <a:blip r:embed="rId26"/>
+                    <a:stretch>
+                      <a:fillRect/>
+                    </a:stretch>
+                  </pic:blipFill>
+                  <pic:spPr>
+                    <a:xfrm>
+                      <a:off x="0" y="0"/>
+                      <a:ext cx="5731510" cy="1093470"/>
+                    </a:xfrm>
+                    <a:prstGeom prst="rect">
+                      <a:avLst/>
+                    </a:prstGeom>
+                  </pic:spPr>
+                </pic:pic>
+              </a:graphicData>
+            </a:graphic>
+          </wp:inline>
+        </w:drawing>
+      </w:r>
+    </w:p>
+    <w:p>
+      <w:pPr>
+        <w:jc w:val="both"/>
+        <w:rPr>
+          <w:sz w:val="36"/>
+          <w:szCs w:val="36"/>
+        </w:rPr>
+      </w:pPr>
+    </w:p>
+    <w:p>
+      <w:pPr>
+        <w:jc w:val="both"/>
+        <w:rPr>
+          <w:sz w:val="36"/>
+          <w:szCs w:val="36"/>
+        </w:rPr>
+      </w:pPr>
+      <w:r>
+        <w:rPr>
+          <w:sz w:val="36"/>
+          <w:szCs w:val="36"/>
+        </w:rPr>
+        <w:drawing>
+          <wp:inline distT="0" distB="0" distL="0" distR="0" wp14:anchorId="1A86F07A" wp14:editId="4134515C">
+            <wp:extent cx="5731510" cy="2501900"/>
+            <wp:effectExtent l="0" t="0" r="2540" b="0"/>
+            <wp:docPr id="617025516" name="Picture 1"/>
+            <wp:cNvGraphicFramePr>
+              <a:graphicFrameLocks xmlns:a="http://schemas.openxmlformats.org/drawingml/2006/main" noChangeAspect="1"/>
+            </wp:cNvGraphicFramePr>
+            <a:graphic xmlns:a="http://schemas.openxmlformats.org/drawingml/2006/main">
+              <a:graphicData uri="http://schemas.openxmlformats.org/drawingml/2006/picture">
+                <pic:pic xmlns:pic="http://schemas.openxmlformats.org/drawingml/2006/picture">
+                  <pic:nvPicPr>
+                    <pic:cNvPr id="617025516" name=""/>
+                    <pic:cNvPicPr/>
+                  </pic:nvPicPr>
+                  <pic:blipFill>
+                    <a:blip r:embed="rId27"/>
+                    <a:stretch>
+                      <a:fillRect/>
+                    </a:stretch>
+                  </pic:blipFill>
+                  <pic:spPr>
+                    <a:xfrm>
+                      <a:off x="0" y="0"/>
+                      <a:ext cx="5731510" cy="2501900"/>
+                    </a:xfrm>
+                    <a:prstGeom prst="rect">
+                      <a:avLst/>
+                    </a:prstGeom>
+                  </pic:spPr>
+                </pic:pic>
+              </a:graphicData>
+            </a:graphic>
+          </wp:inline>
+        </w:drawing>
+      </w:r>
+    </w:p>
+    <w:p>
+      <w:pPr>
+        <w:jc w:val="both"/>
+        <w:rPr>
+          <w:sz w:val="36"/>
+          <w:szCs w:val="36"/>
+        </w:rPr>
+      </w:pPr>
+    </w:p>
+    <w:p>
+      <w:pPr>
+        <w:jc w:val="both"/>
+        <w:rPr>
+          <w:sz w:val="36"/>
+          <w:szCs w:val="36"/>
+        </w:rPr>
+      </w:pPr>
+      <w:r>
+        <w:rPr>
+          <w:sz w:val="36"/>
+          <w:szCs w:val="36"/>
+        </w:rPr>
+        <w:t>3. Record the plot of validation and test loss of history_2.</w:t>
+      </w:r>
+    </w:p>
+    <w:p>
+      <w:pPr>
+        <w:jc w:val="both"/>
+        <w:rPr>
+          <w:sz w:val="36"/>
+          <w:szCs w:val="36"/>
+        </w:rPr>
+      </w:pPr>
+      <w:r>
+        <w:rPr>
+          <w:sz w:val="36"/>
+          <w:szCs w:val="36"/>
+        </w:rPr>
+        <w:drawing>
+          <wp:inline distT="0" distB="0" distL="0" distR="0" wp14:anchorId="22DEE2E2" wp14:editId="4B1699D8">
+            <wp:extent cx="5731510" cy="2690495"/>
+            <wp:effectExtent l="0" t="0" r="2540" b="0"/>
+            <wp:docPr id="828808720" name="Picture 1"/>
+            <wp:cNvGraphicFramePr>
+              <a:graphicFrameLocks xmlns:a="http://schemas.openxmlformats.org/drawingml/2006/main" noChangeAspect="1"/>
+            </wp:cNvGraphicFramePr>
+            <a:graphic xmlns:a="http://schemas.openxmlformats.org/drawingml/2006/main">
+              <a:graphicData uri="http://schemas.openxmlformats.org/drawingml/2006/picture">
+                <pic:pic xmlns:pic="http://schemas.openxmlformats.org/drawingml/2006/picture">
+                  <pic:nvPicPr>
+                    <pic:cNvPr id="828808720" name=""/>
+                    <pic:cNvPicPr/>
+                  </pic:nvPicPr>
+                  <pic:blipFill>
+                    <a:blip r:embed="rId28"/>
+                    <a:stretch>
+                      <a:fillRect/>
+                    </a:stretch>
+                  </pic:blipFill>
+                  <pic:spPr>
+                    <a:xfrm>
+                      <a:off x="0" y="0"/>
+                      <a:ext cx="5731510" cy="2690495"/>
+                    </a:xfrm>
+                    <a:prstGeom prst="rect">
+                      <a:avLst/>
+                    </a:prstGeom>
+                  </pic:spPr>
+                </pic:pic>
+              </a:graphicData>
+            </a:graphic>
+          </wp:inline>
+        </w:drawing>
+      </w:r>
+    </w:p>
+    <w:p>
+      <w:pPr>
+        <w:jc w:val="both"/>
+        <w:rPr>
+          <w:sz w:val="36"/>
+          <w:szCs w:val="36"/>
+        </w:rPr>
+      </w:pPr>
+    </w:p>
+    <w:p>
+      <w:pPr>
+        <w:jc w:val="both"/>
+        <w:rPr>
+          <w:sz w:val="36"/>
+          <w:szCs w:val="36"/>
+        </w:rPr>
+      </w:pPr>
+      <w:r>
+        <w:rPr>
+          <w:sz w:val="36"/>
+          <w:szCs w:val="36"/>
+        </w:rPr>
+        <w:lastRenderedPageBreak/>
+        <w:t>4. Based on this analysis, determine the optimal number of epochs for training your model.</w:t>
+      </w:r>
+    </w:p>
+    <w:p>
+      <w:pPr>
+        <w:jc w:val="both"/>
+        <w:rPr>
+          <w:sz w:val="36"/>
+          <w:szCs w:val="36"/>
+        </w:rPr>
+      </w:pPr>
+      <w:r>
+        <w:rPr>
+          <w:sz w:val="36"/>
+          <w:szCs w:val="36"/>
+        </w:rPr>
+        <w:drawing>
+          <wp:inline distT="0" distB="0" distL="0" distR="0" wp14:anchorId="3B5598C4" wp14:editId="5DD26C82">
+            <wp:extent cx="4553585" cy="1143160"/>
+            <wp:effectExtent l="0" t="0" r="0" b="0"/>
+            <wp:docPr id="1782201888" name="Picture 1"/>
+            <wp:cNvGraphicFramePr>
+              <a:graphicFrameLocks xmlns:a="http://schemas.openxmlformats.org/drawingml/2006/main" noChangeAspect="1"/>
+            </wp:cNvGraphicFramePr>
+            <a:graphic xmlns:a="http://schemas.openxmlformats.org/drawingml/2006/main">
+              <a:graphicData uri="http://schemas.openxmlformats.org/drawingml/2006/picture">
+                <pic:pic xmlns:pic="http://schemas.openxmlformats.org/drawingml/2006/picture">
+                  <pic:nvPicPr>
+                    <pic:cNvPr id="1782201888" name=""/>
+                    <pic:cNvPicPr/>
+                  </pic:nvPicPr>
+                  <pic:blipFill>
+                    <a:blip r:embed="rId29"/>
+                    <a:stretch>
+                      <a:fillRect/>
+                    </a:stretch>
+                  </pic:blipFill>
+                  <pic:spPr>
+                    <a:xfrm>
+                      <a:off x="0" y="0"/>
+                      <a:ext cx="4553585" cy="1143160"/>
+                    </a:xfrm>
+                    <a:prstGeom prst="rect">
+                      <a:avLst/>
+                    </a:prstGeom>
+                  </pic:spPr>
+                </pic:pic>
+              </a:graphicData>
+            </a:graphic>
+          </wp:inline>
+        </w:drawing>
+      </w:r>
+    </w:p>
+    <w:p>
+      <w:pPr>
+        <w:jc w:val="both"/>
+        <w:rPr>
+          <w:sz w:val="36"/>
+          <w:szCs w:val="36"/>
+        </w:rPr>
+      </w:pPr>
+    </w:p>
+    <w:p>
+      <w:pPr>
+        <w:jc w:val="both"/>
+        <w:rPr>
+          <w:sz w:val="36"/>
+          <w:szCs w:val="36"/>
+        </w:rPr>
+      </w:pPr>
+      <w:r>
+        <w:rPr>
+          <w:sz w:val="36"/>
+          <w:szCs w:val="36"/>
+        </w:rPr>
+        <w:t>5. Record the plot of the Checking Forecast for the last 12 months (last graph).</w:t>
+      </w:r>
+    </w:p>
+    <w:p>
+      <w:pPr>
+        <w:jc w:val="both"/>
+        <w:rPr>
+          <w:sz w:val="36"/>
+          <w:szCs w:val="36"/>
+        </w:rPr>
+      </w:pPr>
+      <w:r>
+        <w:rPr>
+          <w:sz w:val="36"/>
+          <w:szCs w:val="36"/>
+        </w:rPr>
+        <w:drawing>
+          <wp:inline distT="0" distB="0" distL="0" distR="0" wp14:anchorId="73C9713F" wp14:editId="2C610189">
+            <wp:extent cx="5731510" cy="2842260"/>
+            <wp:effectExtent l="0" t="0" r="2540" b="0"/>
+            <wp:docPr id="1272414182" name="Picture 1"/>
+            <wp:cNvGraphicFramePr>
+              <a:graphicFrameLocks xmlns:a="http://schemas.openxmlformats.org/drawingml/2006/main" noChangeAspect="1"/>
+            </wp:cNvGraphicFramePr>
+            <a:graphic xmlns:a="http://schemas.openxmlformats.org/drawingml/2006/main">
+              <a:graphicData uri="http://schemas.openxmlformats.org/drawingml/2006/picture">
+                <pic:pic xmlns:pic="http://schemas.openxmlformats.org/drawingml/2006/picture">
+                  <pic:nvPicPr>
+                    <pic:cNvPr id="1272414182" name=""/>
+                    <pic:cNvPicPr/>
+                  </pic:nvPicPr>
+                  <pic:blipFill>
+                    <a:blip r:embed="rId30"/>
+                    <a:stretch>
+                      <a:fillRect/>
+                    </a:stretch>
+                  </pic:blipFill>
+                  <pic:spPr>
+                    <a:xfrm>
+                      <a:off x="0" y="0"/>
+                      <a:ext cx="5731510" cy="2842260"/>
+                    </a:xfrm>
+                    <a:prstGeom prst="rect">
+                      <a:avLst/>
+                    </a:prstGeom>
+                  </pic:spPr>
+                </pic:pic>
+              </a:graphicData>
+            </a:graphic>
+          </wp:inline>
+        </w:drawing>
+      </w:r>
+    </w:p>
+    <w:p>
+      <w:pPr>
+        <w:jc w:val="both"/>
+        <w:rPr>
+          <w:sz w:val="36"/>
+          <w:szCs w:val="36"/>
+        </w:rPr>
+      </w:pPr>
+    </w:p>
+    <w:p>
+      <w:pPr>
+        <w:jc w:val="both"/>
+        <w:rPr>
           <w:sz w:val="44"/>
           <w:szCs w:val="44"/>
           <w:u w:val="single"/>
@@ -1777,6 +2319,7 @@
           <w:u w:val="single"/>
           <w:lang w:val="de-DE"/>
         </w:rPr>
+        <w:lastRenderedPageBreak/>
         <w:t xml:space="preserve">Lab 9 </w:t>
       </w:r>
     </w:p>
@@ -2282,7 +2825,6 @@
   <w:style w:type="character" w:default="1" w:styleId="DefaultParagraphFont">
     <w:name w:val="Default Paragraph Font"/>
     <w:uiPriority w:val="1"/>
-    <w:semiHidden/>
     <w:unhideWhenUsed/>
   </w:style>
   <w:style w:type="table" w:default="1" w:styleId="TableNormal">

</xml_diff>

<commit_message>
Updated LabLogBook Week 7
</commit_message>
<xml_diff>
--- a/LABlogbook.docx
+++ b/LABlogbook.docx
@@ -6,12 +6,16 @@
       <w:pPr>
         <w:jc w:val="center"/>
         <w:rPr>
+          <w:b/>
+          <w:bCs/>
           <w:sz w:val="56"/>
           <w:szCs w:val="56"/>
         </w:rPr>
       </w:pPr>
       <w:r>
         <w:rPr>
+          <w:b/>
+          <w:bCs/>
           <w:sz w:val="56"/>
           <w:szCs w:val="56"/>
         </w:rPr>
@@ -29,15 +33,19 @@
     </w:p>
     <w:p>
       <w:pPr>
-        <w:jc w:val="both"/>
-        <w:rPr>
-          <w:sz w:val="44"/>
-          <w:szCs w:val="44"/>
-          <w:u w:val="single"/>
-        </w:rPr>
-      </w:pPr>
-      <w:r>
-        <w:rPr>
+        <w:jc w:val="center"/>
+        <w:rPr>
+          <w:b/>
+          <w:bCs/>
+          <w:sz w:val="44"/>
+          <w:szCs w:val="44"/>
+          <w:u w:val="single"/>
+        </w:rPr>
+      </w:pPr>
+      <w:r>
+        <w:rPr>
+          <w:b/>
+          <w:bCs/>
           <w:sz w:val="44"/>
           <w:szCs w:val="44"/>
           <w:u w:val="single"/>
@@ -77,7 +85,7 @@
                     <pic:cNvPicPr/>
                   </pic:nvPicPr>
                   <pic:blipFill>
-                    <a:blip r:embed="rId4"/>
+                    <a:blip r:embed="rId5"/>
                     <a:stretch>
                       <a:fillRect/>
                     </a:stretch>
@@ -170,20 +178,22 @@
     </w:p>
     <w:p>
       <w:pPr>
-        <w:jc w:val="both"/>
-        <w:rPr>
-          <w:sz w:val="44"/>
-          <w:szCs w:val="44"/>
-          <w:u w:val="single"/>
-          <w:lang w:val="de-DE"/>
-        </w:rPr>
-      </w:pPr>
-      <w:r>
-        <w:rPr>
-          <w:sz w:val="44"/>
-          <w:szCs w:val="44"/>
-          <w:u w:val="single"/>
-          <w:lang w:val="de-DE"/>
+        <w:jc w:val="center"/>
+        <w:rPr>
+          <w:b/>
+          <w:bCs/>
+          <w:sz w:val="44"/>
+          <w:szCs w:val="44"/>
+          <w:u w:val="single"/>
+        </w:rPr>
+      </w:pPr>
+      <w:r>
+        <w:rPr>
+          <w:b/>
+          <w:bCs/>
+          <w:sz w:val="44"/>
+          <w:szCs w:val="44"/>
+          <w:u w:val="single"/>
         </w:rPr>
         <w:lastRenderedPageBreak/>
         <w:t>Lab 2</w:t>
@@ -193,8 +203,29 @@
       <w:pPr>
         <w:jc w:val="both"/>
         <w:rPr>
-          <w:b/>
-          <w:bCs/>
+          <w:sz w:val="32"/>
+          <w:szCs w:val="32"/>
+        </w:rPr>
+      </w:pPr>
+      <w:r>
+        <w:rPr>
+          <w:sz w:val="32"/>
+          <w:szCs w:val="32"/>
+        </w:rPr>
+        <w:t>1. T</w:t>
+      </w:r>
+      <w:r>
+        <w:rPr>
+          <w:sz w:val="32"/>
+          <w:szCs w:val="32"/>
+        </w:rPr>
+        <w:t>he accuracy of the improved model. Do not include any code or explanations in your lab logbook. Simply record the accuracy. For example, if the obtained accuracy is 0.98, then enter "0.98" in your lab logbook.</w:t>
+      </w:r>
+    </w:p>
+    <w:p>
+      <w:pPr>
+        <w:jc w:val="both"/>
+        <w:rPr>
           <w:sz w:val="28"/>
           <w:szCs w:val="28"/>
         </w:rPr>
@@ -206,12 +237,87 @@
           <w:sz w:val="28"/>
           <w:szCs w:val="28"/>
         </w:rPr>
+        <w:t>=&gt;</w:t>
+      </w:r>
+      <w:r>
+        <w:rPr>
+          <w:sz w:val="28"/>
+          <w:szCs w:val="28"/>
+        </w:rPr>
+        <w:t xml:space="preserve"> Model 1: 0.93</w:t>
+      </w:r>
+    </w:p>
+    <w:p>
+      <w:pPr>
+        <w:jc w:val="both"/>
+        <w:rPr>
+          <w:sz w:val="28"/>
+          <w:szCs w:val="28"/>
+        </w:rPr>
+      </w:pPr>
+      <w:r>
+        <w:rPr>
+          <w:sz w:val="28"/>
+          <w:szCs w:val="28"/>
+        </w:rPr>
+        <w:t xml:space="preserve">     Model 2: 0.958</w:t>
+      </w:r>
+    </w:p>
+    <w:p>
+      <w:pPr>
+        <w:jc w:val="both"/>
+        <w:rPr>
+          <w:sz w:val="2"/>
+          <w:szCs w:val="2"/>
+        </w:rPr>
+      </w:pPr>
+    </w:p>
+    <w:p>
+      <w:pPr>
+        <w:jc w:val="both"/>
+        <w:rPr>
+          <w:sz w:val="32"/>
+          <w:szCs w:val="32"/>
+        </w:rPr>
+      </w:pPr>
+      <w:r>
+        <w:rPr>
+          <w:sz w:val="32"/>
+          <w:szCs w:val="32"/>
+        </w:rPr>
+        <w:t>2. C</w:t>
+      </w:r>
+      <w:r>
+        <w:rPr>
+          <w:sz w:val="32"/>
+          <w:szCs w:val="32"/>
+        </w:rPr>
+        <w:t>opy your MLP architectures' screenshots to Logbook.</w:t>
+      </w:r>
+    </w:p>
+    <w:p>
+      <w:pPr>
+        <w:jc w:val="both"/>
+        <w:rPr>
+          <w:b/>
+          <w:bCs/>
+          <w:sz w:val="28"/>
+          <w:szCs w:val="28"/>
+        </w:rPr>
+      </w:pPr>
+      <w:r>
+        <w:rPr>
+          <w:b/>
+          <w:bCs/>
+          <w:sz w:val="28"/>
+          <w:szCs w:val="28"/>
+        </w:rPr>
         <w:t xml:space="preserve">Model 1 MLP Architecture: </w:t>
       </w:r>
     </w:p>
     <w:p>
       <w:pPr>
-        <w:jc w:val="both"/>
+        <w:jc w:val="center"/>
         <w:rPr>
           <w:b/>
           <w:bCs/>
@@ -228,9 +334,9 @@
           <w:szCs w:val="28"/>
         </w:rPr>
         <w:drawing>
-          <wp:inline distT="0" distB="0" distL="0" distR="0" wp14:anchorId="034B18C5" wp14:editId="5ED60928">
-            <wp:extent cx="5731510" cy="2336800"/>
-            <wp:effectExtent l="0" t="0" r="2540" b="6350"/>
+          <wp:inline distT="0" distB="0" distL="0" distR="0" wp14:anchorId="034B18C5" wp14:editId="6CAA2256">
+            <wp:extent cx="4514850" cy="1840755"/>
+            <wp:effectExtent l="0" t="0" r="0" b="7620"/>
             <wp:docPr id="597273637" name="Picture 1"/>
             <wp:cNvGraphicFramePr>
               <a:graphicFrameLocks xmlns:a="http://schemas.openxmlformats.org/drawingml/2006/main" noChangeAspect="1"/>
@@ -243,7 +349,7 @@
                     <pic:cNvPicPr/>
                   </pic:nvPicPr>
                   <pic:blipFill>
-                    <a:blip r:embed="rId5"/>
+                    <a:blip r:embed="rId6"/>
                     <a:stretch>
                       <a:fillRect/>
                     </a:stretch>
@@ -251,7 +357,7 @@
                   <pic:spPr>
                     <a:xfrm>
                       <a:off x="0" y="0"/>
-                      <a:ext cx="5731510" cy="2336800"/>
+                      <a:ext cx="4539328" cy="1850735"/>
                     </a:xfrm>
                     <a:prstGeom prst="rect">
                       <a:avLst/>
@@ -266,7 +372,7 @@
     </w:p>
     <w:p>
       <w:pPr>
-        <w:jc w:val="both"/>
+        <w:jc w:val="center"/>
         <w:rPr>
           <w:sz w:val="28"/>
           <w:szCs w:val="28"/>
@@ -279,9 +385,9 @@
           <w:szCs w:val="28"/>
         </w:rPr>
         <w:drawing>
-          <wp:inline distT="0" distB="0" distL="0" distR="0" wp14:anchorId="6F6684FC" wp14:editId="49293EE5">
-            <wp:extent cx="5731510" cy="5076825"/>
-            <wp:effectExtent l="0" t="0" r="2540" b="9525"/>
+          <wp:inline distT="0" distB="0" distL="0" distR="0" wp14:anchorId="6F6684FC" wp14:editId="0EF6E28E">
+            <wp:extent cx="4204540" cy="3724275"/>
+            <wp:effectExtent l="0" t="0" r="5715" b="0"/>
             <wp:docPr id="677960147" name="Picture 1"/>
             <wp:cNvGraphicFramePr>
               <a:graphicFrameLocks xmlns:a="http://schemas.openxmlformats.org/drawingml/2006/main" noChangeAspect="1"/>
@@ -294,7 +400,7 @@
                     <pic:cNvPicPr/>
                   </pic:nvPicPr>
                   <pic:blipFill>
-                    <a:blip r:embed="rId6"/>
+                    <a:blip r:embed="rId7"/>
                     <a:stretch>
                       <a:fillRect/>
                     </a:stretch>
@@ -302,7 +408,7 @@
                   <pic:spPr>
                     <a:xfrm>
                       <a:off x="0" y="0"/>
-                      <a:ext cx="5731510" cy="5076825"/>
+                      <a:ext cx="4221804" cy="3739567"/>
                     </a:xfrm>
                     <a:prstGeom prst="rect">
                       <a:avLst/>
@@ -319,22 +425,6 @@
       <w:pPr>
         <w:jc w:val="both"/>
         <w:rPr>
-          <w:sz w:val="28"/>
-          <w:szCs w:val="28"/>
-        </w:rPr>
-      </w:pPr>
-      <w:r>
-        <w:rPr>
-          <w:sz w:val="28"/>
-          <w:szCs w:val="28"/>
-        </w:rPr>
-        <w:t>Model Accuracy is 0.93</w:t>
-      </w:r>
-    </w:p>
-    <w:p>
-      <w:pPr>
-        <w:jc w:val="both"/>
-        <w:rPr>
           <w:b/>
           <w:bCs/>
           <w:sz w:val="28"/>
@@ -371,9 +461,9 @@
           <w:szCs w:val="28"/>
         </w:rPr>
         <w:drawing>
-          <wp:inline distT="0" distB="0" distL="0" distR="0" wp14:anchorId="5C62E4FA" wp14:editId="123E0F7C">
-            <wp:extent cx="3990975" cy="3477556"/>
-            <wp:effectExtent l="0" t="0" r="0" b="8890"/>
+          <wp:inline distT="0" distB="0" distL="0" distR="0" wp14:anchorId="5C62E4FA" wp14:editId="4B44334E">
+            <wp:extent cx="3181350" cy="2772084"/>
+            <wp:effectExtent l="0" t="0" r="0" b="9525"/>
             <wp:docPr id="791771428" name="Picture 1"/>
             <wp:cNvGraphicFramePr>
               <a:graphicFrameLocks xmlns:a="http://schemas.openxmlformats.org/drawingml/2006/main" noChangeAspect="1"/>
@@ -386,7 +476,7 @@
                     <pic:cNvPicPr/>
                   </pic:nvPicPr>
                   <pic:blipFill>
-                    <a:blip r:embed="rId7"/>
+                    <a:blip r:embed="rId8"/>
                     <a:stretch>
                       <a:fillRect/>
                     </a:stretch>
@@ -394,7 +484,7 @@
                   <pic:spPr>
                     <a:xfrm>
                       <a:off x="0" y="0"/>
-                      <a:ext cx="3995222" cy="3481256"/>
+                      <a:ext cx="3195730" cy="2784614"/>
                     </a:xfrm>
                     <a:prstGeom prst="rect">
                       <a:avLst/>
@@ -422,8 +512,8 @@
           <w:szCs w:val="28"/>
         </w:rPr>
         <w:drawing>
-          <wp:inline distT="0" distB="0" distL="0" distR="0" wp14:anchorId="6925721C" wp14:editId="7163F0CE">
-            <wp:extent cx="4579117" cy="4105275"/>
+          <wp:inline distT="0" distB="0" distL="0" distR="0" wp14:anchorId="6925721C" wp14:editId="088560CE">
+            <wp:extent cx="3952875" cy="3543836"/>
             <wp:effectExtent l="0" t="0" r="0" b="0"/>
             <wp:docPr id="1216248426" name="Picture 1"/>
             <wp:cNvGraphicFramePr>
@@ -437,7 +527,7 @@
                     <pic:cNvPicPr/>
                   </pic:nvPicPr>
                   <pic:blipFill>
-                    <a:blip r:embed="rId8"/>
+                    <a:blip r:embed="rId9"/>
                     <a:stretch>
                       <a:fillRect/>
                     </a:stretch>
@@ -445,7 +535,7 @@
                   <pic:spPr>
                     <a:xfrm>
                       <a:off x="0" y="0"/>
-                      <a:ext cx="4583498" cy="4109203"/>
+                      <a:ext cx="3959730" cy="3549982"/>
                     </a:xfrm>
                     <a:prstGeom prst="rect">
                       <a:avLst/>
@@ -460,7 +550,7 @@
     </w:p>
     <w:p>
       <w:pPr>
-        <w:jc w:val="both"/>
+        <w:jc w:val="center"/>
         <w:rPr>
           <w:sz w:val="28"/>
           <w:szCs w:val="28"/>
@@ -472,11 +562,10 @@
           <w:sz w:val="28"/>
           <w:szCs w:val="28"/>
         </w:rPr>
-        <w:lastRenderedPageBreak/>
         <w:drawing>
-          <wp:inline distT="0" distB="0" distL="0" distR="0" wp14:anchorId="697100D1" wp14:editId="4D1E44AB">
-            <wp:extent cx="5731510" cy="1966595"/>
-            <wp:effectExtent l="0" t="0" r="2540" b="0"/>
+          <wp:inline distT="0" distB="0" distL="0" distR="0" wp14:anchorId="697100D1" wp14:editId="53E8C205">
+            <wp:extent cx="3990975" cy="1369383"/>
+            <wp:effectExtent l="0" t="0" r="0" b="2540"/>
             <wp:docPr id="146863986" name="Picture 1"/>
             <wp:cNvGraphicFramePr>
               <a:graphicFrameLocks xmlns:a="http://schemas.openxmlformats.org/drawingml/2006/main" noChangeAspect="1"/>
@@ -489,7 +578,7 @@
                     <pic:cNvPicPr/>
                   </pic:nvPicPr>
                   <pic:blipFill>
-                    <a:blip r:embed="rId9"/>
+                    <a:blip r:embed="rId10"/>
                     <a:stretch>
                       <a:fillRect/>
                     </a:stretch>
@@ -497,7 +586,7 @@
                   <pic:spPr>
                     <a:xfrm>
                       <a:off x="0" y="0"/>
-                      <a:ext cx="5731510" cy="1966595"/>
+                      <a:ext cx="4005895" cy="1374502"/>
                     </a:xfrm>
                     <a:prstGeom prst="rect">
                       <a:avLst/>
@@ -514,166 +603,236 @@
       <w:pPr>
         <w:jc w:val="both"/>
         <w:rPr>
-          <w:sz w:val="28"/>
-          <w:szCs w:val="28"/>
-        </w:rPr>
-      </w:pPr>
-      <w:r>
-        <w:rPr>
-          <w:sz w:val="28"/>
-          <w:szCs w:val="28"/>
-        </w:rPr>
-        <w:t>Model Accuracy i</w:t>
-      </w:r>
-      <w:r>
-        <w:rPr>
-          <w:sz w:val="28"/>
-          <w:szCs w:val="28"/>
-        </w:rPr>
-        <w:t>s 0.958</w:t>
-      </w:r>
-    </w:p>
-    <w:p>
-      <w:pPr>
-        <w:jc w:val="both"/>
-        <w:rPr>
-          <w:sz w:val="44"/>
-          <w:szCs w:val="44"/>
-          <w:u w:val="single"/>
-        </w:rPr>
-      </w:pPr>
-    </w:p>
-    <w:p>
-      <w:pPr>
-        <w:jc w:val="both"/>
-        <w:rPr>
-          <w:sz w:val="44"/>
-          <w:szCs w:val="44"/>
-          <w:u w:val="single"/>
-        </w:rPr>
-      </w:pPr>
-    </w:p>
-    <w:p>
-      <w:pPr>
-        <w:jc w:val="both"/>
-        <w:rPr>
-          <w:sz w:val="44"/>
-          <w:szCs w:val="44"/>
-          <w:u w:val="single"/>
-        </w:rPr>
-      </w:pPr>
-    </w:p>
-    <w:p>
-      <w:pPr>
-        <w:jc w:val="both"/>
-        <w:rPr>
-          <w:sz w:val="44"/>
-          <w:szCs w:val="44"/>
-          <w:u w:val="single"/>
-        </w:rPr>
-      </w:pPr>
-    </w:p>
-    <w:p>
-      <w:pPr>
-        <w:jc w:val="both"/>
-        <w:rPr>
-          <w:sz w:val="44"/>
-          <w:szCs w:val="44"/>
-          <w:u w:val="single"/>
-        </w:rPr>
-      </w:pPr>
-    </w:p>
-    <w:p>
-      <w:pPr>
-        <w:jc w:val="both"/>
-        <w:rPr>
-          <w:sz w:val="44"/>
-          <w:szCs w:val="44"/>
-          <w:u w:val="single"/>
-        </w:rPr>
-      </w:pPr>
-    </w:p>
-    <w:p>
-      <w:pPr>
-        <w:jc w:val="both"/>
-        <w:rPr>
-          <w:sz w:val="44"/>
-          <w:szCs w:val="44"/>
-          <w:u w:val="single"/>
-        </w:rPr>
-      </w:pPr>
-    </w:p>
-    <w:p>
-      <w:pPr>
-        <w:jc w:val="both"/>
-        <w:rPr>
-          <w:sz w:val="44"/>
-          <w:szCs w:val="44"/>
-          <w:u w:val="single"/>
-        </w:rPr>
-      </w:pPr>
-    </w:p>
-    <w:p>
-      <w:pPr>
-        <w:jc w:val="both"/>
-        <w:rPr>
-          <w:sz w:val="44"/>
-          <w:szCs w:val="44"/>
-          <w:u w:val="single"/>
-        </w:rPr>
-      </w:pPr>
-    </w:p>
-    <w:p>
-      <w:pPr>
-        <w:jc w:val="both"/>
-        <w:rPr>
-          <w:sz w:val="44"/>
-          <w:szCs w:val="44"/>
-          <w:u w:val="single"/>
-        </w:rPr>
-      </w:pPr>
-    </w:p>
-    <w:p>
-      <w:pPr>
-        <w:jc w:val="both"/>
-        <w:rPr>
-          <w:sz w:val="44"/>
-          <w:szCs w:val="44"/>
-          <w:u w:val="single"/>
-        </w:rPr>
-      </w:pPr>
-    </w:p>
-    <w:p>
-      <w:pPr>
-        <w:jc w:val="both"/>
-        <w:rPr>
-          <w:sz w:val="44"/>
-          <w:szCs w:val="44"/>
-          <w:u w:val="single"/>
-        </w:rPr>
-      </w:pPr>
-    </w:p>
-    <w:p>
-      <w:pPr>
-        <w:jc w:val="both"/>
-        <w:rPr>
-          <w:sz w:val="44"/>
-          <w:szCs w:val="44"/>
-          <w:u w:val="single"/>
-        </w:rPr>
-      </w:pPr>
-    </w:p>
-    <w:p>
-      <w:pPr>
-        <w:jc w:val="both"/>
-        <w:rPr>
-          <w:sz w:val="44"/>
-          <w:szCs w:val="44"/>
-          <w:u w:val="single"/>
-        </w:rPr>
-      </w:pPr>
-      <w:r>
-        <w:rPr>
+          <w:sz w:val="44"/>
+          <w:szCs w:val="44"/>
+          <w:u w:val="single"/>
+        </w:rPr>
+      </w:pPr>
+    </w:p>
+    <w:p>
+      <w:pPr>
+        <w:jc w:val="both"/>
+        <w:rPr>
+          <w:b/>
+          <w:bCs/>
+          <w:sz w:val="36"/>
+          <w:szCs w:val="36"/>
+        </w:rPr>
+      </w:pPr>
+      <w:r>
+        <w:rPr>
+          <w:b/>
+          <w:bCs/>
+          <w:sz w:val="36"/>
+          <w:szCs w:val="36"/>
+        </w:rPr>
+        <w:lastRenderedPageBreak/>
+        <w:t>Task 2 (Optional)</w:t>
+      </w:r>
+    </w:p>
+    <w:p>
+      <w:pPr>
+        <w:jc w:val="both"/>
+        <w:rPr>
+          <w:sz w:val="32"/>
+          <w:szCs w:val="32"/>
+        </w:rPr>
+      </w:pPr>
+      <w:r>
+        <w:rPr>
+          <w:sz w:val="32"/>
+          <w:szCs w:val="32"/>
+        </w:rPr>
+        <w:t>3. T</w:t>
+      </w:r>
+      <w:r>
+        <w:rPr>
+          <w:sz w:val="32"/>
+          <w:szCs w:val="32"/>
+        </w:rPr>
+        <w:t>he output of the neural network as provided in Task 2.</w:t>
+      </w:r>
+    </w:p>
+    <w:p>
+      <w:pPr>
+        <w:jc w:val="both"/>
+        <w:rPr>
+          <w:sz w:val="44"/>
+          <w:szCs w:val="44"/>
+          <w:u w:val="single"/>
+        </w:rPr>
+      </w:pPr>
+      <w:r>
+        <w:rPr>
+          <w:sz w:val="44"/>
+          <w:szCs w:val="44"/>
+          <w:u w:val="single"/>
+        </w:rPr>
+        <w:drawing>
+          <wp:inline distT="0" distB="0" distL="0" distR="0" wp14:anchorId="51E9370A" wp14:editId="7AF14FE6">
+            <wp:extent cx="5525271" cy="6801799"/>
+            <wp:effectExtent l="0" t="0" r="0" b="0"/>
+            <wp:docPr id="9516089" name="Picture 1"/>
+            <wp:cNvGraphicFramePr>
+              <a:graphicFrameLocks xmlns:a="http://schemas.openxmlformats.org/drawingml/2006/main" noChangeAspect="1"/>
+            </wp:cNvGraphicFramePr>
+            <a:graphic xmlns:a="http://schemas.openxmlformats.org/drawingml/2006/main">
+              <a:graphicData uri="http://schemas.openxmlformats.org/drawingml/2006/picture">
+                <pic:pic xmlns:pic="http://schemas.openxmlformats.org/drawingml/2006/picture">
+                  <pic:nvPicPr>
+                    <pic:cNvPr id="9516089" name=""/>
+                    <pic:cNvPicPr/>
+                  </pic:nvPicPr>
+                  <pic:blipFill>
+                    <a:blip r:embed="rId11"/>
+                    <a:stretch>
+                      <a:fillRect/>
+                    </a:stretch>
+                  </pic:blipFill>
+                  <pic:spPr>
+                    <a:xfrm>
+                      <a:off x="0" y="0"/>
+                      <a:ext cx="5525271" cy="6801799"/>
+                    </a:xfrm>
+                    <a:prstGeom prst="rect">
+                      <a:avLst/>
+                    </a:prstGeom>
+                  </pic:spPr>
+                </pic:pic>
+              </a:graphicData>
+            </a:graphic>
+          </wp:inline>
+        </w:drawing>
+      </w:r>
+    </w:p>
+    <w:p>
+      <w:pPr>
+        <w:jc w:val="both"/>
+        <w:rPr>
+          <w:sz w:val="44"/>
+          <w:szCs w:val="44"/>
+          <w:u w:val="single"/>
+        </w:rPr>
+      </w:pPr>
+    </w:p>
+    <w:p>
+      <w:pPr>
+        <w:jc w:val="both"/>
+        <w:rPr>
+          <w:sz w:val="44"/>
+          <w:szCs w:val="44"/>
+          <w:u w:val="single"/>
+        </w:rPr>
+      </w:pPr>
+    </w:p>
+    <w:p>
+      <w:pPr>
+        <w:jc w:val="both"/>
+        <w:rPr>
+          <w:sz w:val="44"/>
+          <w:szCs w:val="44"/>
+          <w:u w:val="single"/>
+        </w:rPr>
+      </w:pPr>
+      <w:r>
+        <w:rPr>
+          <w:sz w:val="44"/>
+          <w:szCs w:val="44"/>
+          <w:u w:val="single"/>
+        </w:rPr>
+        <w:lastRenderedPageBreak/>
+        <w:drawing>
+          <wp:inline distT="0" distB="0" distL="0" distR="0" wp14:anchorId="72DDCED7" wp14:editId="4E9F0574">
+            <wp:extent cx="5731510" cy="6755130"/>
+            <wp:effectExtent l="0" t="0" r="2540" b="7620"/>
+            <wp:docPr id="813976948" name="Picture 1"/>
+            <wp:cNvGraphicFramePr>
+              <a:graphicFrameLocks xmlns:a="http://schemas.openxmlformats.org/drawingml/2006/main" noChangeAspect="1"/>
+            </wp:cNvGraphicFramePr>
+            <a:graphic xmlns:a="http://schemas.openxmlformats.org/drawingml/2006/main">
+              <a:graphicData uri="http://schemas.openxmlformats.org/drawingml/2006/picture">
+                <pic:pic xmlns:pic="http://schemas.openxmlformats.org/drawingml/2006/picture">
+                  <pic:nvPicPr>
+                    <pic:cNvPr id="813976948" name=""/>
+                    <pic:cNvPicPr/>
+                  </pic:nvPicPr>
+                  <pic:blipFill>
+                    <a:blip r:embed="rId12"/>
+                    <a:stretch>
+                      <a:fillRect/>
+                    </a:stretch>
+                  </pic:blipFill>
+                  <pic:spPr>
+                    <a:xfrm>
+                      <a:off x="0" y="0"/>
+                      <a:ext cx="5731510" cy="6755130"/>
+                    </a:xfrm>
+                    <a:prstGeom prst="rect">
+                      <a:avLst/>
+                    </a:prstGeom>
+                  </pic:spPr>
+                </pic:pic>
+              </a:graphicData>
+            </a:graphic>
+          </wp:inline>
+        </w:drawing>
+      </w:r>
+    </w:p>
+    <w:p>
+      <w:pPr>
+        <w:jc w:val="both"/>
+        <w:rPr>
+          <w:sz w:val="44"/>
+          <w:szCs w:val="44"/>
+          <w:u w:val="single"/>
+        </w:rPr>
+      </w:pPr>
+    </w:p>
+    <w:p>
+      <w:pPr>
+        <w:jc w:val="both"/>
+        <w:rPr>
+          <w:sz w:val="44"/>
+          <w:szCs w:val="44"/>
+          <w:u w:val="single"/>
+        </w:rPr>
+      </w:pPr>
+    </w:p>
+    <w:p>
+      <w:pPr>
+        <w:jc w:val="both"/>
+        <w:rPr>
+          <w:sz w:val="44"/>
+          <w:szCs w:val="44"/>
+          <w:u w:val="single"/>
+        </w:rPr>
+      </w:pPr>
+    </w:p>
+    <w:p>
+      <w:pPr>
+        <w:jc w:val="both"/>
+        <w:rPr>
+          <w:sz w:val="44"/>
+          <w:szCs w:val="44"/>
+          <w:u w:val="single"/>
+        </w:rPr>
+      </w:pPr>
+    </w:p>
+    <w:p>
+      <w:pPr>
+        <w:jc w:val="center"/>
+        <w:rPr>
+          <w:b/>
+          <w:bCs/>
+          <w:sz w:val="44"/>
+          <w:szCs w:val="44"/>
+          <w:u w:val="single"/>
+        </w:rPr>
+      </w:pPr>
+      <w:r>
+        <w:rPr>
+          <w:b/>
+          <w:bCs/>
           <w:sz w:val="44"/>
           <w:szCs w:val="44"/>
           <w:u w:val="single"/>
@@ -714,7 +873,7 @@
                     <pic:cNvPicPr/>
                   </pic:nvPicPr>
                   <pic:blipFill>
-                    <a:blip r:embed="rId10"/>
+                    <a:blip r:embed="rId13"/>
                     <a:stretch>
                       <a:fillRect/>
                     </a:stretch>
@@ -767,7 +926,7 @@
                     <pic:cNvPicPr/>
                   </pic:nvPicPr>
                   <pic:blipFill>
-                    <a:blip r:embed="rId11"/>
+                    <a:blip r:embed="rId14"/>
                     <a:stretch>
                       <a:fillRect/>
                     </a:stretch>
@@ -833,15 +992,19 @@
     </w:p>
     <w:p>
       <w:pPr>
-        <w:jc w:val="both"/>
-        <w:rPr>
-          <w:sz w:val="44"/>
-          <w:szCs w:val="44"/>
-          <w:u w:val="single"/>
-        </w:rPr>
-      </w:pPr>
-      <w:r>
-        <w:rPr>
+        <w:jc w:val="center"/>
+        <w:rPr>
+          <w:b/>
+          <w:bCs/>
+          <w:sz w:val="44"/>
+          <w:szCs w:val="44"/>
+          <w:u w:val="single"/>
+        </w:rPr>
+      </w:pPr>
+      <w:r>
+        <w:rPr>
+          <w:b/>
+          <w:bCs/>
           <w:sz w:val="44"/>
           <w:szCs w:val="44"/>
           <w:u w:val="single"/>
@@ -882,7 +1045,7 @@
                     <pic:cNvPicPr/>
                   </pic:nvPicPr>
                   <pic:blipFill>
-                    <a:blip r:embed="rId12"/>
+                    <a:blip r:embed="rId15"/>
                     <a:stretch>
                       <a:fillRect/>
                     </a:stretch>
@@ -945,7 +1108,7 @@
                     <pic:cNvPicPr/>
                   </pic:nvPicPr>
                   <pic:blipFill>
-                    <a:blip r:embed="rId13"/>
+                    <a:blip r:embed="rId16"/>
                     <a:stretch>
                       <a:fillRect/>
                     </a:stretch>
@@ -999,7 +1162,7 @@
                     <pic:cNvPicPr/>
                   </pic:nvPicPr>
                   <pic:blipFill>
-                    <a:blip r:embed="rId14"/>
+                    <a:blip r:embed="rId17"/>
                     <a:stretch>
                       <a:fillRect/>
                     </a:stretch>
@@ -1072,7 +1235,7 @@
                     <pic:cNvPicPr/>
                   </pic:nvPicPr>
                   <pic:blipFill>
-                    <a:blip r:embed="rId15"/>
+                    <a:blip r:embed="rId18"/>
                     <a:stretch>
                       <a:fillRect/>
                     </a:stretch>
@@ -1121,8 +1284,10 @@
     </w:p>
     <w:p>
       <w:pPr>
-        <w:jc w:val="both"/>
-        <w:rPr>
+        <w:jc w:val="center"/>
+        <w:rPr>
+          <w:b/>
+          <w:bCs/>
           <w:sz w:val="44"/>
           <w:szCs w:val="44"/>
           <w:u w:val="single"/>
@@ -1131,6 +1296,8 @@
       </w:pPr>
       <w:r>
         <w:rPr>
+          <w:b/>
+          <w:bCs/>
           <w:sz w:val="44"/>
           <w:szCs w:val="44"/>
           <w:u w:val="single"/>
@@ -1142,7 +1309,29 @@
     </w:p>
     <w:p>
       <w:pPr>
-        <w:jc w:val="both"/>
+        <w:rPr>
+          <w:sz w:val="36"/>
+          <w:szCs w:val="36"/>
+        </w:rPr>
+      </w:pPr>
+      <w:r>
+        <w:rPr>
+          <w:sz w:val="36"/>
+          <w:szCs w:val="36"/>
+        </w:rPr>
+        <w:t>1. P</w:t>
+      </w:r>
+      <w:r>
+        <w:rPr>
+          <w:sz w:val="36"/>
+          <w:szCs w:val="36"/>
+        </w:rPr>
+        <w:t>lot of the model building code and model's summary.</w:t>
+      </w:r>
+    </w:p>
+    <w:p>
+      <w:pPr>
+        <w:jc w:val="center"/>
         <w:rPr>
           <w:sz w:val="44"/>
           <w:szCs w:val="44"/>
@@ -1174,7 +1363,7 @@
                     <pic:cNvPicPr/>
                   </pic:nvPicPr>
                   <pic:blipFill>
-                    <a:blip r:embed="rId16"/>
+                    <a:blip r:embed="rId19"/>
                     <a:stretch>
                       <a:fillRect/>
                     </a:stretch>
@@ -1197,7 +1386,7 @@
     </w:p>
     <w:p>
       <w:pPr>
-        <w:jc w:val="both"/>
+        <w:jc w:val="center"/>
         <w:rPr>
           <w:sz w:val="44"/>
           <w:szCs w:val="44"/>
@@ -1214,9 +1403,9 @@
           <w:lang w:val="de-DE"/>
         </w:rPr>
         <w:drawing>
-          <wp:inline distT="0" distB="0" distL="0" distR="0" wp14:anchorId="6B10A923" wp14:editId="702DA5B3">
-            <wp:extent cx="5295417" cy="4705350"/>
-            <wp:effectExtent l="0" t="0" r="635" b="0"/>
+          <wp:inline distT="0" distB="0" distL="0" distR="0" wp14:anchorId="6B10A923" wp14:editId="03849180">
+            <wp:extent cx="4384262" cy="3895725"/>
+            <wp:effectExtent l="0" t="0" r="0" b="0"/>
             <wp:docPr id="738609941" name="Picture 1"/>
             <wp:cNvGraphicFramePr>
               <a:graphicFrameLocks xmlns:a="http://schemas.openxmlformats.org/drawingml/2006/main" noChangeAspect="1"/>
@@ -1229,7 +1418,7 @@
                     <pic:cNvPicPr/>
                   </pic:nvPicPr>
                   <pic:blipFill>
-                    <a:blip r:embed="rId17"/>
+                    <a:blip r:embed="rId20"/>
                     <a:stretch>
                       <a:fillRect/>
                     </a:stretch>
@@ -1237,7 +1426,7 @@
                   <pic:spPr>
                     <a:xfrm>
                       <a:off x="0" y="0"/>
-                      <a:ext cx="5299592" cy="4709060"/>
+                      <a:ext cx="4391134" cy="3901832"/>
                     </a:xfrm>
                     <a:prstGeom prst="rect">
                       <a:avLst/>
@@ -1252,7 +1441,7 @@
     </w:p>
     <w:p>
       <w:pPr>
-        <w:jc w:val="both"/>
+        <w:jc w:val="center"/>
         <w:rPr>
           <w:sz w:val="44"/>
           <w:szCs w:val="44"/>
@@ -1260,6 +1449,33 @@
           <w:lang w:val="de-DE"/>
         </w:rPr>
       </w:pPr>
+    </w:p>
+    <w:p>
+      <w:pPr>
+        <w:rPr>
+          <w:sz w:val="36"/>
+          <w:szCs w:val="36"/>
+        </w:rPr>
+      </w:pPr>
+      <w:r>
+        <w:rPr>
+          <w:sz w:val="36"/>
+          <w:szCs w:val="36"/>
+        </w:rPr>
+        <w:lastRenderedPageBreak/>
+        <w:t>2. Please ensure to document in your laboratory logbook a graphical representation depicting the train loss and validation loss trends (4 graphs).</w:t>
+      </w:r>
+    </w:p>
+    <w:p>
+      <w:pPr>
+        <w:jc w:val="center"/>
+        <w:rPr>
+          <w:sz w:val="44"/>
+          <w:szCs w:val="44"/>
+          <w:u w:val="single"/>
+          <w:lang w:val="de-DE"/>
+        </w:rPr>
+      </w:pPr>
       <w:r>
         <w:rPr>
           <w:noProof/>
@@ -1268,11 +1484,10 @@
           <w:u w:val="single"/>
           <w:lang w:val="de-DE"/>
         </w:rPr>
-        <w:lastRenderedPageBreak/>
         <w:drawing>
-          <wp:inline distT="0" distB="0" distL="0" distR="0" wp14:anchorId="0C6736EF" wp14:editId="715D934E">
-            <wp:extent cx="5731510" cy="4373880"/>
-            <wp:effectExtent l="0" t="0" r="2540" b="7620"/>
+          <wp:inline distT="0" distB="0" distL="0" distR="0" wp14:anchorId="0C6736EF" wp14:editId="43B23201">
+            <wp:extent cx="4591050" cy="3503562"/>
+            <wp:effectExtent l="0" t="0" r="0" b="1905"/>
             <wp:docPr id="355168295" name="Picture 1"/>
             <wp:cNvGraphicFramePr>
               <a:graphicFrameLocks xmlns:a="http://schemas.openxmlformats.org/drawingml/2006/main" noChangeAspect="1"/>
@@ -1285,7 +1500,7 @@
                     <pic:cNvPicPr/>
                   </pic:nvPicPr>
                   <pic:blipFill>
-                    <a:blip r:embed="rId18"/>
+                    <a:blip r:embed="rId21"/>
                     <a:stretch>
                       <a:fillRect/>
                     </a:stretch>
@@ -1293,7 +1508,7 @@
                   <pic:spPr>
                     <a:xfrm>
                       <a:off x="0" y="0"/>
-                      <a:ext cx="5731510" cy="4373880"/>
+                      <a:ext cx="4593523" cy="3505449"/>
                     </a:xfrm>
                     <a:prstGeom prst="rect">
                       <a:avLst/>
@@ -1319,7 +1534,7 @@
     </w:p>
     <w:p>
       <w:pPr>
-        <w:jc w:val="both"/>
+        <w:jc w:val="center"/>
         <w:rPr>
           <w:sz w:val="44"/>
           <w:szCs w:val="44"/>
@@ -1351,7 +1566,7 @@
                     <pic:cNvPicPr/>
                   </pic:nvPicPr>
                   <pic:blipFill>
-                    <a:blip r:embed="rId19"/>
+                    <a:blip r:embed="rId22"/>
                     <a:stretch>
                       <a:fillRect/>
                     </a:stretch>
@@ -1412,7 +1627,6 @@
           <w:u w:val="single"/>
           <w:lang w:val="de-DE"/>
         </w:rPr>
-        <w:lastRenderedPageBreak/>
         <w:drawing>
           <wp:inline distT="0" distB="0" distL="0" distR="0" wp14:anchorId="6F5180C4" wp14:editId="4D19009E">
             <wp:extent cx="5731510" cy="4261485"/>
@@ -1429,7 +1643,7 @@
                     <pic:cNvPicPr/>
                   </pic:nvPicPr>
                   <pic:blipFill>
-                    <a:blip r:embed="rId20"/>
+                    <a:blip r:embed="rId23"/>
                     <a:stretch>
                       <a:fillRect/>
                     </a:stretch>
@@ -1495,7 +1709,7 @@
                     <pic:cNvPicPr/>
                   </pic:nvPicPr>
                   <pic:blipFill>
-                    <a:blip r:embed="rId21"/>
+                    <a:blip r:embed="rId24"/>
                     <a:stretch>
                       <a:fillRect/>
                     </a:stretch>
@@ -1540,6 +1754,53 @@
           <w:sz w:val="32"/>
           <w:szCs w:val="32"/>
         </w:rPr>
+        <w:lastRenderedPageBreak/>
+        <w:t>3.</w:t>
+      </w:r>
+      <w:r>
+        <w:rPr>
+          <w:sz w:val="32"/>
+          <w:szCs w:val="32"/>
+        </w:rPr>
+        <w:t xml:space="preserve"> B</w:t>
+      </w:r>
+      <w:r>
+        <w:rPr>
+          <w:sz w:val="32"/>
+          <w:szCs w:val="32"/>
+        </w:rPr>
+        <w:t>ased on this analysis, determine the optimal number of epochs for training your model.</w:t>
+      </w:r>
+    </w:p>
+    <w:p>
+      <w:pPr>
+        <w:jc w:val="both"/>
+        <w:rPr>
+          <w:sz w:val="32"/>
+          <w:szCs w:val="32"/>
+        </w:rPr>
+      </w:pPr>
+      <w:r>
+        <w:rPr>
+          <w:b/>
+          <w:bCs/>
+          <w:sz w:val="32"/>
+          <w:szCs w:val="32"/>
+        </w:rPr>
+        <w:t>=&gt;</w:t>
+      </w:r>
+      <w:r>
+        <w:rPr>
+          <w:sz w:val="32"/>
+          <w:szCs w:val="32"/>
+        </w:rPr>
+        <w:t xml:space="preserve"> </w:t>
+      </w:r>
+      <w:r>
+        <w:rPr>
+          <w:sz w:val="32"/>
+          <w:szCs w:val="32"/>
+        </w:rPr>
         <w:t>The optimal number o</w:t>
       </w:r>
       <w:r>
@@ -1554,16 +1815,30 @@
       <w:pPr>
         <w:jc w:val="both"/>
         <w:rPr>
-          <w:sz w:val="32"/>
-          <w:szCs w:val="32"/>
-        </w:rPr>
-      </w:pPr>
-      <w:r>
-        <w:rPr>
-          <w:sz w:val="32"/>
-          <w:szCs w:val="32"/>
-        </w:rPr>
-        <w:lastRenderedPageBreak/>
+          <w:b/>
+          <w:bCs/>
+          <w:sz w:val="32"/>
+          <w:szCs w:val="32"/>
+        </w:rPr>
+      </w:pPr>
+    </w:p>
+    <w:p>
+      <w:pPr>
+        <w:jc w:val="both"/>
+        <w:rPr>
+          <w:b/>
+          <w:bCs/>
+          <w:sz w:val="32"/>
+          <w:szCs w:val="32"/>
+        </w:rPr>
+      </w:pPr>
+      <w:r>
+        <w:rPr>
+          <w:b/>
+          <w:bCs/>
+          <w:sz w:val="32"/>
+          <w:szCs w:val="32"/>
+        </w:rPr>
         <w:t>Task 2 (Optional):</w:t>
       </w:r>
     </w:p>
@@ -1597,7 +1872,7 @@
                     <pic:cNvPicPr/>
                   </pic:nvPicPr>
                   <pic:blipFill>
-                    <a:blip r:embed="rId22"/>
+                    <a:blip r:embed="rId25"/>
                     <a:stretch>
                       <a:fillRect/>
                     </a:stretch>
@@ -1632,6 +1907,7 @@
           <w:sz w:val="32"/>
           <w:szCs w:val="32"/>
         </w:rPr>
+        <w:lastRenderedPageBreak/>
         <w:drawing>
           <wp:inline distT="0" distB="0" distL="0" distR="0" wp14:anchorId="67EEA111" wp14:editId="4734FC29">
             <wp:extent cx="5731510" cy="3797935"/>
@@ -1648,7 +1924,7 @@
                     <pic:cNvPicPr/>
                   </pic:nvPicPr>
                   <pic:blipFill>
-                    <a:blip r:embed="rId23"/>
+                    <a:blip r:embed="rId26"/>
                     <a:stretch>
                       <a:fillRect/>
                     </a:stretch>
@@ -1671,20 +1947,142 @@
     </w:p>
     <w:p>
       <w:pPr>
-        <w:jc w:val="both"/>
-        <w:rPr>
-          <w:sz w:val="44"/>
-          <w:szCs w:val="44"/>
-          <w:u w:val="single"/>
-          <w:lang w:val="de-DE"/>
-        </w:rPr>
-      </w:pPr>
-      <w:r>
-        <w:rPr>
-          <w:sz w:val="44"/>
-          <w:szCs w:val="44"/>
-          <w:u w:val="single"/>
-          <w:lang w:val="de-DE"/>
+        <w:jc w:val="center"/>
+        <w:rPr>
+          <w:b/>
+          <w:bCs/>
+          <w:sz w:val="44"/>
+          <w:szCs w:val="44"/>
+          <w:u w:val="single"/>
+        </w:rPr>
+      </w:pPr>
+    </w:p>
+    <w:p>
+      <w:pPr>
+        <w:jc w:val="center"/>
+        <w:rPr>
+          <w:b/>
+          <w:bCs/>
+          <w:sz w:val="44"/>
+          <w:szCs w:val="44"/>
+          <w:u w:val="single"/>
+        </w:rPr>
+      </w:pPr>
+    </w:p>
+    <w:p>
+      <w:pPr>
+        <w:jc w:val="center"/>
+        <w:rPr>
+          <w:b/>
+          <w:bCs/>
+          <w:sz w:val="44"/>
+          <w:szCs w:val="44"/>
+          <w:u w:val="single"/>
+        </w:rPr>
+      </w:pPr>
+    </w:p>
+    <w:p>
+      <w:pPr>
+        <w:jc w:val="center"/>
+        <w:rPr>
+          <w:b/>
+          <w:bCs/>
+          <w:sz w:val="44"/>
+          <w:szCs w:val="44"/>
+          <w:u w:val="single"/>
+        </w:rPr>
+      </w:pPr>
+    </w:p>
+    <w:p>
+      <w:pPr>
+        <w:jc w:val="center"/>
+        <w:rPr>
+          <w:b/>
+          <w:bCs/>
+          <w:sz w:val="44"/>
+          <w:szCs w:val="44"/>
+          <w:u w:val="single"/>
+        </w:rPr>
+      </w:pPr>
+    </w:p>
+    <w:p>
+      <w:pPr>
+        <w:jc w:val="center"/>
+        <w:rPr>
+          <w:b/>
+          <w:bCs/>
+          <w:sz w:val="44"/>
+          <w:szCs w:val="44"/>
+          <w:u w:val="single"/>
+        </w:rPr>
+      </w:pPr>
+    </w:p>
+    <w:p>
+      <w:pPr>
+        <w:jc w:val="center"/>
+        <w:rPr>
+          <w:b/>
+          <w:bCs/>
+          <w:sz w:val="44"/>
+          <w:szCs w:val="44"/>
+          <w:u w:val="single"/>
+        </w:rPr>
+      </w:pPr>
+    </w:p>
+    <w:p>
+      <w:pPr>
+        <w:jc w:val="center"/>
+        <w:rPr>
+          <w:b/>
+          <w:bCs/>
+          <w:sz w:val="44"/>
+          <w:szCs w:val="44"/>
+          <w:u w:val="single"/>
+        </w:rPr>
+      </w:pPr>
+    </w:p>
+    <w:p>
+      <w:pPr>
+        <w:jc w:val="center"/>
+        <w:rPr>
+          <w:b/>
+          <w:bCs/>
+          <w:sz w:val="44"/>
+          <w:szCs w:val="44"/>
+          <w:u w:val="single"/>
+        </w:rPr>
+      </w:pPr>
+    </w:p>
+    <w:p>
+      <w:pPr>
+        <w:jc w:val="center"/>
+        <w:rPr>
+          <w:b/>
+          <w:bCs/>
+          <w:sz w:val="44"/>
+          <w:szCs w:val="44"/>
+          <w:u w:val="single"/>
+        </w:rPr>
+      </w:pPr>
+    </w:p>
+    <w:p>
+      <w:pPr>
+        <w:jc w:val="center"/>
+        <w:rPr>
+          <w:b/>
+          <w:bCs/>
+          <w:sz w:val="44"/>
+          <w:szCs w:val="44"/>
+          <w:u w:val="single"/>
+        </w:rPr>
+      </w:pPr>
+      <w:r>
+        <w:rPr>
+          <w:b/>
+          <w:bCs/>
+          <w:sz w:val="44"/>
+          <w:szCs w:val="44"/>
+          <w:u w:val="single"/>
         </w:rPr>
         <w:lastRenderedPageBreak/>
         <w:t>Lab 6</w:t>
@@ -1718,6 +2116,7 @@
       </w:pPr>
       <w:r>
         <w:rPr>
+          <w:noProof/>
           <w:sz w:val="44"/>
           <w:szCs w:val="44"/>
           <w:u w:val="single"/>
@@ -1739,7 +2138,7 @@
                     <pic:cNvPicPr/>
                   </pic:nvPicPr>
                   <pic:blipFill>
-                    <a:blip r:embed="rId24"/>
+                    <a:blip r:embed="rId27"/>
                     <a:stretch>
                       <a:fillRect/>
                     </a:stretch>
@@ -1783,6 +2182,7 @@
       </w:pPr>
       <w:r>
         <w:rPr>
+          <w:noProof/>
           <w:sz w:val="44"/>
           <w:szCs w:val="44"/>
           <w:u w:val="single"/>
@@ -1804,7 +2204,7 @@
                     <pic:cNvPicPr/>
                   </pic:nvPicPr>
                   <pic:blipFill>
-                    <a:blip r:embed="rId25"/>
+                    <a:blip r:embed="rId28"/>
                     <a:stretch>
                       <a:fillRect/>
                     </a:stretch>
@@ -1896,6 +2296,7 @@
       </w:pPr>
       <w:r>
         <w:rPr>
+          <w:noProof/>
           <w:sz w:val="36"/>
           <w:szCs w:val="36"/>
         </w:rPr>
@@ -1915,7 +2316,7 @@
                     <pic:cNvPicPr/>
                   </pic:nvPicPr>
                   <pic:blipFill>
-                    <a:blip r:embed="rId26"/>
+                    <a:blip r:embed="rId29"/>
                     <a:stretch>
                       <a:fillRect/>
                     </a:stretch>
@@ -1955,6 +2356,7 @@
       </w:pPr>
       <w:r>
         <w:rPr>
+          <w:noProof/>
           <w:sz w:val="36"/>
           <w:szCs w:val="36"/>
         </w:rPr>
@@ -1974,7 +2376,7 @@
                     <pic:cNvPicPr/>
                   </pic:nvPicPr>
                   <pic:blipFill>
-                    <a:blip r:embed="rId27"/>
+                    <a:blip r:embed="rId30"/>
                     <a:stretch>
                       <a:fillRect/>
                     </a:stretch>
@@ -2030,6 +2432,7 @@
       </w:pPr>
       <w:r>
         <w:rPr>
+          <w:noProof/>
           <w:sz w:val="36"/>
           <w:szCs w:val="36"/>
         </w:rPr>
@@ -2049,7 +2452,7 @@
                     <pic:cNvPicPr/>
                   </pic:nvPicPr>
                   <pic:blipFill>
-                    <a:blip r:embed="rId28"/>
+                    <a:blip r:embed="rId31"/>
                     <a:stretch>
                       <a:fillRect/>
                     </a:stretch>
@@ -2106,6 +2509,7 @@
       </w:pPr>
       <w:r>
         <w:rPr>
+          <w:noProof/>
           <w:sz w:val="36"/>
           <w:szCs w:val="36"/>
         </w:rPr>
@@ -2125,7 +2529,7 @@
                     <pic:cNvPicPr/>
                   </pic:nvPicPr>
                   <pic:blipFill>
-                    <a:blip r:embed="rId29"/>
+                    <a:blip r:embed="rId32"/>
                     <a:stretch>
                       <a:fillRect/>
                     </a:stretch>
@@ -2181,6 +2585,7 @@
       </w:pPr>
       <w:r>
         <w:rPr>
+          <w:noProof/>
           <w:sz w:val="36"/>
           <w:szCs w:val="36"/>
         </w:rPr>
@@ -2200,7 +2605,7 @@
                     <pic:cNvPicPr/>
                   </pic:nvPicPr>
                   <pic:blipFill>
-                    <a:blip r:embed="rId30"/>
+                    <a:blip r:embed="rId33"/>
                     <a:stretch>
                       <a:fillRect/>
                     </a:stretch>
@@ -2234,15 +2639,96 @@
       <w:pPr>
         <w:jc w:val="both"/>
         <w:rPr>
-          <w:sz w:val="44"/>
-          <w:szCs w:val="44"/>
-          <w:u w:val="single"/>
-        </w:rPr>
-      </w:pPr>
-    </w:p>
-    <w:p>
-      <w:pPr>
-        <w:jc w:val="both"/>
+          <w:sz w:val="36"/>
+          <w:szCs w:val="36"/>
+        </w:rPr>
+      </w:pPr>
+    </w:p>
+    <w:p>
+      <w:pPr>
+        <w:jc w:val="both"/>
+        <w:rPr>
+          <w:sz w:val="36"/>
+          <w:szCs w:val="36"/>
+        </w:rPr>
+      </w:pPr>
+    </w:p>
+    <w:p>
+      <w:pPr>
+        <w:jc w:val="both"/>
+        <w:rPr>
+          <w:sz w:val="36"/>
+          <w:szCs w:val="36"/>
+        </w:rPr>
+      </w:pPr>
+    </w:p>
+    <w:p>
+      <w:pPr>
+        <w:jc w:val="both"/>
+        <w:rPr>
+          <w:sz w:val="36"/>
+          <w:szCs w:val="36"/>
+        </w:rPr>
+      </w:pPr>
+    </w:p>
+    <w:p>
+      <w:pPr>
+        <w:jc w:val="both"/>
+        <w:rPr>
+          <w:sz w:val="36"/>
+          <w:szCs w:val="36"/>
+        </w:rPr>
+      </w:pPr>
+    </w:p>
+    <w:p>
+      <w:pPr>
+        <w:jc w:val="both"/>
+        <w:rPr>
+          <w:sz w:val="36"/>
+          <w:szCs w:val="36"/>
+        </w:rPr>
+      </w:pPr>
+    </w:p>
+    <w:p>
+      <w:pPr>
+        <w:jc w:val="both"/>
+        <w:rPr>
+          <w:b/>
+          <w:bCs/>
+          <w:sz w:val="36"/>
+          <w:szCs w:val="36"/>
+        </w:rPr>
+      </w:pPr>
+      <w:r>
+        <w:rPr>
+          <w:b/>
+          <w:bCs/>
+          <w:sz w:val="36"/>
+          <w:szCs w:val="36"/>
+        </w:rPr>
+        <w:lastRenderedPageBreak/>
+        <w:t>Task 2 (Optional)</w:t>
+      </w:r>
+    </w:p>
+    <w:p>
+      <w:pPr>
+        <w:jc w:val="both"/>
+        <w:rPr>
+          <w:sz w:val="36"/>
+          <w:szCs w:val="36"/>
+        </w:rPr>
+      </w:pPr>
+      <w:r>
+        <w:rPr>
+          <w:sz w:val="36"/>
+          <w:szCs w:val="36"/>
+        </w:rPr>
+        <w:t>Try the same example with a LSTM and/or GRU! (Optional)</w:t>
+      </w:r>
+    </w:p>
+    <w:p>
+      <w:pPr>
+        <w:jc w:val="center"/>
         <w:rPr>
           <w:sz w:val="44"/>
           <w:szCs w:val="44"/>
@@ -2257,6 +2743,172 @@
           <w:u w:val="single"/>
           <w:lang w:val="de-DE"/>
         </w:rPr>
+        <w:drawing>
+          <wp:inline distT="0" distB="0" distL="0" distR="0" wp14:anchorId="7B7110E9" wp14:editId="3BA2B142">
+            <wp:extent cx="5382376" cy="1467055"/>
+            <wp:effectExtent l="0" t="0" r="0" b="0"/>
+            <wp:docPr id="1755494823" name="Picture 1"/>
+            <wp:cNvGraphicFramePr>
+              <a:graphicFrameLocks xmlns:a="http://schemas.openxmlformats.org/drawingml/2006/main" noChangeAspect="1"/>
+            </wp:cNvGraphicFramePr>
+            <a:graphic xmlns:a="http://schemas.openxmlformats.org/drawingml/2006/main">
+              <a:graphicData uri="http://schemas.openxmlformats.org/drawingml/2006/picture">
+                <pic:pic xmlns:pic="http://schemas.openxmlformats.org/drawingml/2006/picture">
+                  <pic:nvPicPr>
+                    <pic:cNvPr id="1755494823" name=""/>
+                    <pic:cNvPicPr/>
+                  </pic:nvPicPr>
+                  <pic:blipFill>
+                    <a:blip r:embed="rId34"/>
+                    <a:stretch>
+                      <a:fillRect/>
+                    </a:stretch>
+                  </pic:blipFill>
+                  <pic:spPr>
+                    <a:xfrm>
+                      <a:off x="0" y="0"/>
+                      <a:ext cx="5382376" cy="1467055"/>
+                    </a:xfrm>
+                    <a:prstGeom prst="rect">
+                      <a:avLst/>
+                    </a:prstGeom>
+                  </pic:spPr>
+                </pic:pic>
+              </a:graphicData>
+            </a:graphic>
+          </wp:inline>
+        </w:drawing>
+      </w:r>
+    </w:p>
+    <w:p>
+      <w:pPr>
+        <w:jc w:val="center"/>
+        <w:rPr>
+          <w:sz w:val="44"/>
+          <w:szCs w:val="44"/>
+          <w:u w:val="single"/>
+          <w:lang w:val="de-DE"/>
+        </w:rPr>
+      </w:pPr>
+    </w:p>
+    <w:p>
+      <w:pPr>
+        <w:jc w:val="center"/>
+        <w:rPr>
+          <w:sz w:val="44"/>
+          <w:szCs w:val="44"/>
+          <w:u w:val="single"/>
+          <w:lang w:val="de-DE"/>
+        </w:rPr>
+      </w:pPr>
+      <w:r>
+        <w:rPr>
+          <w:sz w:val="44"/>
+          <w:szCs w:val="44"/>
+          <w:u w:val="single"/>
+          <w:lang w:val="de-DE"/>
+        </w:rPr>
+        <w:drawing>
+          <wp:inline distT="0" distB="0" distL="0" distR="0" wp14:anchorId="038DA9AA" wp14:editId="439E6476">
+            <wp:extent cx="5731510" cy="3907155"/>
+            <wp:effectExtent l="0" t="0" r="2540" b="0"/>
+            <wp:docPr id="847870857" name="Picture 1"/>
+            <wp:cNvGraphicFramePr>
+              <a:graphicFrameLocks xmlns:a="http://schemas.openxmlformats.org/drawingml/2006/main" noChangeAspect="1"/>
+            </wp:cNvGraphicFramePr>
+            <a:graphic xmlns:a="http://schemas.openxmlformats.org/drawingml/2006/main">
+              <a:graphicData uri="http://schemas.openxmlformats.org/drawingml/2006/picture">
+                <pic:pic xmlns:pic="http://schemas.openxmlformats.org/drawingml/2006/picture">
+                  <pic:nvPicPr>
+                    <pic:cNvPr id="847870857" name=""/>
+                    <pic:cNvPicPr/>
+                  </pic:nvPicPr>
+                  <pic:blipFill>
+                    <a:blip r:embed="rId35"/>
+                    <a:stretch>
+                      <a:fillRect/>
+                    </a:stretch>
+                  </pic:blipFill>
+                  <pic:spPr>
+                    <a:xfrm>
+                      <a:off x="0" y="0"/>
+                      <a:ext cx="5731510" cy="3907155"/>
+                    </a:xfrm>
+                    <a:prstGeom prst="rect">
+                      <a:avLst/>
+                    </a:prstGeom>
+                  </pic:spPr>
+                </pic:pic>
+              </a:graphicData>
+            </a:graphic>
+          </wp:inline>
+        </w:drawing>
+      </w:r>
+    </w:p>
+    <w:p>
+      <w:pPr>
+        <w:jc w:val="both"/>
+        <w:rPr>
+          <w:sz w:val="44"/>
+          <w:szCs w:val="44"/>
+          <w:u w:val="single"/>
+          <w:lang w:val="de-DE"/>
+        </w:rPr>
+      </w:pPr>
+    </w:p>
+    <w:p>
+      <w:pPr>
+        <w:jc w:val="both"/>
+        <w:rPr>
+          <w:sz w:val="44"/>
+          <w:szCs w:val="44"/>
+          <w:u w:val="single"/>
+          <w:lang w:val="de-DE"/>
+        </w:rPr>
+      </w:pPr>
+    </w:p>
+    <w:p>
+      <w:pPr>
+        <w:jc w:val="both"/>
+        <w:rPr>
+          <w:sz w:val="44"/>
+          <w:szCs w:val="44"/>
+          <w:u w:val="single"/>
+          <w:lang w:val="de-DE"/>
+        </w:rPr>
+      </w:pPr>
+    </w:p>
+    <w:p>
+      <w:pPr>
+        <w:jc w:val="both"/>
+        <w:rPr>
+          <w:sz w:val="44"/>
+          <w:szCs w:val="44"/>
+          <w:u w:val="single"/>
+          <w:lang w:val="de-DE"/>
+        </w:rPr>
+      </w:pPr>
+    </w:p>
+    <w:p>
+      <w:pPr>
+        <w:jc w:val="center"/>
+        <w:rPr>
+          <w:b/>
+          <w:bCs/>
+          <w:sz w:val="44"/>
+          <w:szCs w:val="44"/>
+          <w:u w:val="single"/>
+        </w:rPr>
+      </w:pPr>
+      <w:r>
+        <w:rPr>
+          <w:b/>
+          <w:bCs/>
+          <w:sz w:val="44"/>
+          <w:szCs w:val="44"/>
+          <w:u w:val="single"/>
+        </w:rPr>
+        <w:lastRenderedPageBreak/>
         <w:t>Lab 7</w:t>
       </w:r>
     </w:p>
@@ -2264,32 +2916,951 @@
       <w:pPr>
         <w:jc w:val="both"/>
         <w:rPr>
+          <w:b/>
+          <w:bCs/>
+          <w:sz w:val="36"/>
+          <w:szCs w:val="36"/>
+        </w:rPr>
+      </w:pPr>
+      <w:r>
+        <w:rPr>
+          <w:b/>
+          <w:bCs/>
+          <w:sz w:val="36"/>
+          <w:szCs w:val="36"/>
+        </w:rPr>
+        <w:t xml:space="preserve">Task </w:t>
+      </w:r>
+      <w:r>
+        <w:rPr>
+          <w:b/>
+          <w:bCs/>
+          <w:sz w:val="36"/>
+          <w:szCs w:val="36"/>
+        </w:rPr>
+        <w:t>1</w:t>
+      </w:r>
+    </w:p>
+    <w:p>
+      <w:pPr>
+        <w:jc w:val="both"/>
+        <w:rPr>
+          <w:sz w:val="32"/>
+          <w:szCs w:val="32"/>
+        </w:rPr>
+      </w:pPr>
+      <w:r>
+        <w:rPr>
+          <w:sz w:val="32"/>
+          <w:szCs w:val="32"/>
+        </w:rPr>
+        <w:t>1. Plot graphs for Accuracy and Loss Function for VGG16 and VGG19 (4 graphs in total).</w:t>
+      </w:r>
+    </w:p>
+    <w:p>
+      <w:pPr>
+        <w:jc w:val="both"/>
+        <w:rPr>
+          <w:b/>
+          <w:bCs/>
+          <w:sz w:val="36"/>
+          <w:szCs w:val="36"/>
+        </w:rPr>
+      </w:pPr>
+      <w:r>
+        <w:rPr>
+          <w:b/>
+          <w:bCs/>
+          <w:sz w:val="36"/>
+          <w:szCs w:val="36"/>
+        </w:rPr>
+        <w:t>VGG16</w:t>
+      </w:r>
+    </w:p>
+    <w:p>
+      <w:pPr>
+        <w:jc w:val="both"/>
+        <w:rPr>
+          <w:sz w:val="32"/>
+          <w:szCs w:val="32"/>
+        </w:rPr>
+      </w:pPr>
+      <w:r>
+        <w:rPr>
+          <w:sz w:val="32"/>
+          <w:szCs w:val="32"/>
+        </w:rPr>
+        <w:drawing>
+          <wp:inline distT="0" distB="0" distL="0" distR="0" wp14:anchorId="328BB9E0" wp14:editId="7E452F26">
+            <wp:extent cx="5731510" cy="2350135"/>
+            <wp:effectExtent l="0" t="0" r="2540" b="0"/>
+            <wp:docPr id="795858770" name="Picture 1"/>
+            <wp:cNvGraphicFramePr>
+              <a:graphicFrameLocks xmlns:a="http://schemas.openxmlformats.org/drawingml/2006/main" noChangeAspect="1"/>
+            </wp:cNvGraphicFramePr>
+            <a:graphic xmlns:a="http://schemas.openxmlformats.org/drawingml/2006/main">
+              <a:graphicData uri="http://schemas.openxmlformats.org/drawingml/2006/picture">
+                <pic:pic xmlns:pic="http://schemas.openxmlformats.org/drawingml/2006/picture">
+                  <pic:nvPicPr>
+                    <pic:cNvPr id="795858770" name=""/>
+                    <pic:cNvPicPr/>
+                  </pic:nvPicPr>
+                  <pic:blipFill>
+                    <a:blip r:embed="rId36"/>
+                    <a:stretch>
+                      <a:fillRect/>
+                    </a:stretch>
+                  </pic:blipFill>
+                  <pic:spPr>
+                    <a:xfrm>
+                      <a:off x="0" y="0"/>
+                      <a:ext cx="5731510" cy="2350135"/>
+                    </a:xfrm>
+                    <a:prstGeom prst="rect">
+                      <a:avLst/>
+                    </a:prstGeom>
+                  </pic:spPr>
+                </pic:pic>
+              </a:graphicData>
+            </a:graphic>
+          </wp:inline>
+        </w:drawing>
+      </w:r>
+    </w:p>
+    <w:p>
+      <w:pPr>
+        <w:jc w:val="both"/>
+        <w:rPr>
+          <w:sz w:val="16"/>
+          <w:szCs w:val="16"/>
+        </w:rPr>
+      </w:pPr>
+    </w:p>
+    <w:p>
+      <w:pPr>
+        <w:jc w:val="both"/>
+        <w:rPr>
+          <w:b/>
+          <w:bCs/>
+          <w:sz w:val="36"/>
+          <w:szCs w:val="36"/>
+        </w:rPr>
+      </w:pPr>
+      <w:r>
+        <w:rPr>
+          <w:b/>
+          <w:bCs/>
+          <w:sz w:val="36"/>
+          <w:szCs w:val="36"/>
+        </w:rPr>
+        <w:t>VGG19</w:t>
+      </w:r>
+    </w:p>
+    <w:p>
+      <w:pPr>
+        <w:jc w:val="both"/>
+        <w:rPr>
+          <w:b/>
+          <w:bCs/>
+          <w:sz w:val="36"/>
+          <w:szCs w:val="36"/>
+        </w:rPr>
+      </w:pPr>
+      <w:r>
+        <w:rPr>
+          <w:b/>
+          <w:bCs/>
+          <w:sz w:val="36"/>
+          <w:szCs w:val="36"/>
+        </w:rPr>
+        <w:drawing>
+          <wp:inline distT="0" distB="0" distL="0" distR="0" wp14:anchorId="228307CE" wp14:editId="2808C64F">
+            <wp:extent cx="5731510" cy="2320925"/>
+            <wp:effectExtent l="0" t="0" r="2540" b="3175"/>
+            <wp:docPr id="857084358" name="Picture 1"/>
+            <wp:cNvGraphicFramePr>
+              <a:graphicFrameLocks xmlns:a="http://schemas.openxmlformats.org/drawingml/2006/main" noChangeAspect="1"/>
+            </wp:cNvGraphicFramePr>
+            <a:graphic xmlns:a="http://schemas.openxmlformats.org/drawingml/2006/main">
+              <a:graphicData uri="http://schemas.openxmlformats.org/drawingml/2006/picture">
+                <pic:pic xmlns:pic="http://schemas.openxmlformats.org/drawingml/2006/picture">
+                  <pic:nvPicPr>
+                    <pic:cNvPr id="857084358" name=""/>
+                    <pic:cNvPicPr/>
+                  </pic:nvPicPr>
+                  <pic:blipFill>
+                    <a:blip r:embed="rId37"/>
+                    <a:stretch>
+                      <a:fillRect/>
+                    </a:stretch>
+                  </pic:blipFill>
+                  <pic:spPr>
+                    <a:xfrm>
+                      <a:off x="0" y="0"/>
+                      <a:ext cx="5731510" cy="2320925"/>
+                    </a:xfrm>
+                    <a:prstGeom prst="rect">
+                      <a:avLst/>
+                    </a:prstGeom>
+                  </pic:spPr>
+                </pic:pic>
+              </a:graphicData>
+            </a:graphic>
+          </wp:inline>
+        </w:drawing>
+      </w:r>
+    </w:p>
+    <w:p>
+      <w:pPr>
+        <w:jc w:val="both"/>
+        <w:rPr>
+          <w:b/>
+          <w:bCs/>
+          <w:sz w:val="36"/>
+          <w:szCs w:val="36"/>
+        </w:rPr>
+      </w:pPr>
+    </w:p>
+    <w:p>
+      <w:pPr>
+        <w:jc w:val="both"/>
+        <w:rPr>
+          <w:sz w:val="32"/>
+          <w:szCs w:val="32"/>
+        </w:rPr>
+      </w:pPr>
+      <w:r>
+        <w:rPr>
+          <w:sz w:val="32"/>
+          <w:szCs w:val="32"/>
+        </w:rPr>
+        <w:t>2. Based on this analysis, determine the optimal number of epochs for training your VGG16 and VGG19 models.</w:t>
+      </w:r>
+    </w:p>
+    <w:p>
+      <w:pPr>
+        <w:jc w:val="both"/>
+        <w:rPr>
+          <w:sz w:val="32"/>
+          <w:szCs w:val="32"/>
+        </w:rPr>
+      </w:pPr>
+      <w:r>
+        <w:rPr>
+          <w:sz w:val="32"/>
+          <w:szCs w:val="32"/>
+        </w:rPr>
+        <w:t>=&gt; Optimal epoch for (</w:t>
+      </w:r>
+      <w:r>
+        <w:rPr>
+          <w:sz w:val="32"/>
+          <w:szCs w:val="32"/>
+        </w:rPr>
+        <w:t>VGG16 = 40</w:t>
+      </w:r>
+      <w:r>
+        <w:rPr>
+          <w:sz w:val="32"/>
+          <w:szCs w:val="32"/>
+        </w:rPr>
+        <w:t>) and</w:t>
+      </w:r>
+      <w:r>
+        <w:rPr>
+          <w:sz w:val="32"/>
+          <w:szCs w:val="32"/>
+        </w:rPr>
+        <w:t xml:space="preserve"> </w:t>
+      </w:r>
+      <w:r>
+        <w:rPr>
+          <w:sz w:val="32"/>
+          <w:szCs w:val="32"/>
+        </w:rPr>
+        <w:t>(</w:t>
+      </w:r>
+      <w:r>
+        <w:rPr>
+          <w:sz w:val="32"/>
+          <w:szCs w:val="32"/>
+        </w:rPr>
+        <w:t>VGG19 = 40</w:t>
+      </w:r>
+      <w:r>
+        <w:rPr>
+          <w:sz w:val="32"/>
+          <w:szCs w:val="32"/>
+        </w:rPr>
+        <w:t>)</w:t>
+      </w:r>
+    </w:p>
+    <w:p>
+      <w:pPr>
+        <w:jc w:val="both"/>
+        <w:rPr>
+          <w:b/>
+          <w:bCs/>
+          <w:sz w:val="32"/>
+          <w:szCs w:val="32"/>
+        </w:rPr>
+      </w:pPr>
+      <w:r>
+        <w:rPr>
+          <w:sz w:val="32"/>
+          <w:szCs w:val="32"/>
+        </w:rPr>
+        <w:lastRenderedPageBreak/>
+        <w:t>3. Copy your early-stop code</w:t>
+      </w:r>
+    </w:p>
+    <w:p>
+      <w:pPr>
+        <w:jc w:val="both"/>
+        <w:rPr>
+          <w:b/>
+          <w:bCs/>
+          <w:sz w:val="36"/>
+          <w:szCs w:val="36"/>
+        </w:rPr>
+      </w:pPr>
+      <w:r>
+        <w:rPr>
+          <w:b/>
+          <w:bCs/>
+          <w:sz w:val="36"/>
+          <w:szCs w:val="36"/>
+        </w:rPr>
+        <w:drawing>
+          <wp:inline distT="0" distB="0" distL="0" distR="0" wp14:anchorId="4E5BBCBE" wp14:editId="3064A30F">
+            <wp:extent cx="5363323" cy="2848373"/>
+            <wp:effectExtent l="0" t="0" r="0" b="9525"/>
+            <wp:docPr id="1185677133" name="Picture 1"/>
+            <wp:cNvGraphicFramePr>
+              <a:graphicFrameLocks xmlns:a="http://schemas.openxmlformats.org/drawingml/2006/main" noChangeAspect="1"/>
+            </wp:cNvGraphicFramePr>
+            <a:graphic xmlns:a="http://schemas.openxmlformats.org/drawingml/2006/main">
+              <a:graphicData uri="http://schemas.openxmlformats.org/drawingml/2006/picture">
+                <pic:pic xmlns:pic="http://schemas.openxmlformats.org/drawingml/2006/picture">
+                  <pic:nvPicPr>
+                    <pic:cNvPr id="1185677133" name=""/>
+                    <pic:cNvPicPr/>
+                  </pic:nvPicPr>
+                  <pic:blipFill>
+                    <a:blip r:embed="rId38"/>
+                    <a:stretch>
+                      <a:fillRect/>
+                    </a:stretch>
+                  </pic:blipFill>
+                  <pic:spPr>
+                    <a:xfrm>
+                      <a:off x="0" y="0"/>
+                      <a:ext cx="5363323" cy="2848373"/>
+                    </a:xfrm>
+                    <a:prstGeom prst="rect">
+                      <a:avLst/>
+                    </a:prstGeom>
+                  </pic:spPr>
+                </pic:pic>
+              </a:graphicData>
+            </a:graphic>
+          </wp:inline>
+        </w:drawing>
+      </w:r>
+    </w:p>
+    <w:p>
+      <w:pPr>
+        <w:jc w:val="both"/>
+        <w:rPr>
+          <w:b/>
+          <w:bCs/>
+          <w:sz w:val="36"/>
+          <w:szCs w:val="36"/>
+        </w:rPr>
+      </w:pPr>
+    </w:p>
+    <w:p>
+      <w:pPr>
+        <w:jc w:val="both"/>
+        <w:rPr>
+          <w:sz w:val="32"/>
+          <w:szCs w:val="32"/>
+        </w:rPr>
+      </w:pPr>
+      <w:r>
+        <w:rPr>
+          <w:sz w:val="32"/>
+          <w:szCs w:val="32"/>
+        </w:rPr>
+        <w:t>4. Add the final Performance Table</w:t>
+      </w:r>
+    </w:p>
+    <w:p>
+      <w:pPr>
+        <w:jc w:val="both"/>
+        <w:rPr>
+          <w:b/>
+          <w:bCs/>
+          <w:sz w:val="36"/>
+          <w:szCs w:val="36"/>
+        </w:rPr>
+      </w:pPr>
+      <w:r>
+        <w:rPr>
+          <w:b/>
+          <w:bCs/>
+          <w:sz w:val="36"/>
+          <w:szCs w:val="36"/>
+        </w:rPr>
+        <w:drawing>
+          <wp:inline distT="0" distB="0" distL="0" distR="0" wp14:anchorId="5BCF271E" wp14:editId="351C7E58">
+            <wp:extent cx="3610479" cy="866896"/>
+            <wp:effectExtent l="0" t="0" r="9525" b="9525"/>
+            <wp:docPr id="622872937" name="Picture 1"/>
+            <wp:cNvGraphicFramePr>
+              <a:graphicFrameLocks xmlns:a="http://schemas.openxmlformats.org/drawingml/2006/main" noChangeAspect="1"/>
+            </wp:cNvGraphicFramePr>
+            <a:graphic xmlns:a="http://schemas.openxmlformats.org/drawingml/2006/main">
+              <a:graphicData uri="http://schemas.openxmlformats.org/drawingml/2006/picture">
+                <pic:pic xmlns:pic="http://schemas.openxmlformats.org/drawingml/2006/picture">
+                  <pic:nvPicPr>
+                    <pic:cNvPr id="622872937" name=""/>
+                    <pic:cNvPicPr/>
+                  </pic:nvPicPr>
+                  <pic:blipFill>
+                    <a:blip r:embed="rId39"/>
+                    <a:stretch>
+                      <a:fillRect/>
+                    </a:stretch>
+                  </pic:blipFill>
+                  <pic:spPr>
+                    <a:xfrm>
+                      <a:off x="0" y="0"/>
+                      <a:ext cx="3610479" cy="866896"/>
+                    </a:xfrm>
+                    <a:prstGeom prst="rect">
+                      <a:avLst/>
+                    </a:prstGeom>
+                  </pic:spPr>
+                </pic:pic>
+              </a:graphicData>
+            </a:graphic>
+          </wp:inline>
+        </w:drawing>
+      </w:r>
+    </w:p>
+    <w:p>
+      <w:pPr>
+        <w:jc w:val="both"/>
+        <w:rPr>
+          <w:b/>
+          <w:bCs/>
+          <w:sz w:val="36"/>
+          <w:szCs w:val="36"/>
+        </w:rPr>
+      </w:pPr>
+    </w:p>
+    <w:p>
+      <w:pPr>
+        <w:jc w:val="both"/>
+        <w:rPr>
+          <w:sz w:val="32"/>
+          <w:szCs w:val="32"/>
+        </w:rPr>
+      </w:pPr>
+      <w:r>
+        <w:rPr>
+          <w:sz w:val="32"/>
+          <w:szCs w:val="32"/>
+        </w:rPr>
+        <w:t>5. Plot the performance comparing histogram of VGG16 and VGG19</w:t>
+      </w:r>
+    </w:p>
+    <w:p>
+      <w:pPr>
+        <w:jc w:val="both"/>
+        <w:rPr>
+          <w:b/>
+          <w:bCs/>
+          <w:sz w:val="36"/>
+          <w:szCs w:val="36"/>
+        </w:rPr>
+      </w:pPr>
+      <w:r>
+        <w:rPr>
+          <w:b/>
+          <w:bCs/>
+          <w:sz w:val="36"/>
+          <w:szCs w:val="36"/>
+        </w:rPr>
+        <w:drawing>
+          <wp:inline distT="0" distB="0" distL="0" distR="0" wp14:anchorId="68F3227C" wp14:editId="4ADE557D">
+            <wp:extent cx="5731510" cy="2322195"/>
+            <wp:effectExtent l="0" t="0" r="2540" b="1905"/>
+            <wp:docPr id="1214523548" name="Picture 1"/>
+            <wp:cNvGraphicFramePr>
+              <a:graphicFrameLocks xmlns:a="http://schemas.openxmlformats.org/drawingml/2006/main" noChangeAspect="1"/>
+            </wp:cNvGraphicFramePr>
+            <a:graphic xmlns:a="http://schemas.openxmlformats.org/drawingml/2006/main">
+              <a:graphicData uri="http://schemas.openxmlformats.org/drawingml/2006/picture">
+                <pic:pic xmlns:pic="http://schemas.openxmlformats.org/drawingml/2006/picture">
+                  <pic:nvPicPr>
+                    <pic:cNvPr id="1214523548" name=""/>
+                    <pic:cNvPicPr/>
+                  </pic:nvPicPr>
+                  <pic:blipFill>
+                    <a:blip r:embed="rId40"/>
+                    <a:stretch>
+                      <a:fillRect/>
+                    </a:stretch>
+                  </pic:blipFill>
+                  <pic:spPr>
+                    <a:xfrm>
+                      <a:off x="0" y="0"/>
+                      <a:ext cx="5731510" cy="2322195"/>
+                    </a:xfrm>
+                    <a:prstGeom prst="rect">
+                      <a:avLst/>
+                    </a:prstGeom>
+                  </pic:spPr>
+                </pic:pic>
+              </a:graphicData>
+            </a:graphic>
+          </wp:inline>
+        </w:drawing>
+      </w:r>
+    </w:p>
+    <w:p>
+      <w:pPr>
+        <w:jc w:val="both"/>
+        <w:rPr>
+          <w:b/>
+          <w:bCs/>
+          <w:sz w:val="36"/>
+          <w:szCs w:val="36"/>
+        </w:rPr>
+      </w:pPr>
+    </w:p>
+    <w:p>
+      <w:pPr>
+        <w:jc w:val="both"/>
+        <w:rPr>
+          <w:b/>
+          <w:bCs/>
+          <w:sz w:val="36"/>
+          <w:szCs w:val="36"/>
+        </w:rPr>
+      </w:pPr>
+      <w:r>
+        <w:rPr>
+          <w:b/>
+          <w:bCs/>
+          <w:sz w:val="36"/>
+          <w:szCs w:val="36"/>
+        </w:rPr>
+        <w:lastRenderedPageBreak/>
+        <w:t>Task 2 (Optional)</w:t>
+      </w:r>
+    </w:p>
+    <w:p>
+      <w:pPr>
+        <w:jc w:val="both"/>
+        <w:rPr>
+          <w:sz w:val="36"/>
+          <w:szCs w:val="36"/>
+        </w:rPr>
+      </w:pPr>
+      <w:r>
+        <w:rPr>
+          <w:sz w:val="32"/>
+          <w:szCs w:val="32"/>
+        </w:rPr>
+        <w:t xml:space="preserve">1. Use the </w:t>
+      </w:r>
+      <w:proofErr w:type="spellStart"/>
+      <w:r>
+        <w:rPr>
+          <w:sz w:val="32"/>
+          <w:szCs w:val="32"/>
+        </w:rPr>
+        <w:t>base_model</w:t>
+      </w:r>
+      <w:proofErr w:type="spellEnd"/>
+      <w:r>
+        <w:rPr>
+          <w:sz w:val="32"/>
+          <w:szCs w:val="32"/>
+        </w:rPr>
+        <w:t xml:space="preserve"> 'Inception-V3' pre-trained neural network model.</w:t>
+      </w:r>
+    </w:p>
+    <w:p>
+      <w:pPr>
+        <w:jc w:val="both"/>
+        <w:rPr>
+          <w:sz w:val="36"/>
+          <w:szCs w:val="36"/>
+        </w:rPr>
+      </w:pPr>
+      <w:r>
+        <w:rPr>
+          <w:sz w:val="36"/>
+          <w:szCs w:val="36"/>
+        </w:rPr>
+        <w:drawing>
+          <wp:inline distT="0" distB="0" distL="0" distR="0" wp14:anchorId="3FEFC882" wp14:editId="6CEBEED4">
+            <wp:extent cx="4639322" cy="4267796"/>
+            <wp:effectExtent l="0" t="0" r="0" b="0"/>
+            <wp:docPr id="934255138" name="Picture 1"/>
+            <wp:cNvGraphicFramePr>
+              <a:graphicFrameLocks xmlns:a="http://schemas.openxmlformats.org/drawingml/2006/main" noChangeAspect="1"/>
+            </wp:cNvGraphicFramePr>
+            <a:graphic xmlns:a="http://schemas.openxmlformats.org/drawingml/2006/main">
+              <a:graphicData uri="http://schemas.openxmlformats.org/drawingml/2006/picture">
+                <pic:pic xmlns:pic="http://schemas.openxmlformats.org/drawingml/2006/picture">
+                  <pic:nvPicPr>
+                    <pic:cNvPr id="934255138" name=""/>
+                    <pic:cNvPicPr/>
+                  </pic:nvPicPr>
+                  <pic:blipFill>
+                    <a:blip r:embed="rId41"/>
+                    <a:stretch>
+                      <a:fillRect/>
+                    </a:stretch>
+                  </pic:blipFill>
+                  <pic:spPr>
+                    <a:xfrm>
+                      <a:off x="0" y="0"/>
+                      <a:ext cx="4639322" cy="4267796"/>
+                    </a:xfrm>
+                    <a:prstGeom prst="rect">
+                      <a:avLst/>
+                    </a:prstGeom>
+                  </pic:spPr>
+                </pic:pic>
+              </a:graphicData>
+            </a:graphic>
+          </wp:inline>
+        </w:drawing>
+      </w:r>
+    </w:p>
+    <w:p>
+      <w:pPr>
+        <w:jc w:val="both"/>
+        <w:rPr>
+          <w:sz w:val="32"/>
+          <w:szCs w:val="32"/>
+        </w:rPr>
+      </w:pPr>
+    </w:p>
+    <w:p>
+      <w:pPr>
+        <w:jc w:val="both"/>
+        <w:rPr>
+          <w:sz w:val="32"/>
+          <w:szCs w:val="32"/>
+        </w:rPr>
+      </w:pPr>
+    </w:p>
+    <w:p>
+      <w:pPr>
+        <w:jc w:val="both"/>
+        <w:rPr>
+          <w:sz w:val="32"/>
+          <w:szCs w:val="32"/>
+        </w:rPr>
+      </w:pPr>
+    </w:p>
+    <w:p>
+      <w:pPr>
+        <w:jc w:val="both"/>
+        <w:rPr>
+          <w:sz w:val="32"/>
+          <w:szCs w:val="32"/>
+        </w:rPr>
+      </w:pPr>
+      <w:r>
+        <w:rPr>
+          <w:sz w:val="32"/>
+          <w:szCs w:val="32"/>
+        </w:rPr>
+        <w:t>2. A</w:t>
+      </w:r>
+      <w:r>
+        <w:rPr>
+          <w:sz w:val="32"/>
+          <w:szCs w:val="32"/>
+        </w:rPr>
+        <w:t>dd Inception-V3 results to the Performance table and Performance comparing histogram.</w:t>
+      </w:r>
+    </w:p>
+    <w:p>
+      <w:pPr>
+        <w:jc w:val="both"/>
+        <w:rPr>
+          <w:sz w:val="32"/>
+          <w:szCs w:val="32"/>
+        </w:rPr>
+      </w:pPr>
+      <w:r>
+        <w:rPr>
+          <w:sz w:val="32"/>
+          <w:szCs w:val="32"/>
+        </w:rPr>
+        <w:drawing>
+          <wp:inline distT="0" distB="0" distL="0" distR="0" wp14:anchorId="747125F1" wp14:editId="33C98636">
+            <wp:extent cx="5687219" cy="1209844"/>
+            <wp:effectExtent l="0" t="0" r="8890" b="9525"/>
+            <wp:docPr id="1083785308" name="Picture 1"/>
+            <wp:cNvGraphicFramePr>
+              <a:graphicFrameLocks xmlns:a="http://schemas.openxmlformats.org/drawingml/2006/main" noChangeAspect="1"/>
+            </wp:cNvGraphicFramePr>
+            <a:graphic xmlns:a="http://schemas.openxmlformats.org/drawingml/2006/main">
+              <a:graphicData uri="http://schemas.openxmlformats.org/drawingml/2006/picture">
+                <pic:pic xmlns:pic="http://schemas.openxmlformats.org/drawingml/2006/picture">
+                  <pic:nvPicPr>
+                    <pic:cNvPr id="1083785308" name=""/>
+                    <pic:cNvPicPr/>
+                  </pic:nvPicPr>
+                  <pic:blipFill>
+                    <a:blip r:embed="rId42"/>
+                    <a:stretch>
+                      <a:fillRect/>
+                    </a:stretch>
+                  </pic:blipFill>
+                  <pic:spPr>
+                    <a:xfrm>
+                      <a:off x="0" y="0"/>
+                      <a:ext cx="5687219" cy="1209844"/>
+                    </a:xfrm>
+                    <a:prstGeom prst="rect">
+                      <a:avLst/>
+                    </a:prstGeom>
+                  </pic:spPr>
+                </pic:pic>
+              </a:graphicData>
+            </a:graphic>
+          </wp:inline>
+        </w:drawing>
+      </w:r>
+    </w:p>
+    <w:p>
+      <w:pPr>
+        <w:jc w:val="both"/>
+        <w:rPr>
+          <w:sz w:val="32"/>
+          <w:szCs w:val="32"/>
+        </w:rPr>
+      </w:pPr>
+    </w:p>
+    <w:p>
+      <w:pPr>
+        <w:jc w:val="both"/>
+        <w:rPr>
+          <w:sz w:val="44"/>
+          <w:szCs w:val="44"/>
+          <w:u w:val="single"/>
+        </w:rPr>
+      </w:pPr>
+      <w:r>
+        <w:rPr>
+          <w:sz w:val="44"/>
+          <w:szCs w:val="44"/>
+          <w:u w:val="single"/>
+        </w:rPr>
+        <w:lastRenderedPageBreak/>
+        <w:drawing>
+          <wp:inline distT="0" distB="0" distL="0" distR="0" wp14:anchorId="5E27A587" wp14:editId="1917FDFF">
+            <wp:extent cx="5731510" cy="3065145"/>
+            <wp:effectExtent l="0" t="0" r="2540" b="1905"/>
+            <wp:docPr id="289891860" name="Picture 1"/>
+            <wp:cNvGraphicFramePr>
+              <a:graphicFrameLocks xmlns:a="http://schemas.openxmlformats.org/drawingml/2006/main" noChangeAspect="1"/>
+            </wp:cNvGraphicFramePr>
+            <a:graphic xmlns:a="http://schemas.openxmlformats.org/drawingml/2006/main">
+              <a:graphicData uri="http://schemas.openxmlformats.org/drawingml/2006/picture">
+                <pic:pic xmlns:pic="http://schemas.openxmlformats.org/drawingml/2006/picture">
+                  <pic:nvPicPr>
+                    <pic:cNvPr id="289891860" name=""/>
+                    <pic:cNvPicPr/>
+                  </pic:nvPicPr>
+                  <pic:blipFill>
+                    <a:blip r:embed="rId43"/>
+                    <a:stretch>
+                      <a:fillRect/>
+                    </a:stretch>
+                  </pic:blipFill>
+                  <pic:spPr>
+                    <a:xfrm>
+                      <a:off x="0" y="0"/>
+                      <a:ext cx="5731510" cy="3065145"/>
+                    </a:xfrm>
+                    <a:prstGeom prst="rect">
+                      <a:avLst/>
+                    </a:prstGeom>
+                  </pic:spPr>
+                </pic:pic>
+              </a:graphicData>
+            </a:graphic>
+          </wp:inline>
+        </w:drawing>
+      </w:r>
+    </w:p>
+    <w:p>
+      <w:pPr>
+        <w:jc w:val="both"/>
+        <w:rPr>
+          <w:sz w:val="44"/>
+          <w:szCs w:val="44"/>
+          <w:u w:val="single"/>
+        </w:rPr>
+      </w:pPr>
+    </w:p>
+    <w:p>
+      <w:pPr>
+        <w:jc w:val="both"/>
+        <w:rPr>
+          <w:sz w:val="44"/>
+          <w:szCs w:val="44"/>
+          <w:u w:val="single"/>
+        </w:rPr>
+      </w:pPr>
+    </w:p>
+    <w:p>
+      <w:pPr>
+        <w:jc w:val="both"/>
+        <w:rPr>
+          <w:sz w:val="44"/>
+          <w:szCs w:val="44"/>
+          <w:u w:val="single"/>
+        </w:rPr>
+      </w:pPr>
+    </w:p>
+    <w:p>
+      <w:pPr>
+        <w:jc w:val="both"/>
+        <w:rPr>
+          <w:sz w:val="44"/>
+          <w:szCs w:val="44"/>
+          <w:u w:val="single"/>
+        </w:rPr>
+      </w:pPr>
+    </w:p>
+    <w:p>
+      <w:pPr>
+        <w:jc w:val="both"/>
+        <w:rPr>
+          <w:sz w:val="44"/>
+          <w:szCs w:val="44"/>
+          <w:u w:val="single"/>
+        </w:rPr>
+      </w:pPr>
+    </w:p>
+    <w:p>
+      <w:pPr>
+        <w:jc w:val="both"/>
+        <w:rPr>
+          <w:sz w:val="44"/>
+          <w:szCs w:val="44"/>
+          <w:u w:val="single"/>
+        </w:rPr>
+      </w:pPr>
+    </w:p>
+    <w:p>
+      <w:pPr>
+        <w:jc w:val="both"/>
+        <w:rPr>
+          <w:sz w:val="44"/>
+          <w:szCs w:val="44"/>
+          <w:u w:val="single"/>
+        </w:rPr>
+      </w:pPr>
+    </w:p>
+    <w:p>
+      <w:pPr>
+        <w:jc w:val="both"/>
+        <w:rPr>
+          <w:sz w:val="44"/>
+          <w:szCs w:val="44"/>
+          <w:u w:val="single"/>
+        </w:rPr>
+      </w:pPr>
+    </w:p>
+    <w:p>
+      <w:pPr>
+        <w:jc w:val="both"/>
+        <w:rPr>
+          <w:sz w:val="44"/>
+          <w:szCs w:val="44"/>
+          <w:u w:val="single"/>
+        </w:rPr>
+      </w:pPr>
+    </w:p>
+    <w:p>
+      <w:pPr>
+        <w:jc w:val="both"/>
+        <w:rPr>
+          <w:sz w:val="44"/>
+          <w:szCs w:val="44"/>
+          <w:u w:val="single"/>
+        </w:rPr>
+      </w:pPr>
+    </w:p>
+    <w:p>
+      <w:pPr>
+        <w:jc w:val="both"/>
+        <w:rPr>
+          <w:sz w:val="44"/>
+          <w:szCs w:val="44"/>
+          <w:u w:val="single"/>
+        </w:rPr>
+      </w:pPr>
+    </w:p>
+    <w:p>
+      <w:pPr>
+        <w:jc w:val="both"/>
+        <w:rPr>
+          <w:sz w:val="44"/>
+          <w:szCs w:val="44"/>
+          <w:u w:val="single"/>
+        </w:rPr>
+      </w:pPr>
+    </w:p>
+    <w:p>
+      <w:pPr>
+        <w:jc w:val="center"/>
+        <w:rPr>
+          <w:b/>
+          <w:bCs/>
           <w:sz w:val="44"/>
           <w:szCs w:val="44"/>
           <w:u w:val="single"/>
           <w:lang w:val="de-DE"/>
         </w:rPr>
       </w:pPr>
-    </w:p>
-    <w:p>
-      <w:pPr>
-        <w:jc w:val="both"/>
-        <w:rPr>
+      <w:r>
+        <w:rPr>
+          <w:b/>
+          <w:bCs/>
           <w:sz w:val="44"/>
           <w:szCs w:val="44"/>
           <w:u w:val="single"/>
           <w:lang w:val="de-DE"/>
         </w:rPr>
-      </w:pPr>
-      <w:r>
+        <w:lastRenderedPageBreak/>
+        <w:t>Lab 8</w:t>
+      </w:r>
+    </w:p>
+    <w:p>
+      <w:pPr>
+        <w:jc w:val="center"/>
         <w:rPr>
           <w:sz w:val="44"/>
           <w:szCs w:val="44"/>
           <w:u w:val="single"/>
           <w:lang w:val="de-DE"/>
         </w:rPr>
-        <w:t>Lab 8</w:t>
-      </w:r>
+      </w:pPr>
     </w:p>
     <w:p>
       <w:pPr>
@@ -2319,7 +3890,6 @@
           <w:u w:val="single"/>
           <w:lang w:val="de-DE"/>
         </w:rPr>
-        <w:lastRenderedPageBreak/>
         <w:t xml:space="preserve">Lab 9 </w:t>
       </w:r>
     </w:p>
@@ -2372,13 +3942,15 @@
           <w:sz w:val="44"/>
           <w:szCs w:val="44"/>
           <w:u w:val="single"/>
-        </w:rPr>
-      </w:pPr>
-      <w:r>
-        <w:rPr>
-          <w:sz w:val="44"/>
-          <w:szCs w:val="44"/>
-          <w:u w:val="single"/>
+          <w:lang w:val="de-DE"/>
+        </w:rPr>
+      </w:pPr>
+      <w:r>
+        <w:rPr>
+          <w:sz w:val="44"/>
+          <w:szCs w:val="44"/>
+          <w:u w:val="single"/>
+          <w:lang w:val="de-DE"/>
         </w:rPr>
         <w:t>Lab 11</w:t>
       </w:r>
@@ -2389,6 +3961,7 @@
         <w:rPr>
           <w:sz w:val="44"/>
           <w:szCs w:val="44"/>
+          <w:lang w:val="de-DE"/>
         </w:rPr>
       </w:pPr>
     </w:p>
@@ -2418,6 +3991,959 @@
     </w:sectPr>
   </w:body>
 </w:document>
+</file>
+
+<file path=word/numbering.xml><?xml version="1.0" encoding="utf-8"?>
+<w:numbering xmlns:wpc="http://schemas.microsoft.com/office/word/2010/wordprocessingCanvas" xmlns:cx="http://schemas.microsoft.com/office/drawing/2014/chartex" xmlns:cx1="http://schemas.microsoft.com/office/drawing/2015/9/8/chartex" xmlns:cx2="http://schemas.microsoft.com/office/drawing/2015/10/21/chartex" xmlns:cx3="http://schemas.microsoft.com/office/drawing/2016/5/9/chartex" xmlns:cx4="http://schemas.microsoft.com/office/drawing/2016/5/10/chartex" xmlns:cx5="http://schemas.microsoft.com/office/drawing/2016/5/11/chartex" xmlns:cx6="http://schemas.microsoft.com/office/drawing/2016/5/12/chartex" xmlns:cx7="http://schemas.microsoft.com/office/drawing/2016/5/13/chartex" xmlns:cx8="http://schemas.microsoft.com/office/drawing/2016/5/14/chartex" xmlns:mc="http://schemas.openxmlformats.org/markup-compatibility/2006" xmlns:aink="http://schemas.microsoft.com/office/drawing/2016/ink" xmlns:am3d="http://schemas.microsoft.com/office/drawing/2017/model3d" xmlns:o="urn:schemas-microsoft-com:office:office" xmlns:oel="http://schemas.microsoft.com/office/2019/extlst" xmlns:r="http://schemas.openxmlformats.org/officeDocument/2006/relationships" xmlns:m="http://schemas.openxmlformats.org/officeDocument/2006/math" xmlns:v="urn:schemas-microsoft-com:vml" xmlns:wp14="http://schemas.microsoft.com/office/word/2010/wordprocessingDrawing" xmlns:wp="http://schemas.openxmlformats.org/drawingml/2006/wordprocessingDrawing" xmlns:w10="urn:schemas-microsoft-com:office:word" xmlns:w="http://schemas.openxmlformats.org/wordprocessingml/2006/main" xmlns:w14="http://schemas.microsoft.com/office/word/2010/wordml" xmlns:w15="http://schemas.microsoft.com/office/word/2012/wordml" xmlns:w16cex="http://schemas.microsoft.com/office/word/2018/wordml/cex" xmlns:w16cid="http://schemas.microsoft.com/office/word/2016/wordml/cid" xmlns:w16="http://schemas.microsoft.com/office/word/2018/wordml" xmlns:w16du="http://schemas.microsoft.com/office/word/2023/wordml/word16du" xmlns:w16sdtdh="http://schemas.microsoft.com/office/word/2020/wordml/sdtdatahash" xmlns:w16sdtfl="http://schemas.microsoft.com/office/word/2024/wordml/sdtformatlock" xmlns:w16se="http://schemas.microsoft.com/office/word/2015/wordml/symex" xmlns:wpg="http://schemas.microsoft.com/office/word/2010/wordprocessingGroup" xmlns:wpi="http://schemas.microsoft.com/office/word/2010/wordprocessingInk" xmlns:wne="http://schemas.microsoft.com/office/word/2006/wordml" xmlns:wps="http://schemas.microsoft.com/office/word/2010/wordprocessingShape" mc:Ignorable="w14 w15 w16se w16cid w16 w16cex w16sdtdh w16sdtfl w16du wp14">
+  <w:abstractNum w:abstractNumId="0" w15:restartNumberingAfterBreak="0">
+    <w:nsid w:val="2D537D0F"/>
+    <w:multiLevelType w:val="multilevel"/>
+    <w:tmpl w:val="1536FAA4"/>
+    <w:lvl w:ilvl="0">
+      <w:start w:val="1"/>
+      <w:numFmt w:val="decimal"/>
+      <w:lvlText w:val="%1."/>
+      <w:lvlJc w:val="left"/>
+      <w:pPr>
+        <w:tabs>
+          <w:tab w:val="num" w:pos="720"/>
+        </w:tabs>
+        <w:ind w:left="720" w:hanging="360"/>
+      </w:pPr>
+    </w:lvl>
+    <w:lvl w:ilvl="1" w:tentative="1">
+      <w:start w:val="1"/>
+      <w:numFmt w:val="decimal"/>
+      <w:lvlText w:val="%2."/>
+      <w:lvlJc w:val="left"/>
+      <w:pPr>
+        <w:tabs>
+          <w:tab w:val="num" w:pos="1440"/>
+        </w:tabs>
+        <w:ind w:left="1440" w:hanging="360"/>
+      </w:pPr>
+    </w:lvl>
+    <w:lvl w:ilvl="2" w:tentative="1">
+      <w:start w:val="1"/>
+      <w:numFmt w:val="decimal"/>
+      <w:lvlText w:val="%3."/>
+      <w:lvlJc w:val="left"/>
+      <w:pPr>
+        <w:tabs>
+          <w:tab w:val="num" w:pos="2160"/>
+        </w:tabs>
+        <w:ind w:left="2160" w:hanging="360"/>
+      </w:pPr>
+    </w:lvl>
+    <w:lvl w:ilvl="3" w:tentative="1">
+      <w:start w:val="1"/>
+      <w:numFmt w:val="decimal"/>
+      <w:lvlText w:val="%4."/>
+      <w:lvlJc w:val="left"/>
+      <w:pPr>
+        <w:tabs>
+          <w:tab w:val="num" w:pos="2880"/>
+        </w:tabs>
+        <w:ind w:left="2880" w:hanging="360"/>
+      </w:pPr>
+    </w:lvl>
+    <w:lvl w:ilvl="4" w:tentative="1">
+      <w:start w:val="1"/>
+      <w:numFmt w:val="decimal"/>
+      <w:lvlText w:val="%5."/>
+      <w:lvlJc w:val="left"/>
+      <w:pPr>
+        <w:tabs>
+          <w:tab w:val="num" w:pos="3600"/>
+        </w:tabs>
+        <w:ind w:left="3600" w:hanging="360"/>
+      </w:pPr>
+    </w:lvl>
+    <w:lvl w:ilvl="5" w:tentative="1">
+      <w:start w:val="1"/>
+      <w:numFmt w:val="decimal"/>
+      <w:lvlText w:val="%6."/>
+      <w:lvlJc w:val="left"/>
+      <w:pPr>
+        <w:tabs>
+          <w:tab w:val="num" w:pos="4320"/>
+        </w:tabs>
+        <w:ind w:left="4320" w:hanging="360"/>
+      </w:pPr>
+    </w:lvl>
+    <w:lvl w:ilvl="6" w:tentative="1">
+      <w:start w:val="1"/>
+      <w:numFmt w:val="decimal"/>
+      <w:lvlText w:val="%7."/>
+      <w:lvlJc w:val="left"/>
+      <w:pPr>
+        <w:tabs>
+          <w:tab w:val="num" w:pos="5040"/>
+        </w:tabs>
+        <w:ind w:left="5040" w:hanging="360"/>
+      </w:pPr>
+    </w:lvl>
+    <w:lvl w:ilvl="7" w:tentative="1">
+      <w:start w:val="1"/>
+      <w:numFmt w:val="decimal"/>
+      <w:lvlText w:val="%8."/>
+      <w:lvlJc w:val="left"/>
+      <w:pPr>
+        <w:tabs>
+          <w:tab w:val="num" w:pos="5760"/>
+        </w:tabs>
+        <w:ind w:left="5760" w:hanging="360"/>
+      </w:pPr>
+    </w:lvl>
+    <w:lvl w:ilvl="8" w:tentative="1">
+      <w:start w:val="1"/>
+      <w:numFmt w:val="decimal"/>
+      <w:lvlText w:val="%9."/>
+      <w:lvlJc w:val="left"/>
+      <w:pPr>
+        <w:tabs>
+          <w:tab w:val="num" w:pos="6480"/>
+        </w:tabs>
+        <w:ind w:left="6480" w:hanging="360"/>
+      </w:pPr>
+    </w:lvl>
+  </w:abstractNum>
+  <w:abstractNum w:abstractNumId="1" w15:restartNumberingAfterBreak="0">
+    <w:nsid w:val="3C206750"/>
+    <w:multiLevelType w:val="multilevel"/>
+    <w:tmpl w:val="5E52D378"/>
+    <w:lvl w:ilvl="0">
+      <w:start w:val="1"/>
+      <w:numFmt w:val="decimal"/>
+      <w:lvlText w:val="%1."/>
+      <w:lvlJc w:val="left"/>
+      <w:pPr>
+        <w:tabs>
+          <w:tab w:val="num" w:pos="720"/>
+        </w:tabs>
+        <w:ind w:left="720" w:hanging="360"/>
+      </w:pPr>
+    </w:lvl>
+    <w:lvl w:ilvl="1" w:tentative="1">
+      <w:start w:val="1"/>
+      <w:numFmt w:val="decimal"/>
+      <w:lvlText w:val="%2."/>
+      <w:lvlJc w:val="left"/>
+      <w:pPr>
+        <w:tabs>
+          <w:tab w:val="num" w:pos="1440"/>
+        </w:tabs>
+        <w:ind w:left="1440" w:hanging="360"/>
+      </w:pPr>
+    </w:lvl>
+    <w:lvl w:ilvl="2" w:tentative="1">
+      <w:start w:val="1"/>
+      <w:numFmt w:val="decimal"/>
+      <w:lvlText w:val="%3."/>
+      <w:lvlJc w:val="left"/>
+      <w:pPr>
+        <w:tabs>
+          <w:tab w:val="num" w:pos="2160"/>
+        </w:tabs>
+        <w:ind w:left="2160" w:hanging="360"/>
+      </w:pPr>
+    </w:lvl>
+    <w:lvl w:ilvl="3" w:tentative="1">
+      <w:start w:val="1"/>
+      <w:numFmt w:val="decimal"/>
+      <w:lvlText w:val="%4."/>
+      <w:lvlJc w:val="left"/>
+      <w:pPr>
+        <w:tabs>
+          <w:tab w:val="num" w:pos="2880"/>
+        </w:tabs>
+        <w:ind w:left="2880" w:hanging="360"/>
+      </w:pPr>
+    </w:lvl>
+    <w:lvl w:ilvl="4" w:tentative="1">
+      <w:start w:val="1"/>
+      <w:numFmt w:val="decimal"/>
+      <w:lvlText w:val="%5."/>
+      <w:lvlJc w:val="left"/>
+      <w:pPr>
+        <w:tabs>
+          <w:tab w:val="num" w:pos="3600"/>
+        </w:tabs>
+        <w:ind w:left="3600" w:hanging="360"/>
+      </w:pPr>
+    </w:lvl>
+    <w:lvl w:ilvl="5" w:tentative="1">
+      <w:start w:val="1"/>
+      <w:numFmt w:val="decimal"/>
+      <w:lvlText w:val="%6."/>
+      <w:lvlJc w:val="left"/>
+      <w:pPr>
+        <w:tabs>
+          <w:tab w:val="num" w:pos="4320"/>
+        </w:tabs>
+        <w:ind w:left="4320" w:hanging="360"/>
+      </w:pPr>
+    </w:lvl>
+    <w:lvl w:ilvl="6" w:tentative="1">
+      <w:start w:val="1"/>
+      <w:numFmt w:val="decimal"/>
+      <w:lvlText w:val="%7."/>
+      <w:lvlJc w:val="left"/>
+      <w:pPr>
+        <w:tabs>
+          <w:tab w:val="num" w:pos="5040"/>
+        </w:tabs>
+        <w:ind w:left="5040" w:hanging="360"/>
+      </w:pPr>
+    </w:lvl>
+    <w:lvl w:ilvl="7" w:tentative="1">
+      <w:start w:val="1"/>
+      <w:numFmt w:val="decimal"/>
+      <w:lvlText w:val="%8."/>
+      <w:lvlJc w:val="left"/>
+      <w:pPr>
+        <w:tabs>
+          <w:tab w:val="num" w:pos="5760"/>
+        </w:tabs>
+        <w:ind w:left="5760" w:hanging="360"/>
+      </w:pPr>
+    </w:lvl>
+    <w:lvl w:ilvl="8" w:tentative="1">
+      <w:start w:val="1"/>
+      <w:numFmt w:val="decimal"/>
+      <w:lvlText w:val="%9."/>
+      <w:lvlJc w:val="left"/>
+      <w:pPr>
+        <w:tabs>
+          <w:tab w:val="num" w:pos="6480"/>
+        </w:tabs>
+        <w:ind w:left="6480" w:hanging="360"/>
+      </w:pPr>
+    </w:lvl>
+  </w:abstractNum>
+  <w:abstractNum w:abstractNumId="2" w15:restartNumberingAfterBreak="0">
+    <w:nsid w:val="47CF03E2"/>
+    <w:multiLevelType w:val="hybridMultilevel"/>
+    <w:tmpl w:val="E144B06C"/>
+    <w:lvl w:ilvl="0" w:tplc="0809000F">
+      <w:start w:val="2"/>
+      <w:numFmt w:val="decimal"/>
+      <w:lvlText w:val="%1."/>
+      <w:lvlJc w:val="left"/>
+      <w:pPr>
+        <w:ind w:left="720" w:hanging="360"/>
+      </w:pPr>
+      <w:rPr>
+        <w:rFonts w:hint="default"/>
+      </w:rPr>
+    </w:lvl>
+    <w:lvl w:ilvl="1" w:tplc="08090019" w:tentative="1">
+      <w:start w:val="1"/>
+      <w:numFmt w:val="lowerLetter"/>
+      <w:lvlText w:val="%2."/>
+      <w:lvlJc w:val="left"/>
+      <w:pPr>
+        <w:ind w:left="1440" w:hanging="360"/>
+      </w:pPr>
+    </w:lvl>
+    <w:lvl w:ilvl="2" w:tplc="0809001B" w:tentative="1">
+      <w:start w:val="1"/>
+      <w:numFmt w:val="lowerRoman"/>
+      <w:lvlText w:val="%3."/>
+      <w:lvlJc w:val="right"/>
+      <w:pPr>
+        <w:ind w:left="2160" w:hanging="180"/>
+      </w:pPr>
+    </w:lvl>
+    <w:lvl w:ilvl="3" w:tplc="0809000F" w:tentative="1">
+      <w:start w:val="1"/>
+      <w:numFmt w:val="decimal"/>
+      <w:lvlText w:val="%4."/>
+      <w:lvlJc w:val="left"/>
+      <w:pPr>
+        <w:ind w:left="2880" w:hanging="360"/>
+      </w:pPr>
+    </w:lvl>
+    <w:lvl w:ilvl="4" w:tplc="08090019" w:tentative="1">
+      <w:start w:val="1"/>
+      <w:numFmt w:val="lowerLetter"/>
+      <w:lvlText w:val="%5."/>
+      <w:lvlJc w:val="left"/>
+      <w:pPr>
+        <w:ind w:left="3600" w:hanging="360"/>
+      </w:pPr>
+    </w:lvl>
+    <w:lvl w:ilvl="5" w:tplc="0809001B" w:tentative="1">
+      <w:start w:val="1"/>
+      <w:numFmt w:val="lowerRoman"/>
+      <w:lvlText w:val="%6."/>
+      <w:lvlJc w:val="right"/>
+      <w:pPr>
+        <w:ind w:left="4320" w:hanging="180"/>
+      </w:pPr>
+    </w:lvl>
+    <w:lvl w:ilvl="6" w:tplc="0809000F" w:tentative="1">
+      <w:start w:val="1"/>
+      <w:numFmt w:val="decimal"/>
+      <w:lvlText w:val="%7."/>
+      <w:lvlJc w:val="left"/>
+      <w:pPr>
+        <w:ind w:left="5040" w:hanging="360"/>
+      </w:pPr>
+    </w:lvl>
+    <w:lvl w:ilvl="7" w:tplc="08090019" w:tentative="1">
+      <w:start w:val="1"/>
+      <w:numFmt w:val="lowerLetter"/>
+      <w:lvlText w:val="%8."/>
+      <w:lvlJc w:val="left"/>
+      <w:pPr>
+        <w:ind w:left="5760" w:hanging="360"/>
+      </w:pPr>
+    </w:lvl>
+    <w:lvl w:ilvl="8" w:tplc="0809001B" w:tentative="1">
+      <w:start w:val="1"/>
+      <w:numFmt w:val="lowerRoman"/>
+      <w:lvlText w:val="%9."/>
+      <w:lvlJc w:val="right"/>
+      <w:pPr>
+        <w:ind w:left="6480" w:hanging="180"/>
+      </w:pPr>
+    </w:lvl>
+  </w:abstractNum>
+  <w:abstractNum w:abstractNumId="3" w15:restartNumberingAfterBreak="0">
+    <w:nsid w:val="4CC853E6"/>
+    <w:multiLevelType w:val="hybridMultilevel"/>
+    <w:tmpl w:val="EE5A802A"/>
+    <w:lvl w:ilvl="0" w:tplc="0809000F">
+      <w:start w:val="1"/>
+      <w:numFmt w:val="decimal"/>
+      <w:lvlText w:val="%1."/>
+      <w:lvlJc w:val="left"/>
+      <w:pPr>
+        <w:ind w:left="720" w:hanging="360"/>
+      </w:pPr>
+      <w:rPr>
+        <w:rFonts w:hint="default"/>
+      </w:rPr>
+    </w:lvl>
+    <w:lvl w:ilvl="1" w:tplc="08090019" w:tentative="1">
+      <w:start w:val="1"/>
+      <w:numFmt w:val="lowerLetter"/>
+      <w:lvlText w:val="%2."/>
+      <w:lvlJc w:val="left"/>
+      <w:pPr>
+        <w:ind w:left="1440" w:hanging="360"/>
+      </w:pPr>
+    </w:lvl>
+    <w:lvl w:ilvl="2" w:tplc="0809001B" w:tentative="1">
+      <w:start w:val="1"/>
+      <w:numFmt w:val="lowerRoman"/>
+      <w:lvlText w:val="%3."/>
+      <w:lvlJc w:val="right"/>
+      <w:pPr>
+        <w:ind w:left="2160" w:hanging="180"/>
+      </w:pPr>
+    </w:lvl>
+    <w:lvl w:ilvl="3" w:tplc="0809000F" w:tentative="1">
+      <w:start w:val="1"/>
+      <w:numFmt w:val="decimal"/>
+      <w:lvlText w:val="%4."/>
+      <w:lvlJc w:val="left"/>
+      <w:pPr>
+        <w:ind w:left="2880" w:hanging="360"/>
+      </w:pPr>
+    </w:lvl>
+    <w:lvl w:ilvl="4" w:tplc="08090019" w:tentative="1">
+      <w:start w:val="1"/>
+      <w:numFmt w:val="lowerLetter"/>
+      <w:lvlText w:val="%5."/>
+      <w:lvlJc w:val="left"/>
+      <w:pPr>
+        <w:ind w:left="3600" w:hanging="360"/>
+      </w:pPr>
+    </w:lvl>
+    <w:lvl w:ilvl="5" w:tplc="0809001B" w:tentative="1">
+      <w:start w:val="1"/>
+      <w:numFmt w:val="lowerRoman"/>
+      <w:lvlText w:val="%6."/>
+      <w:lvlJc w:val="right"/>
+      <w:pPr>
+        <w:ind w:left="4320" w:hanging="180"/>
+      </w:pPr>
+    </w:lvl>
+    <w:lvl w:ilvl="6" w:tplc="0809000F" w:tentative="1">
+      <w:start w:val="1"/>
+      <w:numFmt w:val="decimal"/>
+      <w:lvlText w:val="%7."/>
+      <w:lvlJc w:val="left"/>
+      <w:pPr>
+        <w:ind w:left="5040" w:hanging="360"/>
+      </w:pPr>
+    </w:lvl>
+    <w:lvl w:ilvl="7" w:tplc="08090019" w:tentative="1">
+      <w:start w:val="1"/>
+      <w:numFmt w:val="lowerLetter"/>
+      <w:lvlText w:val="%8."/>
+      <w:lvlJc w:val="left"/>
+      <w:pPr>
+        <w:ind w:left="5760" w:hanging="360"/>
+      </w:pPr>
+    </w:lvl>
+    <w:lvl w:ilvl="8" w:tplc="0809001B" w:tentative="1">
+      <w:start w:val="1"/>
+      <w:numFmt w:val="lowerRoman"/>
+      <w:lvlText w:val="%9."/>
+      <w:lvlJc w:val="right"/>
+      <w:pPr>
+        <w:ind w:left="6480" w:hanging="180"/>
+      </w:pPr>
+    </w:lvl>
+  </w:abstractNum>
+  <w:abstractNum w:abstractNumId="4" w15:restartNumberingAfterBreak="0">
+    <w:nsid w:val="52037C0F"/>
+    <w:multiLevelType w:val="hybridMultilevel"/>
+    <w:tmpl w:val="79E831D6"/>
+    <w:lvl w:ilvl="0" w:tplc="0809000F">
+      <w:start w:val="1"/>
+      <w:numFmt w:val="decimal"/>
+      <w:lvlText w:val="%1."/>
+      <w:lvlJc w:val="left"/>
+      <w:pPr>
+        <w:ind w:left="720" w:hanging="360"/>
+      </w:pPr>
+      <w:rPr>
+        <w:rFonts w:hint="default"/>
+      </w:rPr>
+    </w:lvl>
+    <w:lvl w:ilvl="1" w:tplc="08090019" w:tentative="1">
+      <w:start w:val="1"/>
+      <w:numFmt w:val="lowerLetter"/>
+      <w:lvlText w:val="%2."/>
+      <w:lvlJc w:val="left"/>
+      <w:pPr>
+        <w:ind w:left="1440" w:hanging="360"/>
+      </w:pPr>
+    </w:lvl>
+    <w:lvl w:ilvl="2" w:tplc="0809001B" w:tentative="1">
+      <w:start w:val="1"/>
+      <w:numFmt w:val="lowerRoman"/>
+      <w:lvlText w:val="%3."/>
+      <w:lvlJc w:val="right"/>
+      <w:pPr>
+        <w:ind w:left="2160" w:hanging="180"/>
+      </w:pPr>
+    </w:lvl>
+    <w:lvl w:ilvl="3" w:tplc="0809000F" w:tentative="1">
+      <w:start w:val="1"/>
+      <w:numFmt w:val="decimal"/>
+      <w:lvlText w:val="%4."/>
+      <w:lvlJc w:val="left"/>
+      <w:pPr>
+        <w:ind w:left="2880" w:hanging="360"/>
+      </w:pPr>
+    </w:lvl>
+    <w:lvl w:ilvl="4" w:tplc="08090019" w:tentative="1">
+      <w:start w:val="1"/>
+      <w:numFmt w:val="lowerLetter"/>
+      <w:lvlText w:val="%5."/>
+      <w:lvlJc w:val="left"/>
+      <w:pPr>
+        <w:ind w:left="3600" w:hanging="360"/>
+      </w:pPr>
+    </w:lvl>
+    <w:lvl w:ilvl="5" w:tplc="0809001B" w:tentative="1">
+      <w:start w:val="1"/>
+      <w:numFmt w:val="lowerRoman"/>
+      <w:lvlText w:val="%6."/>
+      <w:lvlJc w:val="right"/>
+      <w:pPr>
+        <w:ind w:left="4320" w:hanging="180"/>
+      </w:pPr>
+    </w:lvl>
+    <w:lvl w:ilvl="6" w:tplc="0809000F" w:tentative="1">
+      <w:start w:val="1"/>
+      <w:numFmt w:val="decimal"/>
+      <w:lvlText w:val="%7."/>
+      <w:lvlJc w:val="left"/>
+      <w:pPr>
+        <w:ind w:left="5040" w:hanging="360"/>
+      </w:pPr>
+    </w:lvl>
+    <w:lvl w:ilvl="7" w:tplc="08090019" w:tentative="1">
+      <w:start w:val="1"/>
+      <w:numFmt w:val="lowerLetter"/>
+      <w:lvlText w:val="%8."/>
+      <w:lvlJc w:val="left"/>
+      <w:pPr>
+        <w:ind w:left="5760" w:hanging="360"/>
+      </w:pPr>
+    </w:lvl>
+    <w:lvl w:ilvl="8" w:tplc="0809001B" w:tentative="1">
+      <w:start w:val="1"/>
+      <w:numFmt w:val="lowerRoman"/>
+      <w:lvlText w:val="%9."/>
+      <w:lvlJc w:val="right"/>
+      <w:pPr>
+        <w:ind w:left="6480" w:hanging="180"/>
+      </w:pPr>
+    </w:lvl>
+  </w:abstractNum>
+  <w:abstractNum w:abstractNumId="5" w15:restartNumberingAfterBreak="0">
+    <w:nsid w:val="57773782"/>
+    <w:multiLevelType w:val="multilevel"/>
+    <w:tmpl w:val="5CDCD046"/>
+    <w:lvl w:ilvl="0">
+      <w:start w:val="1"/>
+      <w:numFmt w:val="decimal"/>
+      <w:lvlText w:val="%1."/>
+      <w:lvlJc w:val="left"/>
+      <w:pPr>
+        <w:tabs>
+          <w:tab w:val="num" w:pos="720"/>
+        </w:tabs>
+        <w:ind w:left="720" w:hanging="360"/>
+      </w:pPr>
+    </w:lvl>
+    <w:lvl w:ilvl="1" w:tentative="1">
+      <w:start w:val="1"/>
+      <w:numFmt w:val="decimal"/>
+      <w:lvlText w:val="%2."/>
+      <w:lvlJc w:val="left"/>
+      <w:pPr>
+        <w:tabs>
+          <w:tab w:val="num" w:pos="1440"/>
+        </w:tabs>
+        <w:ind w:left="1440" w:hanging="360"/>
+      </w:pPr>
+    </w:lvl>
+    <w:lvl w:ilvl="2" w:tentative="1">
+      <w:start w:val="1"/>
+      <w:numFmt w:val="decimal"/>
+      <w:lvlText w:val="%3."/>
+      <w:lvlJc w:val="left"/>
+      <w:pPr>
+        <w:tabs>
+          <w:tab w:val="num" w:pos="2160"/>
+        </w:tabs>
+        <w:ind w:left="2160" w:hanging="360"/>
+      </w:pPr>
+    </w:lvl>
+    <w:lvl w:ilvl="3" w:tentative="1">
+      <w:start w:val="1"/>
+      <w:numFmt w:val="decimal"/>
+      <w:lvlText w:val="%4."/>
+      <w:lvlJc w:val="left"/>
+      <w:pPr>
+        <w:tabs>
+          <w:tab w:val="num" w:pos="2880"/>
+        </w:tabs>
+        <w:ind w:left="2880" w:hanging="360"/>
+      </w:pPr>
+    </w:lvl>
+    <w:lvl w:ilvl="4" w:tentative="1">
+      <w:start w:val="1"/>
+      <w:numFmt w:val="decimal"/>
+      <w:lvlText w:val="%5."/>
+      <w:lvlJc w:val="left"/>
+      <w:pPr>
+        <w:tabs>
+          <w:tab w:val="num" w:pos="3600"/>
+        </w:tabs>
+        <w:ind w:left="3600" w:hanging="360"/>
+      </w:pPr>
+    </w:lvl>
+    <w:lvl w:ilvl="5" w:tentative="1">
+      <w:start w:val="1"/>
+      <w:numFmt w:val="decimal"/>
+      <w:lvlText w:val="%6."/>
+      <w:lvlJc w:val="left"/>
+      <w:pPr>
+        <w:tabs>
+          <w:tab w:val="num" w:pos="4320"/>
+        </w:tabs>
+        <w:ind w:left="4320" w:hanging="360"/>
+      </w:pPr>
+    </w:lvl>
+    <w:lvl w:ilvl="6" w:tentative="1">
+      <w:start w:val="1"/>
+      <w:numFmt w:val="decimal"/>
+      <w:lvlText w:val="%7."/>
+      <w:lvlJc w:val="left"/>
+      <w:pPr>
+        <w:tabs>
+          <w:tab w:val="num" w:pos="5040"/>
+        </w:tabs>
+        <w:ind w:left="5040" w:hanging="360"/>
+      </w:pPr>
+    </w:lvl>
+    <w:lvl w:ilvl="7" w:tentative="1">
+      <w:start w:val="1"/>
+      <w:numFmt w:val="decimal"/>
+      <w:lvlText w:val="%8."/>
+      <w:lvlJc w:val="left"/>
+      <w:pPr>
+        <w:tabs>
+          <w:tab w:val="num" w:pos="5760"/>
+        </w:tabs>
+        <w:ind w:left="5760" w:hanging="360"/>
+      </w:pPr>
+    </w:lvl>
+    <w:lvl w:ilvl="8" w:tentative="1">
+      <w:start w:val="1"/>
+      <w:numFmt w:val="decimal"/>
+      <w:lvlText w:val="%9."/>
+      <w:lvlJc w:val="left"/>
+      <w:pPr>
+        <w:tabs>
+          <w:tab w:val="num" w:pos="6480"/>
+        </w:tabs>
+        <w:ind w:left="6480" w:hanging="360"/>
+      </w:pPr>
+    </w:lvl>
+  </w:abstractNum>
+  <w:abstractNum w:abstractNumId="6" w15:restartNumberingAfterBreak="0">
+    <w:nsid w:val="64CC43D4"/>
+    <w:multiLevelType w:val="multilevel"/>
+    <w:tmpl w:val="A4C0F546"/>
+    <w:lvl w:ilvl="0">
+      <w:start w:val="1"/>
+      <w:numFmt w:val="decimal"/>
+      <w:lvlText w:val="%1."/>
+      <w:lvlJc w:val="left"/>
+      <w:pPr>
+        <w:tabs>
+          <w:tab w:val="num" w:pos="720"/>
+        </w:tabs>
+        <w:ind w:left="720" w:hanging="360"/>
+      </w:pPr>
+    </w:lvl>
+    <w:lvl w:ilvl="1" w:tentative="1">
+      <w:start w:val="1"/>
+      <w:numFmt w:val="decimal"/>
+      <w:lvlText w:val="%2."/>
+      <w:lvlJc w:val="left"/>
+      <w:pPr>
+        <w:tabs>
+          <w:tab w:val="num" w:pos="1440"/>
+        </w:tabs>
+        <w:ind w:left="1440" w:hanging="360"/>
+      </w:pPr>
+    </w:lvl>
+    <w:lvl w:ilvl="2" w:tentative="1">
+      <w:start w:val="1"/>
+      <w:numFmt w:val="decimal"/>
+      <w:lvlText w:val="%3."/>
+      <w:lvlJc w:val="left"/>
+      <w:pPr>
+        <w:tabs>
+          <w:tab w:val="num" w:pos="2160"/>
+        </w:tabs>
+        <w:ind w:left="2160" w:hanging="360"/>
+      </w:pPr>
+    </w:lvl>
+    <w:lvl w:ilvl="3" w:tentative="1">
+      <w:start w:val="1"/>
+      <w:numFmt w:val="decimal"/>
+      <w:lvlText w:val="%4."/>
+      <w:lvlJc w:val="left"/>
+      <w:pPr>
+        <w:tabs>
+          <w:tab w:val="num" w:pos="2880"/>
+        </w:tabs>
+        <w:ind w:left="2880" w:hanging="360"/>
+      </w:pPr>
+    </w:lvl>
+    <w:lvl w:ilvl="4" w:tentative="1">
+      <w:start w:val="1"/>
+      <w:numFmt w:val="decimal"/>
+      <w:lvlText w:val="%5."/>
+      <w:lvlJc w:val="left"/>
+      <w:pPr>
+        <w:tabs>
+          <w:tab w:val="num" w:pos="3600"/>
+        </w:tabs>
+        <w:ind w:left="3600" w:hanging="360"/>
+      </w:pPr>
+    </w:lvl>
+    <w:lvl w:ilvl="5" w:tentative="1">
+      <w:start w:val="1"/>
+      <w:numFmt w:val="decimal"/>
+      <w:lvlText w:val="%6."/>
+      <w:lvlJc w:val="left"/>
+      <w:pPr>
+        <w:tabs>
+          <w:tab w:val="num" w:pos="4320"/>
+        </w:tabs>
+        <w:ind w:left="4320" w:hanging="360"/>
+      </w:pPr>
+    </w:lvl>
+    <w:lvl w:ilvl="6" w:tentative="1">
+      <w:start w:val="1"/>
+      <w:numFmt w:val="decimal"/>
+      <w:lvlText w:val="%7."/>
+      <w:lvlJc w:val="left"/>
+      <w:pPr>
+        <w:tabs>
+          <w:tab w:val="num" w:pos="5040"/>
+        </w:tabs>
+        <w:ind w:left="5040" w:hanging="360"/>
+      </w:pPr>
+    </w:lvl>
+    <w:lvl w:ilvl="7" w:tentative="1">
+      <w:start w:val="1"/>
+      <w:numFmt w:val="decimal"/>
+      <w:lvlText w:val="%8."/>
+      <w:lvlJc w:val="left"/>
+      <w:pPr>
+        <w:tabs>
+          <w:tab w:val="num" w:pos="5760"/>
+        </w:tabs>
+        <w:ind w:left="5760" w:hanging="360"/>
+      </w:pPr>
+    </w:lvl>
+    <w:lvl w:ilvl="8" w:tentative="1">
+      <w:start w:val="1"/>
+      <w:numFmt w:val="decimal"/>
+      <w:lvlText w:val="%9."/>
+      <w:lvlJc w:val="left"/>
+      <w:pPr>
+        <w:tabs>
+          <w:tab w:val="num" w:pos="6480"/>
+        </w:tabs>
+        <w:ind w:left="6480" w:hanging="360"/>
+      </w:pPr>
+    </w:lvl>
+  </w:abstractNum>
+  <w:abstractNum w:abstractNumId="7" w15:restartNumberingAfterBreak="0">
+    <w:nsid w:val="657807C3"/>
+    <w:multiLevelType w:val="multilevel"/>
+    <w:tmpl w:val="FFCE35C8"/>
+    <w:lvl w:ilvl="0">
+      <w:start w:val="1"/>
+      <w:numFmt w:val="decimal"/>
+      <w:lvlText w:val="%1."/>
+      <w:lvlJc w:val="left"/>
+      <w:pPr>
+        <w:tabs>
+          <w:tab w:val="num" w:pos="720"/>
+        </w:tabs>
+        <w:ind w:left="720" w:hanging="360"/>
+      </w:pPr>
+    </w:lvl>
+    <w:lvl w:ilvl="1" w:tentative="1">
+      <w:start w:val="1"/>
+      <w:numFmt w:val="decimal"/>
+      <w:lvlText w:val="%2."/>
+      <w:lvlJc w:val="left"/>
+      <w:pPr>
+        <w:tabs>
+          <w:tab w:val="num" w:pos="1440"/>
+        </w:tabs>
+        <w:ind w:left="1440" w:hanging="360"/>
+      </w:pPr>
+    </w:lvl>
+    <w:lvl w:ilvl="2" w:tentative="1">
+      <w:start w:val="1"/>
+      <w:numFmt w:val="decimal"/>
+      <w:lvlText w:val="%3."/>
+      <w:lvlJc w:val="left"/>
+      <w:pPr>
+        <w:tabs>
+          <w:tab w:val="num" w:pos="2160"/>
+        </w:tabs>
+        <w:ind w:left="2160" w:hanging="360"/>
+      </w:pPr>
+    </w:lvl>
+    <w:lvl w:ilvl="3" w:tentative="1">
+      <w:start w:val="1"/>
+      <w:numFmt w:val="decimal"/>
+      <w:lvlText w:val="%4."/>
+      <w:lvlJc w:val="left"/>
+      <w:pPr>
+        <w:tabs>
+          <w:tab w:val="num" w:pos="2880"/>
+        </w:tabs>
+        <w:ind w:left="2880" w:hanging="360"/>
+      </w:pPr>
+    </w:lvl>
+    <w:lvl w:ilvl="4" w:tentative="1">
+      <w:start w:val="1"/>
+      <w:numFmt w:val="decimal"/>
+      <w:lvlText w:val="%5."/>
+      <w:lvlJc w:val="left"/>
+      <w:pPr>
+        <w:tabs>
+          <w:tab w:val="num" w:pos="3600"/>
+        </w:tabs>
+        <w:ind w:left="3600" w:hanging="360"/>
+      </w:pPr>
+    </w:lvl>
+    <w:lvl w:ilvl="5" w:tentative="1">
+      <w:start w:val="1"/>
+      <w:numFmt w:val="decimal"/>
+      <w:lvlText w:val="%6."/>
+      <w:lvlJc w:val="left"/>
+      <w:pPr>
+        <w:tabs>
+          <w:tab w:val="num" w:pos="4320"/>
+        </w:tabs>
+        <w:ind w:left="4320" w:hanging="360"/>
+      </w:pPr>
+    </w:lvl>
+    <w:lvl w:ilvl="6" w:tentative="1">
+      <w:start w:val="1"/>
+      <w:numFmt w:val="decimal"/>
+      <w:lvlText w:val="%7."/>
+      <w:lvlJc w:val="left"/>
+      <w:pPr>
+        <w:tabs>
+          <w:tab w:val="num" w:pos="5040"/>
+        </w:tabs>
+        <w:ind w:left="5040" w:hanging="360"/>
+      </w:pPr>
+    </w:lvl>
+    <w:lvl w:ilvl="7" w:tentative="1">
+      <w:start w:val="1"/>
+      <w:numFmt w:val="decimal"/>
+      <w:lvlText w:val="%8."/>
+      <w:lvlJc w:val="left"/>
+      <w:pPr>
+        <w:tabs>
+          <w:tab w:val="num" w:pos="5760"/>
+        </w:tabs>
+        <w:ind w:left="5760" w:hanging="360"/>
+      </w:pPr>
+    </w:lvl>
+    <w:lvl w:ilvl="8" w:tentative="1">
+      <w:start w:val="1"/>
+      <w:numFmt w:val="decimal"/>
+      <w:lvlText w:val="%9."/>
+      <w:lvlJc w:val="left"/>
+      <w:pPr>
+        <w:tabs>
+          <w:tab w:val="num" w:pos="6480"/>
+        </w:tabs>
+        <w:ind w:left="6480" w:hanging="360"/>
+      </w:pPr>
+    </w:lvl>
+  </w:abstractNum>
+  <w:abstractNum w:abstractNumId="8" w15:restartNumberingAfterBreak="0">
+    <w:nsid w:val="6C9B3408"/>
+    <w:multiLevelType w:val="hybridMultilevel"/>
+    <w:tmpl w:val="8020F4D2"/>
+    <w:lvl w:ilvl="0" w:tplc="D1461232">
+      <w:start w:val="1"/>
+      <w:numFmt w:val="decimal"/>
+      <w:lvlText w:val="%1"/>
+      <w:lvlJc w:val="left"/>
+      <w:pPr>
+        <w:ind w:left="720" w:hanging="360"/>
+      </w:pPr>
+      <w:rPr>
+        <w:rFonts w:hint="default"/>
+      </w:rPr>
+    </w:lvl>
+    <w:lvl w:ilvl="1" w:tplc="08090019" w:tentative="1">
+      <w:start w:val="1"/>
+      <w:numFmt w:val="lowerLetter"/>
+      <w:lvlText w:val="%2."/>
+      <w:lvlJc w:val="left"/>
+      <w:pPr>
+        <w:ind w:left="1440" w:hanging="360"/>
+      </w:pPr>
+    </w:lvl>
+    <w:lvl w:ilvl="2" w:tplc="0809001B" w:tentative="1">
+      <w:start w:val="1"/>
+      <w:numFmt w:val="lowerRoman"/>
+      <w:lvlText w:val="%3."/>
+      <w:lvlJc w:val="right"/>
+      <w:pPr>
+        <w:ind w:left="2160" w:hanging="180"/>
+      </w:pPr>
+    </w:lvl>
+    <w:lvl w:ilvl="3" w:tplc="0809000F" w:tentative="1">
+      <w:start w:val="1"/>
+      <w:numFmt w:val="decimal"/>
+      <w:lvlText w:val="%4."/>
+      <w:lvlJc w:val="left"/>
+      <w:pPr>
+        <w:ind w:left="2880" w:hanging="360"/>
+      </w:pPr>
+    </w:lvl>
+    <w:lvl w:ilvl="4" w:tplc="08090019" w:tentative="1">
+      <w:start w:val="1"/>
+      <w:numFmt w:val="lowerLetter"/>
+      <w:lvlText w:val="%5."/>
+      <w:lvlJc w:val="left"/>
+      <w:pPr>
+        <w:ind w:left="3600" w:hanging="360"/>
+      </w:pPr>
+    </w:lvl>
+    <w:lvl w:ilvl="5" w:tplc="0809001B" w:tentative="1">
+      <w:start w:val="1"/>
+      <w:numFmt w:val="lowerRoman"/>
+      <w:lvlText w:val="%6."/>
+      <w:lvlJc w:val="right"/>
+      <w:pPr>
+        <w:ind w:left="4320" w:hanging="180"/>
+      </w:pPr>
+    </w:lvl>
+    <w:lvl w:ilvl="6" w:tplc="0809000F" w:tentative="1">
+      <w:start w:val="1"/>
+      <w:numFmt w:val="decimal"/>
+      <w:lvlText w:val="%7."/>
+      <w:lvlJc w:val="left"/>
+      <w:pPr>
+        <w:ind w:left="5040" w:hanging="360"/>
+      </w:pPr>
+    </w:lvl>
+    <w:lvl w:ilvl="7" w:tplc="08090019" w:tentative="1">
+      <w:start w:val="1"/>
+      <w:numFmt w:val="lowerLetter"/>
+      <w:lvlText w:val="%8."/>
+      <w:lvlJc w:val="left"/>
+      <w:pPr>
+        <w:ind w:left="5760" w:hanging="360"/>
+      </w:pPr>
+    </w:lvl>
+    <w:lvl w:ilvl="8" w:tplc="0809001B" w:tentative="1">
+      <w:start w:val="1"/>
+      <w:numFmt w:val="lowerRoman"/>
+      <w:lvlText w:val="%9."/>
+      <w:lvlJc w:val="right"/>
+      <w:pPr>
+        <w:ind w:left="6480" w:hanging="180"/>
+      </w:pPr>
+    </w:lvl>
+  </w:abstractNum>
+  <w:num w:numId="1" w16cid:durableId="1559707127">
+    <w:abstractNumId w:val="3"/>
+  </w:num>
+  <w:num w:numId="2" w16cid:durableId="1412505344">
+    <w:abstractNumId w:val="8"/>
+  </w:num>
+  <w:num w:numId="3" w16cid:durableId="1720130656">
+    <w:abstractNumId w:val="4"/>
+  </w:num>
+  <w:num w:numId="4" w16cid:durableId="398478300">
+    <w:abstractNumId w:val="0"/>
+  </w:num>
+  <w:num w:numId="5" w16cid:durableId="1594166929">
+    <w:abstractNumId w:val="7"/>
+  </w:num>
+  <w:num w:numId="6" w16cid:durableId="2074574558">
+    <w:abstractNumId w:val="2"/>
+  </w:num>
+  <w:num w:numId="7" w16cid:durableId="25328626">
+    <w:abstractNumId w:val="6"/>
+  </w:num>
+  <w:num w:numId="8" w16cid:durableId="1557087885">
+    <w:abstractNumId w:val="5"/>
+  </w:num>
+  <w:num w:numId="9" w16cid:durableId="725224153">
+    <w:abstractNumId w:val="1"/>
+  </w:num>
+</w:numbering>
 </file>
 
 <file path=word/styles.xml><?xml version="1.0" encoding="utf-8"?>
@@ -2820,7 +5346,7 @@
   <w:style w:type="paragraph" w:default="1" w:styleId="Normal">
     <w:name w:val="Normal"/>
     <w:qFormat/>
-    <w:rsid w:val="00E37487"/>
+    <w:rsid w:val="00EE7AB4"/>
   </w:style>
   <w:style w:type="character" w:default="1" w:styleId="DefaultParagraphFont">
     <w:name w:val="Default Paragraph Font"/>
@@ -2847,6 +5373,17 @@
     <w:uiPriority w:val="99"/>
     <w:semiHidden/>
     <w:unhideWhenUsed/>
+  </w:style>
+  <w:style w:type="paragraph" w:styleId="ListParagraph">
+    <w:name w:val="List Paragraph"/>
+    <w:basedOn w:val="Normal"/>
+    <w:uiPriority w:val="34"/>
+    <w:qFormat/>
+    <w:rsid w:val="00E27006"/>
+    <w:pPr>
+      <w:ind w:left="720"/>
+      <w:contextualSpacing/>
+    </w:pPr>
   </w:style>
 </w:styles>
 </file>

</xml_diff>

<commit_message>
Lab 9 - Completed
</commit_message>
<xml_diff>
--- a/LABlogbook.docx
+++ b/LABlogbook.docx
@@ -3845,7 +3845,6 @@
           <w:sz w:val="44"/>
           <w:szCs w:val="44"/>
           <w:u w:val="single"/>
-          <w:lang w:val="de-DE"/>
         </w:rPr>
       </w:pPr>
       <w:r>
@@ -3855,7 +3854,6 @@
           <w:sz w:val="44"/>
           <w:szCs w:val="44"/>
           <w:u w:val="single"/>
-          <w:lang w:val="de-DE"/>
         </w:rPr>
         <w:lastRenderedPageBreak/>
         <w:t>Lab 8</w:t>
@@ -3873,14 +3871,7 @@
           <w:sz w:val="32"/>
           <w:szCs w:val="32"/>
         </w:rPr>
-        <w:t>1) Y</w:t>
-      </w:r>
-      <w:r>
-        <w:rPr>
-          <w:sz w:val="32"/>
-          <w:szCs w:val="32"/>
-        </w:rPr>
-        <w:t xml:space="preserve">our LSTM architecture using </w:t>
+        <w:t xml:space="preserve">1) Your LSTM architecture using </w:t>
       </w:r>
       <w:proofErr w:type="spellStart"/>
       <w:r>
@@ -3908,6 +3899,7 @@
       </w:pPr>
       <w:r>
         <w:rPr>
+          <w:noProof/>
           <w:sz w:val="32"/>
           <w:szCs w:val="32"/>
         </w:rPr>
@@ -3968,14 +3960,7 @@
           <w:sz w:val="32"/>
           <w:szCs w:val="32"/>
         </w:rPr>
-        <w:t>2) C</w:t>
-      </w:r>
-      <w:r>
-        <w:rPr>
-          <w:sz w:val="32"/>
-          <w:szCs w:val="32"/>
-        </w:rPr>
-        <w:t xml:space="preserve">ode and training result using </w:t>
+        <w:t xml:space="preserve">2) Code and training result using </w:t>
       </w:r>
       <w:proofErr w:type="spellStart"/>
       <w:r>
@@ -4003,6 +3988,7 @@
       </w:pPr>
       <w:r>
         <w:rPr>
+          <w:noProof/>
           <w:sz w:val="32"/>
           <w:szCs w:val="32"/>
         </w:rPr>
@@ -4063,25 +4049,19 @@
           <w:sz w:val="32"/>
           <w:szCs w:val="32"/>
         </w:rPr>
-        <w:t>3) T</w:t>
-      </w:r>
-      <w:r>
-        <w:rPr>
-          <w:sz w:val="32"/>
-          <w:szCs w:val="32"/>
-        </w:rPr>
-        <w:t>he resulting test MSE &amp; MAE</w:t>
-      </w:r>
-    </w:p>
-    <w:p>
-      <w:pPr>
-        <w:rPr>
-          <w:sz w:val="32"/>
-          <w:szCs w:val="32"/>
-        </w:rPr>
-      </w:pPr>
-      <w:r>
-        <w:rPr>
+        <w:t>3) The resulting test MSE &amp; MAE</w:t>
+      </w:r>
+    </w:p>
+    <w:p>
+      <w:pPr>
+        <w:rPr>
+          <w:sz w:val="32"/>
+          <w:szCs w:val="32"/>
+        </w:rPr>
+      </w:pPr>
+      <w:r>
+        <w:rPr>
+          <w:noProof/>
           <w:sz w:val="32"/>
           <w:szCs w:val="32"/>
         </w:rPr>
@@ -4135,14 +4115,7 @@
           <w:szCs w:val="32"/>
         </w:rPr>
         <w:lastRenderedPageBreak/>
-        <w:t xml:space="preserve">4) </w:t>
-      </w:r>
-      <w:r>
-        <w:rPr>
-          <w:sz w:val="32"/>
-          <w:szCs w:val="32"/>
-        </w:rPr>
-        <w:t>MAE detailed graph</w:t>
+        <w:t>4) MAE detailed graph</w:t>
       </w:r>
       <w:r>
         <w:rPr>
@@ -4161,6 +4134,7 @@
       </w:pPr>
       <w:r>
         <w:rPr>
+          <w:noProof/>
           <w:sz w:val="32"/>
           <w:szCs w:val="32"/>
         </w:rPr>
@@ -4331,7 +4305,6 @@
           <w:bCs/>
           <w:sz w:val="44"/>
           <w:szCs w:val="44"/>
-          <w:lang w:val="de-DE"/>
         </w:rPr>
       </w:pPr>
       <w:r>
@@ -4340,7 +4313,6 @@
           <w:bCs/>
           <w:sz w:val="44"/>
           <w:szCs w:val="44"/>
-          <w:lang w:val="de-DE"/>
         </w:rPr>
         <w:lastRenderedPageBreak/>
         <w:t>Lab 9</w:t>
@@ -4349,6 +4321,68 @@
     <w:p>
       <w:pPr>
         <w:rPr>
+          <w:sz w:val="32"/>
+          <w:szCs w:val="32"/>
+        </w:rPr>
+      </w:pPr>
+    </w:p>
+    <w:p>
+      <w:pPr>
+        <w:rPr>
+          <w:sz w:val="32"/>
+          <w:szCs w:val="32"/>
+        </w:rPr>
+      </w:pPr>
+      <w:r>
+        <w:rPr>
+          <w:sz w:val="32"/>
+          <w:szCs w:val="32"/>
+        </w:rPr>
+        <w:t>1. C</w:t>
+      </w:r>
+      <w:r>
+        <w:rPr>
+          <w:sz w:val="32"/>
+          <w:szCs w:val="32"/>
+        </w:rPr>
+        <w:t xml:space="preserve">ode your Use </w:t>
+      </w:r>
+      <w:proofErr w:type="spellStart"/>
+      <w:r>
+        <w:rPr>
+          <w:sz w:val="32"/>
+          <w:szCs w:val="32"/>
+        </w:rPr>
+        <w:t>EarlyStopping</w:t>
+      </w:r>
+      <w:proofErr w:type="spellEnd"/>
+      <w:r>
+        <w:rPr>
+          <w:sz w:val="32"/>
+          <w:szCs w:val="32"/>
+        </w:rPr>
+        <w:t xml:space="preserve">() and </w:t>
+      </w:r>
+      <w:proofErr w:type="spellStart"/>
+      <w:r>
+        <w:rPr>
+          <w:sz w:val="32"/>
+          <w:szCs w:val="32"/>
+        </w:rPr>
+        <w:t>ModelCheckpoint</w:t>
+      </w:r>
+      <w:proofErr w:type="spellEnd"/>
+      <w:r>
+        <w:rPr>
+          <w:sz w:val="32"/>
+          <w:szCs w:val="32"/>
+        </w:rPr>
+        <w:t>() functions</w:t>
+      </w:r>
+    </w:p>
+    <w:p>
+      <w:pPr>
+        <w:rPr>
           <w:b/>
           <w:bCs/>
           <w:sz w:val="44"/>
@@ -4356,35 +4390,434 @@
           <w:lang w:val="de-DE"/>
         </w:rPr>
       </w:pPr>
-    </w:p>
-    <w:p>
-      <w:pPr>
-        <w:jc w:val="both"/>
-        <w:rPr>
-          <w:sz w:val="44"/>
-          <w:szCs w:val="44"/>
-          <w:u w:val="single"/>
+      <w:r>
+        <w:rPr>
+          <w:b/>
+          <w:bCs/>
+          <w:sz w:val="44"/>
+          <w:szCs w:val="44"/>
           <w:lang w:val="de-DE"/>
         </w:rPr>
-      </w:pPr>
-    </w:p>
-    <w:p>
-      <w:pPr>
-        <w:jc w:val="both"/>
-        <w:rPr>
-          <w:sz w:val="44"/>
-          <w:szCs w:val="44"/>
-          <w:u w:val="single"/>
+        <w:drawing>
+          <wp:inline distT="0" distB="0" distL="0" distR="0" wp14:anchorId="5DC94FDC" wp14:editId="23B0CF6B">
+            <wp:extent cx="5731510" cy="288290"/>
+            <wp:effectExtent l="0" t="0" r="2540" b="0"/>
+            <wp:docPr id="437641742" name="Picture 1"/>
+            <wp:cNvGraphicFramePr>
+              <a:graphicFrameLocks xmlns:a="http://schemas.openxmlformats.org/drawingml/2006/main" noChangeAspect="1"/>
+            </wp:cNvGraphicFramePr>
+            <a:graphic xmlns:a="http://schemas.openxmlformats.org/drawingml/2006/main">
+              <a:graphicData uri="http://schemas.openxmlformats.org/drawingml/2006/picture">
+                <pic:pic xmlns:pic="http://schemas.openxmlformats.org/drawingml/2006/picture">
+                  <pic:nvPicPr>
+                    <pic:cNvPr id="437641742" name=""/>
+                    <pic:cNvPicPr/>
+                  </pic:nvPicPr>
+                  <pic:blipFill>
+                    <a:blip r:embed="rId48"/>
+                    <a:stretch>
+                      <a:fillRect/>
+                    </a:stretch>
+                  </pic:blipFill>
+                  <pic:spPr>
+                    <a:xfrm>
+                      <a:off x="0" y="0"/>
+                      <a:ext cx="5731510" cy="288290"/>
+                    </a:xfrm>
+                    <a:prstGeom prst="rect">
+                      <a:avLst/>
+                    </a:prstGeom>
+                  </pic:spPr>
+                </pic:pic>
+              </a:graphicData>
+            </a:graphic>
+          </wp:inline>
+        </w:drawing>
+      </w:r>
+    </w:p>
+    <w:p>
+      <w:pPr>
+        <w:rPr>
+          <w:sz w:val="32"/>
+          <w:szCs w:val="32"/>
+        </w:rPr>
+      </w:pPr>
+    </w:p>
+    <w:p>
+      <w:pPr>
+        <w:rPr>
+          <w:sz w:val="32"/>
+          <w:szCs w:val="32"/>
+        </w:rPr>
+      </w:pPr>
+      <w:r>
+        <w:rPr>
+          <w:sz w:val="32"/>
+          <w:szCs w:val="32"/>
+        </w:rPr>
+        <w:t>2</w:t>
+      </w:r>
+      <w:r>
+        <w:rPr>
+          <w:sz w:val="32"/>
+          <w:szCs w:val="32"/>
+        </w:rPr>
+        <w:t xml:space="preserve">. </w:t>
+      </w:r>
+      <w:r>
+        <w:rPr>
+          <w:sz w:val="32"/>
+          <w:szCs w:val="32"/>
+        </w:rPr>
+        <w:t xml:space="preserve">code and training result using </w:t>
+      </w:r>
+      <w:proofErr w:type="spellStart"/>
+      <w:r>
+        <w:rPr>
+          <w:sz w:val="32"/>
+          <w:szCs w:val="32"/>
+        </w:rPr>
+        <w:t>model.fit</w:t>
+      </w:r>
+      <w:proofErr w:type="spellEnd"/>
+      <w:r>
+        <w:rPr>
+          <w:sz w:val="32"/>
+          <w:szCs w:val="32"/>
+        </w:rPr>
+        <w:t>()</w:t>
+      </w:r>
+    </w:p>
+    <w:p>
+      <w:pPr>
+        <w:rPr>
+          <w:sz w:val="32"/>
+          <w:szCs w:val="32"/>
+        </w:rPr>
+      </w:pPr>
+      <w:r>
+        <w:rPr>
+          <w:sz w:val="32"/>
+          <w:szCs w:val="32"/>
+        </w:rPr>
+        <w:drawing>
+          <wp:inline distT="0" distB="0" distL="0" distR="0" wp14:anchorId="2BF2478E" wp14:editId="3F87108B">
+            <wp:extent cx="5731510" cy="4117975"/>
+            <wp:effectExtent l="0" t="0" r="2540" b="0"/>
+            <wp:docPr id="166359703" name="Picture 1"/>
+            <wp:cNvGraphicFramePr>
+              <a:graphicFrameLocks xmlns:a="http://schemas.openxmlformats.org/drawingml/2006/main" noChangeAspect="1"/>
+            </wp:cNvGraphicFramePr>
+            <a:graphic xmlns:a="http://schemas.openxmlformats.org/drawingml/2006/main">
+              <a:graphicData uri="http://schemas.openxmlformats.org/drawingml/2006/picture">
+                <pic:pic xmlns:pic="http://schemas.openxmlformats.org/drawingml/2006/picture">
+                  <pic:nvPicPr>
+                    <pic:cNvPr id="166359703" name=""/>
+                    <pic:cNvPicPr/>
+                  </pic:nvPicPr>
+                  <pic:blipFill>
+                    <a:blip r:embed="rId49"/>
+                    <a:stretch>
+                      <a:fillRect/>
+                    </a:stretch>
+                  </pic:blipFill>
+                  <pic:spPr>
+                    <a:xfrm>
+                      <a:off x="0" y="0"/>
+                      <a:ext cx="5731510" cy="4117975"/>
+                    </a:xfrm>
+                    <a:prstGeom prst="rect">
+                      <a:avLst/>
+                    </a:prstGeom>
+                  </pic:spPr>
+                </pic:pic>
+              </a:graphicData>
+            </a:graphic>
+          </wp:inline>
+        </w:drawing>
+      </w:r>
+    </w:p>
+    <w:p>
+      <w:pPr>
+        <w:rPr>
+          <w:sz w:val="32"/>
+          <w:szCs w:val="32"/>
+        </w:rPr>
+      </w:pPr>
+    </w:p>
+    <w:p>
+      <w:pPr>
+        <w:rPr>
+          <w:sz w:val="32"/>
+          <w:szCs w:val="32"/>
+        </w:rPr>
+      </w:pPr>
+    </w:p>
+    <w:p>
+      <w:pPr>
+        <w:rPr>
+          <w:sz w:val="32"/>
+          <w:szCs w:val="32"/>
+        </w:rPr>
+      </w:pPr>
+    </w:p>
+    <w:p>
+      <w:pPr>
+        <w:rPr>
+          <w:sz w:val="32"/>
+          <w:szCs w:val="32"/>
+        </w:rPr>
+      </w:pPr>
+    </w:p>
+    <w:p>
+      <w:pPr>
+        <w:rPr>
+          <w:sz w:val="32"/>
+          <w:szCs w:val="32"/>
+        </w:rPr>
+      </w:pPr>
+    </w:p>
+    <w:p>
+      <w:pPr>
+        <w:rPr>
+          <w:sz w:val="32"/>
+          <w:szCs w:val="32"/>
+        </w:rPr>
+      </w:pPr>
+      <w:r>
+        <w:rPr>
+          <w:sz w:val="32"/>
+          <w:szCs w:val="32"/>
+        </w:rPr>
+        <w:lastRenderedPageBreak/>
+        <w:t>3</w:t>
+      </w:r>
+      <w:r>
+        <w:rPr>
+          <w:sz w:val="32"/>
+          <w:szCs w:val="32"/>
+        </w:rPr>
+        <w:t xml:space="preserve">. </w:t>
+      </w:r>
+      <w:r>
+        <w:rPr>
+          <w:sz w:val="32"/>
+          <w:szCs w:val="32"/>
+        </w:rPr>
+        <w:t xml:space="preserve">the resulting test Accuracy and other error metrics for the classification task using </w:t>
+      </w:r>
+      <w:proofErr w:type="spellStart"/>
+      <w:r>
+        <w:rPr>
+          <w:sz w:val="32"/>
+          <w:szCs w:val="32"/>
+        </w:rPr>
+        <w:t>classification_report</w:t>
+      </w:r>
+      <w:proofErr w:type="spellEnd"/>
+      <w:r>
+        <w:rPr>
+          <w:sz w:val="32"/>
+          <w:szCs w:val="32"/>
+        </w:rPr>
+        <w:t>().</w:t>
+      </w:r>
+    </w:p>
+    <w:p>
+      <w:pPr>
+        <w:rPr>
+          <w:sz w:val="32"/>
+          <w:szCs w:val="32"/>
+        </w:rPr>
+      </w:pPr>
+      <w:r>
+        <w:rPr>
+          <w:sz w:val="32"/>
+          <w:szCs w:val="32"/>
+        </w:rPr>
+        <w:drawing>
+          <wp:inline distT="0" distB="0" distL="0" distR="0" wp14:anchorId="3752B34B" wp14:editId="7AB52640">
+            <wp:extent cx="4572638" cy="2791215"/>
+            <wp:effectExtent l="0" t="0" r="0" b="9525"/>
+            <wp:docPr id="41475650" name="Picture 1"/>
+            <wp:cNvGraphicFramePr>
+              <a:graphicFrameLocks xmlns:a="http://schemas.openxmlformats.org/drawingml/2006/main" noChangeAspect="1"/>
+            </wp:cNvGraphicFramePr>
+            <a:graphic xmlns:a="http://schemas.openxmlformats.org/drawingml/2006/main">
+              <a:graphicData uri="http://schemas.openxmlformats.org/drawingml/2006/picture">
+                <pic:pic xmlns:pic="http://schemas.openxmlformats.org/drawingml/2006/picture">
+                  <pic:nvPicPr>
+                    <pic:cNvPr id="41475650" name=""/>
+                    <pic:cNvPicPr/>
+                  </pic:nvPicPr>
+                  <pic:blipFill>
+                    <a:blip r:embed="rId50"/>
+                    <a:stretch>
+                      <a:fillRect/>
+                    </a:stretch>
+                  </pic:blipFill>
+                  <pic:spPr>
+                    <a:xfrm>
+                      <a:off x="0" y="0"/>
+                      <a:ext cx="4572638" cy="2791215"/>
+                    </a:xfrm>
+                    <a:prstGeom prst="rect">
+                      <a:avLst/>
+                    </a:prstGeom>
+                  </pic:spPr>
+                </pic:pic>
+              </a:graphicData>
+            </a:graphic>
+          </wp:inline>
+        </w:drawing>
+      </w:r>
+    </w:p>
+    <w:p>
+      <w:pPr>
+        <w:rPr>
+          <w:sz w:val="32"/>
+          <w:szCs w:val="32"/>
+        </w:rPr>
+      </w:pPr>
+    </w:p>
+    <w:p>
+      <w:pPr>
+        <w:rPr>
+          <w:sz w:val="32"/>
+          <w:szCs w:val="32"/>
+        </w:rPr>
+      </w:pPr>
+    </w:p>
+    <w:p>
+      <w:pPr>
+        <w:rPr>
+          <w:sz w:val="32"/>
+          <w:szCs w:val="32"/>
+        </w:rPr>
+      </w:pPr>
+    </w:p>
+    <w:p>
+      <w:pPr>
+        <w:rPr>
+          <w:sz w:val="32"/>
+          <w:szCs w:val="32"/>
+        </w:rPr>
+      </w:pPr>
+      <w:r>
+        <w:rPr>
+          <w:sz w:val="32"/>
+          <w:szCs w:val="32"/>
+        </w:rPr>
+        <w:t>4</w:t>
+      </w:r>
+      <w:r>
+        <w:rPr>
+          <w:sz w:val="32"/>
+          <w:szCs w:val="32"/>
+        </w:rPr>
+        <w:t xml:space="preserve">. </w:t>
+      </w:r>
+      <w:r>
+        <w:rPr>
+          <w:sz w:val="32"/>
+          <w:szCs w:val="32"/>
+        </w:rPr>
+        <w:t>Accuracy detailed graph</w:t>
+      </w:r>
+    </w:p>
+    <w:p>
+      <w:pPr>
+        <w:jc w:val="both"/>
+        <w:rPr>
+          <w:sz w:val="44"/>
+          <w:szCs w:val="44"/>
+          <w:u w:val="single"/>
+        </w:rPr>
+      </w:pPr>
+      <w:r>
+        <w:rPr>
+          <w:noProof/>
+        </w:rPr>
+        <w:drawing>
+          <wp:inline distT="0" distB="0" distL="0" distR="0" wp14:anchorId="452B923C" wp14:editId="7B5B5F69">
+            <wp:extent cx="5731510" cy="2959735"/>
+            <wp:effectExtent l="0" t="0" r="2540" b="0"/>
+            <wp:docPr id="773906130" name="Picture 1"/>
+            <wp:cNvGraphicFramePr>
+              <a:graphicFrameLocks xmlns:a="http://schemas.openxmlformats.org/drawingml/2006/main" noChangeAspect="1"/>
+            </wp:cNvGraphicFramePr>
+            <a:graphic xmlns:a="http://schemas.openxmlformats.org/drawingml/2006/main">
+              <a:graphicData uri="http://schemas.openxmlformats.org/drawingml/2006/picture">
+                <pic:pic xmlns:pic="http://schemas.openxmlformats.org/drawingml/2006/picture">
+                  <pic:nvPicPr>
+                    <pic:cNvPr id="0" name="Picture 1"/>
+                    <pic:cNvPicPr>
+                      <a:picLocks noChangeAspect="1" noChangeArrowheads="1"/>
+                    </pic:cNvPicPr>
+                  </pic:nvPicPr>
+                  <pic:blipFill>
+                    <a:blip r:embed="rId51">
+                      <a:extLst>
+                        <a:ext uri="{28A0092B-C50C-407E-A947-70E740481C1C}">
+                          <a14:useLocalDpi xmlns:a14="http://schemas.microsoft.com/office/drawing/2010/main" val="0"/>
+                        </a:ext>
+                      </a:extLst>
+                    </a:blip>
+                    <a:srcRect/>
+                    <a:stretch>
+                      <a:fillRect/>
+                    </a:stretch>
+                  </pic:blipFill>
+                  <pic:spPr bwMode="auto">
+                    <a:xfrm>
+                      <a:off x="0" y="0"/>
+                      <a:ext cx="5731510" cy="2959735"/>
+                    </a:xfrm>
+                    <a:prstGeom prst="rect">
+                      <a:avLst/>
+                    </a:prstGeom>
+                    <a:noFill/>
+                    <a:ln>
+                      <a:noFill/>
+                    </a:ln>
+                  </pic:spPr>
+                </pic:pic>
+              </a:graphicData>
+            </a:graphic>
+          </wp:inline>
+        </w:drawing>
+      </w:r>
+    </w:p>
+    <w:p>
+      <w:pPr>
+        <w:jc w:val="both"/>
+        <w:rPr>
+          <w:sz w:val="44"/>
+          <w:szCs w:val="44"/>
+          <w:u w:val="single"/>
+        </w:rPr>
+      </w:pPr>
+    </w:p>
+    <w:p>
+      <w:pPr>
+        <w:jc w:val="center"/>
+        <w:rPr>
+          <w:b/>
+          <w:bCs/>
+          <w:sz w:val="44"/>
+          <w:szCs w:val="44"/>
           <w:lang w:val="de-DE"/>
         </w:rPr>
       </w:pPr>
       <w:r>
         <w:rPr>
-          <w:sz w:val="44"/>
-          <w:szCs w:val="44"/>
-          <w:u w:val="single"/>
+          <w:b/>
+          <w:bCs/>
+          <w:sz w:val="44"/>
+          <w:szCs w:val="44"/>
           <w:lang w:val="de-DE"/>
         </w:rPr>
+        <w:lastRenderedPageBreak/>
         <w:t>Lab 10</w:t>
       </w:r>
     </w:p>
@@ -4462,6 +4895,155 @@
 <file path=word/numbering.xml><?xml version="1.0" encoding="utf-8"?>
 <w:numbering xmlns:wpc="http://schemas.microsoft.com/office/word/2010/wordprocessingCanvas" xmlns:cx="http://schemas.microsoft.com/office/drawing/2014/chartex" xmlns:cx1="http://schemas.microsoft.com/office/drawing/2015/9/8/chartex" xmlns:cx2="http://schemas.microsoft.com/office/drawing/2015/10/21/chartex" xmlns:cx3="http://schemas.microsoft.com/office/drawing/2016/5/9/chartex" xmlns:cx4="http://schemas.microsoft.com/office/drawing/2016/5/10/chartex" xmlns:cx5="http://schemas.microsoft.com/office/drawing/2016/5/11/chartex" xmlns:cx6="http://schemas.microsoft.com/office/drawing/2016/5/12/chartex" xmlns:cx7="http://schemas.microsoft.com/office/drawing/2016/5/13/chartex" xmlns:cx8="http://schemas.microsoft.com/office/drawing/2016/5/14/chartex" xmlns:mc="http://schemas.openxmlformats.org/markup-compatibility/2006" xmlns:aink="http://schemas.microsoft.com/office/drawing/2016/ink" xmlns:am3d="http://schemas.microsoft.com/office/drawing/2017/model3d" xmlns:o="urn:schemas-microsoft-com:office:office" xmlns:oel="http://schemas.microsoft.com/office/2019/extlst" xmlns:r="http://schemas.openxmlformats.org/officeDocument/2006/relationships" xmlns:m="http://schemas.openxmlformats.org/officeDocument/2006/math" xmlns:v="urn:schemas-microsoft-com:vml" xmlns:wp14="http://schemas.microsoft.com/office/word/2010/wordprocessingDrawing" xmlns:wp="http://schemas.openxmlformats.org/drawingml/2006/wordprocessingDrawing" xmlns:w10="urn:schemas-microsoft-com:office:word" xmlns:w="http://schemas.openxmlformats.org/wordprocessingml/2006/main" xmlns:w14="http://schemas.microsoft.com/office/word/2010/wordml" xmlns:w15="http://schemas.microsoft.com/office/word/2012/wordml" xmlns:w16cex="http://schemas.microsoft.com/office/word/2018/wordml/cex" xmlns:w16cid="http://schemas.microsoft.com/office/word/2016/wordml/cid" xmlns:w16="http://schemas.microsoft.com/office/word/2018/wordml" xmlns:w16du="http://schemas.microsoft.com/office/word/2023/wordml/word16du" xmlns:w16sdtdh="http://schemas.microsoft.com/office/word/2020/wordml/sdtdatahash" xmlns:w16sdtfl="http://schemas.microsoft.com/office/word/2024/wordml/sdtformatlock" xmlns:w16se="http://schemas.microsoft.com/office/word/2015/wordml/symex" xmlns:wpg="http://schemas.microsoft.com/office/word/2010/wordprocessingGroup" xmlns:wpi="http://schemas.microsoft.com/office/word/2010/wordprocessingInk" xmlns:wne="http://schemas.microsoft.com/office/word/2006/wordml" xmlns:wps="http://schemas.microsoft.com/office/word/2010/wordprocessingShape" mc:Ignorable="w14 w15 w16se w16cid w16 w16cex w16sdtdh w16sdtfl w16du wp14">
   <w:abstractNum w:abstractNumId="0" w15:restartNumberingAfterBreak="0">
+    <w:nsid w:val="065805B6"/>
+    <w:multiLevelType w:val="multilevel"/>
+    <w:tmpl w:val="A96E712E"/>
+    <w:lvl w:ilvl="0">
+      <w:start w:val="1"/>
+      <w:numFmt w:val="bullet"/>
+      <w:lvlText w:val=""/>
+      <w:lvlJc w:val="left"/>
+      <w:pPr>
+        <w:tabs>
+          <w:tab w:val="num" w:pos="720"/>
+        </w:tabs>
+        <w:ind w:left="720" w:hanging="360"/>
+      </w:pPr>
+      <w:rPr>
+        <w:rFonts w:ascii="Symbol" w:hAnsi="Symbol" w:hint="default"/>
+        <w:sz w:val="20"/>
+      </w:rPr>
+    </w:lvl>
+    <w:lvl w:ilvl="1" w:tentative="1">
+      <w:start w:val="1"/>
+      <w:numFmt w:val="bullet"/>
+      <w:lvlText w:val="o"/>
+      <w:lvlJc w:val="left"/>
+      <w:pPr>
+        <w:tabs>
+          <w:tab w:val="num" w:pos="1440"/>
+        </w:tabs>
+        <w:ind w:left="1440" w:hanging="360"/>
+      </w:pPr>
+      <w:rPr>
+        <w:rFonts w:ascii="Courier New" w:hAnsi="Courier New" w:hint="default"/>
+        <w:sz w:val="20"/>
+      </w:rPr>
+    </w:lvl>
+    <w:lvl w:ilvl="2" w:tentative="1">
+      <w:start w:val="1"/>
+      <w:numFmt w:val="bullet"/>
+      <w:lvlText w:val=""/>
+      <w:lvlJc w:val="left"/>
+      <w:pPr>
+        <w:tabs>
+          <w:tab w:val="num" w:pos="2160"/>
+        </w:tabs>
+        <w:ind w:left="2160" w:hanging="360"/>
+      </w:pPr>
+      <w:rPr>
+        <w:rFonts w:ascii="Wingdings" w:hAnsi="Wingdings" w:hint="default"/>
+        <w:sz w:val="20"/>
+      </w:rPr>
+    </w:lvl>
+    <w:lvl w:ilvl="3" w:tentative="1">
+      <w:start w:val="1"/>
+      <w:numFmt w:val="bullet"/>
+      <w:lvlText w:val=""/>
+      <w:lvlJc w:val="left"/>
+      <w:pPr>
+        <w:tabs>
+          <w:tab w:val="num" w:pos="2880"/>
+        </w:tabs>
+        <w:ind w:left="2880" w:hanging="360"/>
+      </w:pPr>
+      <w:rPr>
+        <w:rFonts w:ascii="Wingdings" w:hAnsi="Wingdings" w:hint="default"/>
+        <w:sz w:val="20"/>
+      </w:rPr>
+    </w:lvl>
+    <w:lvl w:ilvl="4" w:tentative="1">
+      <w:start w:val="1"/>
+      <w:numFmt w:val="bullet"/>
+      <w:lvlText w:val=""/>
+      <w:lvlJc w:val="left"/>
+      <w:pPr>
+        <w:tabs>
+          <w:tab w:val="num" w:pos="3600"/>
+        </w:tabs>
+        <w:ind w:left="3600" w:hanging="360"/>
+      </w:pPr>
+      <w:rPr>
+        <w:rFonts w:ascii="Wingdings" w:hAnsi="Wingdings" w:hint="default"/>
+        <w:sz w:val="20"/>
+      </w:rPr>
+    </w:lvl>
+    <w:lvl w:ilvl="5" w:tentative="1">
+      <w:start w:val="1"/>
+      <w:numFmt w:val="bullet"/>
+      <w:lvlText w:val=""/>
+      <w:lvlJc w:val="left"/>
+      <w:pPr>
+        <w:tabs>
+          <w:tab w:val="num" w:pos="4320"/>
+        </w:tabs>
+        <w:ind w:left="4320" w:hanging="360"/>
+      </w:pPr>
+      <w:rPr>
+        <w:rFonts w:ascii="Wingdings" w:hAnsi="Wingdings" w:hint="default"/>
+        <w:sz w:val="20"/>
+      </w:rPr>
+    </w:lvl>
+    <w:lvl w:ilvl="6" w:tentative="1">
+      <w:start w:val="1"/>
+      <w:numFmt w:val="bullet"/>
+      <w:lvlText w:val=""/>
+      <w:lvlJc w:val="left"/>
+      <w:pPr>
+        <w:tabs>
+          <w:tab w:val="num" w:pos="5040"/>
+        </w:tabs>
+        <w:ind w:left="5040" w:hanging="360"/>
+      </w:pPr>
+      <w:rPr>
+        <w:rFonts w:ascii="Wingdings" w:hAnsi="Wingdings" w:hint="default"/>
+        <w:sz w:val="20"/>
+      </w:rPr>
+    </w:lvl>
+    <w:lvl w:ilvl="7" w:tentative="1">
+      <w:start w:val="1"/>
+      <w:numFmt w:val="bullet"/>
+      <w:lvlText w:val=""/>
+      <w:lvlJc w:val="left"/>
+      <w:pPr>
+        <w:tabs>
+          <w:tab w:val="num" w:pos="5760"/>
+        </w:tabs>
+        <w:ind w:left="5760" w:hanging="360"/>
+      </w:pPr>
+      <w:rPr>
+        <w:rFonts w:ascii="Wingdings" w:hAnsi="Wingdings" w:hint="default"/>
+        <w:sz w:val="20"/>
+      </w:rPr>
+    </w:lvl>
+    <w:lvl w:ilvl="8" w:tentative="1">
+      <w:start w:val="1"/>
+      <w:numFmt w:val="bullet"/>
+      <w:lvlText w:val=""/>
+      <w:lvlJc w:val="left"/>
+      <w:pPr>
+        <w:tabs>
+          <w:tab w:val="num" w:pos="6480"/>
+        </w:tabs>
+        <w:ind w:left="6480" w:hanging="360"/>
+      </w:pPr>
+      <w:rPr>
+        <w:rFonts w:ascii="Wingdings" w:hAnsi="Wingdings" w:hint="default"/>
+        <w:sz w:val="20"/>
+      </w:rPr>
+    </w:lvl>
+  </w:abstractNum>
+  <w:abstractNum w:abstractNumId="1" w15:restartNumberingAfterBreak="0">
     <w:nsid w:val="2D537D0F"/>
     <w:multiLevelType w:val="multilevel"/>
     <w:tmpl w:val="1536FAA4"/>
@@ -4574,7 +5156,156 @@
       </w:pPr>
     </w:lvl>
   </w:abstractNum>
-  <w:abstractNum w:abstractNumId="1" w15:restartNumberingAfterBreak="0">
+  <w:abstractNum w:abstractNumId="2" w15:restartNumberingAfterBreak="0">
+    <w:nsid w:val="30270288"/>
+    <w:multiLevelType w:val="multilevel"/>
+    <w:tmpl w:val="A8507A50"/>
+    <w:lvl w:ilvl="0">
+      <w:start w:val="1"/>
+      <w:numFmt w:val="bullet"/>
+      <w:lvlText w:val=""/>
+      <w:lvlJc w:val="left"/>
+      <w:pPr>
+        <w:tabs>
+          <w:tab w:val="num" w:pos="720"/>
+        </w:tabs>
+        <w:ind w:left="720" w:hanging="360"/>
+      </w:pPr>
+      <w:rPr>
+        <w:rFonts w:ascii="Symbol" w:hAnsi="Symbol" w:hint="default"/>
+        <w:sz w:val="20"/>
+      </w:rPr>
+    </w:lvl>
+    <w:lvl w:ilvl="1" w:tentative="1">
+      <w:start w:val="1"/>
+      <w:numFmt w:val="bullet"/>
+      <w:lvlText w:val="o"/>
+      <w:lvlJc w:val="left"/>
+      <w:pPr>
+        <w:tabs>
+          <w:tab w:val="num" w:pos="1440"/>
+        </w:tabs>
+        <w:ind w:left="1440" w:hanging="360"/>
+      </w:pPr>
+      <w:rPr>
+        <w:rFonts w:ascii="Courier New" w:hAnsi="Courier New" w:hint="default"/>
+        <w:sz w:val="20"/>
+      </w:rPr>
+    </w:lvl>
+    <w:lvl w:ilvl="2" w:tentative="1">
+      <w:start w:val="1"/>
+      <w:numFmt w:val="bullet"/>
+      <w:lvlText w:val=""/>
+      <w:lvlJc w:val="left"/>
+      <w:pPr>
+        <w:tabs>
+          <w:tab w:val="num" w:pos="2160"/>
+        </w:tabs>
+        <w:ind w:left="2160" w:hanging="360"/>
+      </w:pPr>
+      <w:rPr>
+        <w:rFonts w:ascii="Wingdings" w:hAnsi="Wingdings" w:hint="default"/>
+        <w:sz w:val="20"/>
+      </w:rPr>
+    </w:lvl>
+    <w:lvl w:ilvl="3" w:tentative="1">
+      <w:start w:val="1"/>
+      <w:numFmt w:val="bullet"/>
+      <w:lvlText w:val=""/>
+      <w:lvlJc w:val="left"/>
+      <w:pPr>
+        <w:tabs>
+          <w:tab w:val="num" w:pos="2880"/>
+        </w:tabs>
+        <w:ind w:left="2880" w:hanging="360"/>
+      </w:pPr>
+      <w:rPr>
+        <w:rFonts w:ascii="Wingdings" w:hAnsi="Wingdings" w:hint="default"/>
+        <w:sz w:val="20"/>
+      </w:rPr>
+    </w:lvl>
+    <w:lvl w:ilvl="4" w:tentative="1">
+      <w:start w:val="1"/>
+      <w:numFmt w:val="bullet"/>
+      <w:lvlText w:val=""/>
+      <w:lvlJc w:val="left"/>
+      <w:pPr>
+        <w:tabs>
+          <w:tab w:val="num" w:pos="3600"/>
+        </w:tabs>
+        <w:ind w:left="3600" w:hanging="360"/>
+      </w:pPr>
+      <w:rPr>
+        <w:rFonts w:ascii="Wingdings" w:hAnsi="Wingdings" w:hint="default"/>
+        <w:sz w:val="20"/>
+      </w:rPr>
+    </w:lvl>
+    <w:lvl w:ilvl="5" w:tentative="1">
+      <w:start w:val="1"/>
+      <w:numFmt w:val="bullet"/>
+      <w:lvlText w:val=""/>
+      <w:lvlJc w:val="left"/>
+      <w:pPr>
+        <w:tabs>
+          <w:tab w:val="num" w:pos="4320"/>
+        </w:tabs>
+        <w:ind w:left="4320" w:hanging="360"/>
+      </w:pPr>
+      <w:rPr>
+        <w:rFonts w:ascii="Wingdings" w:hAnsi="Wingdings" w:hint="default"/>
+        <w:sz w:val="20"/>
+      </w:rPr>
+    </w:lvl>
+    <w:lvl w:ilvl="6" w:tentative="1">
+      <w:start w:val="1"/>
+      <w:numFmt w:val="bullet"/>
+      <w:lvlText w:val=""/>
+      <w:lvlJc w:val="left"/>
+      <w:pPr>
+        <w:tabs>
+          <w:tab w:val="num" w:pos="5040"/>
+        </w:tabs>
+        <w:ind w:left="5040" w:hanging="360"/>
+      </w:pPr>
+      <w:rPr>
+        <w:rFonts w:ascii="Wingdings" w:hAnsi="Wingdings" w:hint="default"/>
+        <w:sz w:val="20"/>
+      </w:rPr>
+    </w:lvl>
+    <w:lvl w:ilvl="7" w:tentative="1">
+      <w:start w:val="1"/>
+      <w:numFmt w:val="bullet"/>
+      <w:lvlText w:val=""/>
+      <w:lvlJc w:val="left"/>
+      <w:pPr>
+        <w:tabs>
+          <w:tab w:val="num" w:pos="5760"/>
+        </w:tabs>
+        <w:ind w:left="5760" w:hanging="360"/>
+      </w:pPr>
+      <w:rPr>
+        <w:rFonts w:ascii="Wingdings" w:hAnsi="Wingdings" w:hint="default"/>
+        <w:sz w:val="20"/>
+      </w:rPr>
+    </w:lvl>
+    <w:lvl w:ilvl="8" w:tentative="1">
+      <w:start w:val="1"/>
+      <w:numFmt w:val="bullet"/>
+      <w:lvlText w:val=""/>
+      <w:lvlJc w:val="left"/>
+      <w:pPr>
+        <w:tabs>
+          <w:tab w:val="num" w:pos="6480"/>
+        </w:tabs>
+        <w:ind w:left="6480" w:hanging="360"/>
+      </w:pPr>
+      <w:rPr>
+        <w:rFonts w:ascii="Wingdings" w:hAnsi="Wingdings" w:hint="default"/>
+        <w:sz w:val="20"/>
+      </w:rPr>
+    </w:lvl>
+  </w:abstractNum>
+  <w:abstractNum w:abstractNumId="3" w15:restartNumberingAfterBreak="0">
     <w:nsid w:val="3BD76948"/>
     <w:multiLevelType w:val="hybridMultilevel"/>
     <w:tmpl w:val="18666E64"/>
@@ -4663,7 +5394,7 @@
       </w:pPr>
     </w:lvl>
   </w:abstractNum>
-  <w:abstractNum w:abstractNumId="2" w15:restartNumberingAfterBreak="0">
+  <w:abstractNum w:abstractNumId="4" w15:restartNumberingAfterBreak="0">
     <w:nsid w:val="3C206750"/>
     <w:multiLevelType w:val="multilevel"/>
     <w:tmpl w:val="5E52D378"/>
@@ -4776,7 +5507,7 @@
       </w:pPr>
     </w:lvl>
   </w:abstractNum>
-  <w:abstractNum w:abstractNumId="3" w15:restartNumberingAfterBreak="0">
+  <w:abstractNum w:abstractNumId="5" w15:restartNumberingAfterBreak="0">
     <w:nsid w:val="3C430B68"/>
     <w:multiLevelType w:val="multilevel"/>
     <w:tmpl w:val="A54837AE"/>
@@ -4925,7 +5656,7 @@
       </w:rPr>
     </w:lvl>
   </w:abstractNum>
-  <w:abstractNum w:abstractNumId="4" w15:restartNumberingAfterBreak="0">
+  <w:abstractNum w:abstractNumId="6" w15:restartNumberingAfterBreak="0">
     <w:nsid w:val="47CF03E2"/>
     <w:multiLevelType w:val="hybridMultilevel"/>
     <w:tmpl w:val="E144B06C"/>
@@ -5014,7 +5745,7 @@
       </w:pPr>
     </w:lvl>
   </w:abstractNum>
-  <w:abstractNum w:abstractNumId="5" w15:restartNumberingAfterBreak="0">
+  <w:abstractNum w:abstractNumId="7" w15:restartNumberingAfterBreak="0">
     <w:nsid w:val="4B775B9F"/>
     <w:multiLevelType w:val="multilevel"/>
     <w:tmpl w:val="59F0DFC0"/>
@@ -5163,7 +5894,7 @@
       </w:rPr>
     </w:lvl>
   </w:abstractNum>
-  <w:abstractNum w:abstractNumId="6" w15:restartNumberingAfterBreak="0">
+  <w:abstractNum w:abstractNumId="8" w15:restartNumberingAfterBreak="0">
     <w:nsid w:val="4CC853E6"/>
     <w:multiLevelType w:val="hybridMultilevel"/>
     <w:tmpl w:val="EE5A802A"/>
@@ -5252,7 +5983,7 @@
       </w:pPr>
     </w:lvl>
   </w:abstractNum>
-  <w:abstractNum w:abstractNumId="7" w15:restartNumberingAfterBreak="0">
+  <w:abstractNum w:abstractNumId="9" w15:restartNumberingAfterBreak="0">
     <w:nsid w:val="5024467E"/>
     <w:multiLevelType w:val="multilevel"/>
     <w:tmpl w:val="47C2696C"/>
@@ -5365,7 +6096,7 @@
       </w:pPr>
     </w:lvl>
   </w:abstractNum>
-  <w:abstractNum w:abstractNumId="8" w15:restartNumberingAfterBreak="0">
+  <w:abstractNum w:abstractNumId="10" w15:restartNumberingAfterBreak="0">
     <w:nsid w:val="52037C0F"/>
     <w:multiLevelType w:val="hybridMultilevel"/>
     <w:tmpl w:val="79E831D6"/>
@@ -5454,7 +6185,7 @@
       </w:pPr>
     </w:lvl>
   </w:abstractNum>
-  <w:abstractNum w:abstractNumId="9" w15:restartNumberingAfterBreak="0">
+  <w:abstractNum w:abstractNumId="11" w15:restartNumberingAfterBreak="0">
     <w:nsid w:val="57773782"/>
     <w:multiLevelType w:val="multilevel"/>
     <w:tmpl w:val="5CDCD046"/>
@@ -5567,7 +6298,156 @@
       </w:pPr>
     </w:lvl>
   </w:abstractNum>
-  <w:abstractNum w:abstractNumId="10" w15:restartNumberingAfterBreak="0">
+  <w:abstractNum w:abstractNumId="12" w15:restartNumberingAfterBreak="0">
+    <w:nsid w:val="6388121E"/>
+    <w:multiLevelType w:val="multilevel"/>
+    <w:tmpl w:val="9B3E0B22"/>
+    <w:lvl w:ilvl="0">
+      <w:start w:val="1"/>
+      <w:numFmt w:val="bullet"/>
+      <w:lvlText w:val=""/>
+      <w:lvlJc w:val="left"/>
+      <w:pPr>
+        <w:tabs>
+          <w:tab w:val="num" w:pos="720"/>
+        </w:tabs>
+        <w:ind w:left="720" w:hanging="360"/>
+      </w:pPr>
+      <w:rPr>
+        <w:rFonts w:ascii="Symbol" w:hAnsi="Symbol" w:hint="default"/>
+        <w:sz w:val="20"/>
+      </w:rPr>
+    </w:lvl>
+    <w:lvl w:ilvl="1" w:tentative="1">
+      <w:start w:val="1"/>
+      <w:numFmt w:val="bullet"/>
+      <w:lvlText w:val="o"/>
+      <w:lvlJc w:val="left"/>
+      <w:pPr>
+        <w:tabs>
+          <w:tab w:val="num" w:pos="1440"/>
+        </w:tabs>
+        <w:ind w:left="1440" w:hanging="360"/>
+      </w:pPr>
+      <w:rPr>
+        <w:rFonts w:ascii="Courier New" w:hAnsi="Courier New" w:hint="default"/>
+        <w:sz w:val="20"/>
+      </w:rPr>
+    </w:lvl>
+    <w:lvl w:ilvl="2" w:tentative="1">
+      <w:start w:val="1"/>
+      <w:numFmt w:val="bullet"/>
+      <w:lvlText w:val=""/>
+      <w:lvlJc w:val="left"/>
+      <w:pPr>
+        <w:tabs>
+          <w:tab w:val="num" w:pos="2160"/>
+        </w:tabs>
+        <w:ind w:left="2160" w:hanging="360"/>
+      </w:pPr>
+      <w:rPr>
+        <w:rFonts w:ascii="Wingdings" w:hAnsi="Wingdings" w:hint="default"/>
+        <w:sz w:val="20"/>
+      </w:rPr>
+    </w:lvl>
+    <w:lvl w:ilvl="3" w:tentative="1">
+      <w:start w:val="1"/>
+      <w:numFmt w:val="bullet"/>
+      <w:lvlText w:val=""/>
+      <w:lvlJc w:val="left"/>
+      <w:pPr>
+        <w:tabs>
+          <w:tab w:val="num" w:pos="2880"/>
+        </w:tabs>
+        <w:ind w:left="2880" w:hanging="360"/>
+      </w:pPr>
+      <w:rPr>
+        <w:rFonts w:ascii="Wingdings" w:hAnsi="Wingdings" w:hint="default"/>
+        <w:sz w:val="20"/>
+      </w:rPr>
+    </w:lvl>
+    <w:lvl w:ilvl="4" w:tentative="1">
+      <w:start w:val="1"/>
+      <w:numFmt w:val="bullet"/>
+      <w:lvlText w:val=""/>
+      <w:lvlJc w:val="left"/>
+      <w:pPr>
+        <w:tabs>
+          <w:tab w:val="num" w:pos="3600"/>
+        </w:tabs>
+        <w:ind w:left="3600" w:hanging="360"/>
+      </w:pPr>
+      <w:rPr>
+        <w:rFonts w:ascii="Wingdings" w:hAnsi="Wingdings" w:hint="default"/>
+        <w:sz w:val="20"/>
+      </w:rPr>
+    </w:lvl>
+    <w:lvl w:ilvl="5" w:tentative="1">
+      <w:start w:val="1"/>
+      <w:numFmt w:val="bullet"/>
+      <w:lvlText w:val=""/>
+      <w:lvlJc w:val="left"/>
+      <w:pPr>
+        <w:tabs>
+          <w:tab w:val="num" w:pos="4320"/>
+        </w:tabs>
+        <w:ind w:left="4320" w:hanging="360"/>
+      </w:pPr>
+      <w:rPr>
+        <w:rFonts w:ascii="Wingdings" w:hAnsi="Wingdings" w:hint="default"/>
+        <w:sz w:val="20"/>
+      </w:rPr>
+    </w:lvl>
+    <w:lvl w:ilvl="6" w:tentative="1">
+      <w:start w:val="1"/>
+      <w:numFmt w:val="bullet"/>
+      <w:lvlText w:val=""/>
+      <w:lvlJc w:val="left"/>
+      <w:pPr>
+        <w:tabs>
+          <w:tab w:val="num" w:pos="5040"/>
+        </w:tabs>
+        <w:ind w:left="5040" w:hanging="360"/>
+      </w:pPr>
+      <w:rPr>
+        <w:rFonts w:ascii="Wingdings" w:hAnsi="Wingdings" w:hint="default"/>
+        <w:sz w:val="20"/>
+      </w:rPr>
+    </w:lvl>
+    <w:lvl w:ilvl="7" w:tentative="1">
+      <w:start w:val="1"/>
+      <w:numFmt w:val="bullet"/>
+      <w:lvlText w:val=""/>
+      <w:lvlJc w:val="left"/>
+      <w:pPr>
+        <w:tabs>
+          <w:tab w:val="num" w:pos="5760"/>
+        </w:tabs>
+        <w:ind w:left="5760" w:hanging="360"/>
+      </w:pPr>
+      <w:rPr>
+        <w:rFonts w:ascii="Wingdings" w:hAnsi="Wingdings" w:hint="default"/>
+        <w:sz w:val="20"/>
+      </w:rPr>
+    </w:lvl>
+    <w:lvl w:ilvl="8" w:tentative="1">
+      <w:start w:val="1"/>
+      <w:numFmt w:val="bullet"/>
+      <w:lvlText w:val=""/>
+      <w:lvlJc w:val="left"/>
+      <w:pPr>
+        <w:tabs>
+          <w:tab w:val="num" w:pos="6480"/>
+        </w:tabs>
+        <w:ind w:left="6480" w:hanging="360"/>
+      </w:pPr>
+      <w:rPr>
+        <w:rFonts w:ascii="Wingdings" w:hAnsi="Wingdings" w:hint="default"/>
+        <w:sz w:val="20"/>
+      </w:rPr>
+    </w:lvl>
+  </w:abstractNum>
+  <w:abstractNum w:abstractNumId="13" w15:restartNumberingAfterBreak="0">
     <w:nsid w:val="64CC43D4"/>
     <w:multiLevelType w:val="multilevel"/>
     <w:tmpl w:val="A4C0F546"/>
@@ -5680,7 +6560,7 @@
       </w:pPr>
     </w:lvl>
   </w:abstractNum>
-  <w:abstractNum w:abstractNumId="11" w15:restartNumberingAfterBreak="0">
+  <w:abstractNum w:abstractNumId="14" w15:restartNumberingAfterBreak="0">
     <w:nsid w:val="657807C3"/>
     <w:multiLevelType w:val="multilevel"/>
     <w:tmpl w:val="FFCE35C8"/>
@@ -5793,7 +6673,7 @@
       </w:pPr>
     </w:lvl>
   </w:abstractNum>
-  <w:abstractNum w:abstractNumId="12" w15:restartNumberingAfterBreak="0">
+  <w:abstractNum w:abstractNumId="15" w15:restartNumberingAfterBreak="0">
     <w:nsid w:val="697D2ACE"/>
     <w:multiLevelType w:val="multilevel"/>
     <w:tmpl w:val="9CD40468"/>
@@ -5942,7 +6822,7 @@
       </w:rPr>
     </w:lvl>
   </w:abstractNum>
-  <w:abstractNum w:abstractNumId="13" w15:restartNumberingAfterBreak="0">
+  <w:abstractNum w:abstractNumId="16" w15:restartNumberingAfterBreak="0">
     <w:nsid w:val="6C9B3408"/>
     <w:multiLevelType w:val="hybridMultilevel"/>
     <w:tmpl w:val="8020F4D2"/>
@@ -6031,47 +6911,208 @@
       </w:pPr>
     </w:lvl>
   </w:abstractNum>
+  <w:abstractNum w:abstractNumId="17" w15:restartNumberingAfterBreak="0">
+    <w:nsid w:val="71261FB1"/>
+    <w:multiLevelType w:val="multilevel"/>
+    <w:tmpl w:val="E9DA0906"/>
+    <w:lvl w:ilvl="0">
+      <w:start w:val="1"/>
+      <w:numFmt w:val="bullet"/>
+      <w:lvlText w:val=""/>
+      <w:lvlJc w:val="left"/>
+      <w:pPr>
+        <w:tabs>
+          <w:tab w:val="num" w:pos="720"/>
+        </w:tabs>
+        <w:ind w:left="720" w:hanging="360"/>
+      </w:pPr>
+      <w:rPr>
+        <w:rFonts w:ascii="Symbol" w:hAnsi="Symbol" w:hint="default"/>
+        <w:sz w:val="20"/>
+      </w:rPr>
+    </w:lvl>
+    <w:lvl w:ilvl="1" w:tentative="1">
+      <w:start w:val="1"/>
+      <w:numFmt w:val="bullet"/>
+      <w:lvlText w:val="o"/>
+      <w:lvlJc w:val="left"/>
+      <w:pPr>
+        <w:tabs>
+          <w:tab w:val="num" w:pos="1440"/>
+        </w:tabs>
+        <w:ind w:left="1440" w:hanging="360"/>
+      </w:pPr>
+      <w:rPr>
+        <w:rFonts w:ascii="Courier New" w:hAnsi="Courier New" w:hint="default"/>
+        <w:sz w:val="20"/>
+      </w:rPr>
+    </w:lvl>
+    <w:lvl w:ilvl="2" w:tentative="1">
+      <w:start w:val="1"/>
+      <w:numFmt w:val="bullet"/>
+      <w:lvlText w:val=""/>
+      <w:lvlJc w:val="left"/>
+      <w:pPr>
+        <w:tabs>
+          <w:tab w:val="num" w:pos="2160"/>
+        </w:tabs>
+        <w:ind w:left="2160" w:hanging="360"/>
+      </w:pPr>
+      <w:rPr>
+        <w:rFonts w:ascii="Wingdings" w:hAnsi="Wingdings" w:hint="default"/>
+        <w:sz w:val="20"/>
+      </w:rPr>
+    </w:lvl>
+    <w:lvl w:ilvl="3" w:tentative="1">
+      <w:start w:val="1"/>
+      <w:numFmt w:val="bullet"/>
+      <w:lvlText w:val=""/>
+      <w:lvlJc w:val="left"/>
+      <w:pPr>
+        <w:tabs>
+          <w:tab w:val="num" w:pos="2880"/>
+        </w:tabs>
+        <w:ind w:left="2880" w:hanging="360"/>
+      </w:pPr>
+      <w:rPr>
+        <w:rFonts w:ascii="Wingdings" w:hAnsi="Wingdings" w:hint="default"/>
+        <w:sz w:val="20"/>
+      </w:rPr>
+    </w:lvl>
+    <w:lvl w:ilvl="4" w:tentative="1">
+      <w:start w:val="1"/>
+      <w:numFmt w:val="bullet"/>
+      <w:lvlText w:val=""/>
+      <w:lvlJc w:val="left"/>
+      <w:pPr>
+        <w:tabs>
+          <w:tab w:val="num" w:pos="3600"/>
+        </w:tabs>
+        <w:ind w:left="3600" w:hanging="360"/>
+      </w:pPr>
+      <w:rPr>
+        <w:rFonts w:ascii="Wingdings" w:hAnsi="Wingdings" w:hint="default"/>
+        <w:sz w:val="20"/>
+      </w:rPr>
+    </w:lvl>
+    <w:lvl w:ilvl="5" w:tentative="1">
+      <w:start w:val="1"/>
+      <w:numFmt w:val="bullet"/>
+      <w:lvlText w:val=""/>
+      <w:lvlJc w:val="left"/>
+      <w:pPr>
+        <w:tabs>
+          <w:tab w:val="num" w:pos="4320"/>
+        </w:tabs>
+        <w:ind w:left="4320" w:hanging="360"/>
+      </w:pPr>
+      <w:rPr>
+        <w:rFonts w:ascii="Wingdings" w:hAnsi="Wingdings" w:hint="default"/>
+        <w:sz w:val="20"/>
+      </w:rPr>
+    </w:lvl>
+    <w:lvl w:ilvl="6" w:tentative="1">
+      <w:start w:val="1"/>
+      <w:numFmt w:val="bullet"/>
+      <w:lvlText w:val=""/>
+      <w:lvlJc w:val="left"/>
+      <w:pPr>
+        <w:tabs>
+          <w:tab w:val="num" w:pos="5040"/>
+        </w:tabs>
+        <w:ind w:left="5040" w:hanging="360"/>
+      </w:pPr>
+      <w:rPr>
+        <w:rFonts w:ascii="Wingdings" w:hAnsi="Wingdings" w:hint="default"/>
+        <w:sz w:val="20"/>
+      </w:rPr>
+    </w:lvl>
+    <w:lvl w:ilvl="7" w:tentative="1">
+      <w:start w:val="1"/>
+      <w:numFmt w:val="bullet"/>
+      <w:lvlText w:val=""/>
+      <w:lvlJc w:val="left"/>
+      <w:pPr>
+        <w:tabs>
+          <w:tab w:val="num" w:pos="5760"/>
+        </w:tabs>
+        <w:ind w:left="5760" w:hanging="360"/>
+      </w:pPr>
+      <w:rPr>
+        <w:rFonts w:ascii="Wingdings" w:hAnsi="Wingdings" w:hint="default"/>
+        <w:sz w:val="20"/>
+      </w:rPr>
+    </w:lvl>
+    <w:lvl w:ilvl="8" w:tentative="1">
+      <w:start w:val="1"/>
+      <w:numFmt w:val="bullet"/>
+      <w:lvlText w:val=""/>
+      <w:lvlJc w:val="left"/>
+      <w:pPr>
+        <w:tabs>
+          <w:tab w:val="num" w:pos="6480"/>
+        </w:tabs>
+        <w:ind w:left="6480" w:hanging="360"/>
+      </w:pPr>
+      <w:rPr>
+        <w:rFonts w:ascii="Wingdings" w:hAnsi="Wingdings" w:hint="default"/>
+        <w:sz w:val="20"/>
+      </w:rPr>
+    </w:lvl>
+  </w:abstractNum>
   <w:num w:numId="1" w16cid:durableId="1559707127">
+    <w:abstractNumId w:val="8"/>
+  </w:num>
+  <w:num w:numId="2" w16cid:durableId="1412505344">
+    <w:abstractNumId w:val="16"/>
+  </w:num>
+  <w:num w:numId="3" w16cid:durableId="1720130656">
+    <w:abstractNumId w:val="10"/>
+  </w:num>
+  <w:num w:numId="4" w16cid:durableId="398478300">
+    <w:abstractNumId w:val="1"/>
+  </w:num>
+  <w:num w:numId="5" w16cid:durableId="1594166929">
+    <w:abstractNumId w:val="14"/>
+  </w:num>
+  <w:num w:numId="6" w16cid:durableId="2074574558">
     <w:abstractNumId w:val="6"/>
   </w:num>
-  <w:num w:numId="2" w16cid:durableId="1412505344">
+  <w:num w:numId="7" w16cid:durableId="25328626">
     <w:abstractNumId w:val="13"/>
   </w:num>
-  <w:num w:numId="3" w16cid:durableId="1720130656">
-    <w:abstractNumId w:val="8"/>
+  <w:num w:numId="8" w16cid:durableId="1557087885">
+    <w:abstractNumId w:val="11"/>
   </w:num>
-  <w:num w:numId="4" w16cid:durableId="398478300">
+  <w:num w:numId="9" w16cid:durableId="725224153">
+    <w:abstractNumId w:val="4"/>
+  </w:num>
+  <w:num w:numId="10" w16cid:durableId="1912740116">
+    <w:abstractNumId w:val="9"/>
+  </w:num>
+  <w:num w:numId="11" w16cid:durableId="904074126">
+    <w:abstractNumId w:val="7"/>
+  </w:num>
+  <w:num w:numId="12" w16cid:durableId="692606710">
+    <w:abstractNumId w:val="15"/>
+  </w:num>
+  <w:num w:numId="13" w16cid:durableId="1740976664">
+    <w:abstractNumId w:val="3"/>
+  </w:num>
+  <w:num w:numId="14" w16cid:durableId="772166234">
+    <w:abstractNumId w:val="5"/>
+  </w:num>
+  <w:num w:numId="15" w16cid:durableId="902183955">
     <w:abstractNumId w:val="0"/>
   </w:num>
-  <w:num w:numId="5" w16cid:durableId="1594166929">
-    <w:abstractNumId w:val="11"/>
+  <w:num w:numId="16" w16cid:durableId="1200631374">
+    <w:abstractNumId w:val="12"/>
   </w:num>
-  <w:num w:numId="6" w16cid:durableId="2074574558">
-    <w:abstractNumId w:val="4"/>
-  </w:num>
-  <w:num w:numId="7" w16cid:durableId="25328626">
-    <w:abstractNumId w:val="10"/>
-  </w:num>
-  <w:num w:numId="8" w16cid:durableId="1557087885">
-    <w:abstractNumId w:val="9"/>
-  </w:num>
-  <w:num w:numId="9" w16cid:durableId="725224153">
+  <w:num w:numId="17" w16cid:durableId="1567450560">
     <w:abstractNumId w:val="2"/>
   </w:num>
-  <w:num w:numId="10" w16cid:durableId="1912740116">
-    <w:abstractNumId w:val="7"/>
-  </w:num>
-  <w:num w:numId="11" w16cid:durableId="904074126">
-    <w:abstractNumId w:val="5"/>
-  </w:num>
-  <w:num w:numId="12" w16cid:durableId="692606710">
-    <w:abstractNumId w:val="12"/>
-  </w:num>
-  <w:num w:numId="13" w16cid:durableId="1740976664">
-    <w:abstractNumId w:val="1"/>
-  </w:num>
-  <w:num w:numId="14" w16cid:durableId="772166234">
-    <w:abstractNumId w:val="3"/>
+  <w:num w:numId="18" w16cid:durableId="1153185035">
+    <w:abstractNumId w:val="17"/>
   </w:num>
 </w:numbering>
 </file>
@@ -6476,7 +7517,7 @@
   <w:style w:type="paragraph" w:default="1" w:styleId="Normal">
     <w:name w:val="Normal"/>
     <w:qFormat/>
-    <w:rsid w:val="00EE7AB4"/>
+    <w:rsid w:val="005B0A40"/>
   </w:style>
   <w:style w:type="character" w:default="1" w:styleId="DefaultParagraphFont">
     <w:name w:val="Default Paragraph Font"/>

</xml_diff>

<commit_message>
Week 10 Lab Requirement
</commit_message>
<xml_diff>
--- a/LABlogbook.docx
+++ b/LABlogbook.docx
@@ -4394,6 +4394,7 @@
         <w:rPr>
           <w:b/>
           <w:bCs/>
+          <w:noProof/>
           <w:sz w:val="44"/>
           <w:szCs w:val="44"/>
           <w:lang w:val="de-DE"/>
@@ -4455,14 +4456,7 @@
           <w:sz w:val="32"/>
           <w:szCs w:val="32"/>
         </w:rPr>
-        <w:t>2</w:t>
-      </w:r>
-      <w:r>
-        <w:rPr>
-          <w:sz w:val="32"/>
-          <w:szCs w:val="32"/>
-        </w:rPr>
-        <w:t xml:space="preserve">. </w:t>
+        <w:t xml:space="preserve">2. </w:t>
       </w:r>
       <w:r>
         <w:rPr>
@@ -4497,6 +4491,7 @@
       </w:pPr>
       <w:r>
         <w:rPr>
+          <w:noProof/>
           <w:sz w:val="32"/>
           <w:szCs w:val="32"/>
         </w:rPr>
@@ -4590,14 +4585,7 @@
           <w:szCs w:val="32"/>
         </w:rPr>
         <w:lastRenderedPageBreak/>
-        <w:t>3</w:t>
-      </w:r>
-      <w:r>
-        <w:rPr>
-          <w:sz w:val="32"/>
-          <w:szCs w:val="32"/>
-        </w:rPr>
-        <w:t xml:space="preserve">. </w:t>
+        <w:t xml:space="preserve">3. </w:t>
       </w:r>
       <w:r>
         <w:rPr>
@@ -4632,6 +4620,7 @@
       </w:pPr>
       <w:r>
         <w:rPr>
+          <w:noProof/>
           <w:sz w:val="32"/>
           <w:szCs w:val="32"/>
         </w:rPr>
@@ -4708,14 +4697,7 @@
           <w:sz w:val="32"/>
           <w:szCs w:val="32"/>
         </w:rPr>
-        <w:t>4</w:t>
-      </w:r>
-      <w:r>
-        <w:rPr>
-          <w:sz w:val="32"/>
-          <w:szCs w:val="32"/>
-        </w:rPr>
-        <w:t xml:space="preserve">. </w:t>
+        <w:t xml:space="preserve">4. </w:t>
       </w:r>
       <w:r>
         <w:rPr>
@@ -4823,61 +4805,1023 @@
     </w:p>
     <w:p>
       <w:pPr>
-        <w:jc w:val="both"/>
-        <w:rPr>
-          <w:sz w:val="44"/>
-          <w:szCs w:val="44"/>
-          <w:u w:val="single"/>
+        <w:rPr>
+          <w:b/>
+          <w:bCs/>
+          <w:sz w:val="44"/>
+          <w:szCs w:val="44"/>
           <w:lang w:val="de-DE"/>
         </w:rPr>
       </w:pPr>
-    </w:p>
-    <w:p>
-      <w:pPr>
-        <w:jc w:val="both"/>
-        <w:rPr>
-          <w:sz w:val="44"/>
-          <w:szCs w:val="44"/>
-          <w:u w:val="single"/>
+      <w:r>
+        <w:rPr>
+          <w:b/>
+          <w:bCs/>
+          <w:sz w:val="44"/>
+          <w:szCs w:val="44"/>
           <w:lang w:val="de-DE"/>
         </w:rPr>
-      </w:pPr>
-      <w:r>
-        <w:rPr>
-          <w:sz w:val="44"/>
-          <w:szCs w:val="44"/>
-          <w:u w:val="single"/>
-          <w:lang w:val="de-DE"/>
-        </w:rPr>
+        <w:t>Task 1</w:t>
+      </w:r>
+    </w:p>
+    <w:p>
+      <w:pPr>
+        <w:rPr>
+          <w:b/>
+          <w:bCs/>
+          <w:sz w:val="32"/>
+          <w:szCs w:val="32"/>
+        </w:rPr>
+      </w:pPr>
+      <w:r>
+        <w:rPr>
+          <w:b/>
+          <w:bCs/>
+          <w:sz w:val="32"/>
+          <w:szCs w:val="32"/>
+        </w:rPr>
+        <w:t>1) Encoder Summary</w:t>
+      </w:r>
+    </w:p>
+    <w:p>
+      <w:pPr>
+        <w:rPr>
+          <w:b/>
+          <w:bCs/>
+          <w:sz w:val="44"/>
+          <w:szCs w:val="44"/>
+        </w:rPr>
+      </w:pPr>
+      <w:r>
+        <w:rPr>
+          <w:b/>
+          <w:bCs/>
+          <w:sz w:val="44"/>
+          <w:szCs w:val="44"/>
+        </w:rPr>
+        <w:drawing>
+          <wp:inline distT="0" distB="0" distL="0" distR="0" wp14:anchorId="3F7631D3" wp14:editId="106F96D4">
+            <wp:extent cx="5731510" cy="3373120"/>
+            <wp:effectExtent l="0" t="0" r="2540" b="0"/>
+            <wp:docPr id="757054578" name="Picture 1"/>
+            <wp:cNvGraphicFramePr>
+              <a:graphicFrameLocks xmlns:a="http://schemas.openxmlformats.org/drawingml/2006/main" noChangeAspect="1"/>
+            </wp:cNvGraphicFramePr>
+            <a:graphic xmlns:a="http://schemas.openxmlformats.org/drawingml/2006/main">
+              <a:graphicData uri="http://schemas.openxmlformats.org/drawingml/2006/picture">
+                <pic:pic xmlns:pic="http://schemas.openxmlformats.org/drawingml/2006/picture">
+                  <pic:nvPicPr>
+                    <pic:cNvPr id="757054578" name=""/>
+                    <pic:cNvPicPr/>
+                  </pic:nvPicPr>
+                  <pic:blipFill rotWithShape="1">
+                    <a:blip r:embed="rId52"/>
+                    <a:srcRect t="40194"/>
+                    <a:stretch>
+                      <a:fillRect/>
+                    </a:stretch>
+                  </pic:blipFill>
+                  <pic:spPr bwMode="auto">
+                    <a:xfrm>
+                      <a:off x="0" y="0"/>
+                      <a:ext cx="5731510" cy="3373120"/>
+                    </a:xfrm>
+                    <a:prstGeom prst="rect">
+                      <a:avLst/>
+                    </a:prstGeom>
+                    <a:ln>
+                      <a:noFill/>
+                    </a:ln>
+                    <a:extLst>
+                      <a:ext uri="{53640926-AAD7-44D8-BBD7-CCE9431645EC}">
+                        <a14:shadowObscured xmlns:a14="http://schemas.microsoft.com/office/drawing/2010/main"/>
+                      </a:ext>
+                    </a:extLst>
+                  </pic:spPr>
+                </pic:pic>
+              </a:graphicData>
+            </a:graphic>
+          </wp:inline>
+        </w:drawing>
+      </w:r>
+    </w:p>
+    <w:p>
+      <w:pPr>
+        <w:jc w:val="both"/>
+        <w:rPr>
+          <w:sz w:val="44"/>
+          <w:szCs w:val="44"/>
+          <w:u w:val="single"/>
+        </w:rPr>
+      </w:pPr>
+    </w:p>
+    <w:p>
+      <w:pPr>
+        <w:jc w:val="both"/>
+        <w:rPr>
+          <w:b/>
+          <w:bCs/>
+          <w:sz w:val="32"/>
+          <w:szCs w:val="32"/>
+        </w:rPr>
+      </w:pPr>
+      <w:r>
+        <w:rPr>
+          <w:b/>
+          <w:bCs/>
+          <w:sz w:val="32"/>
+          <w:szCs w:val="32"/>
+        </w:rPr>
+        <w:t>2)</w:t>
+      </w:r>
+      <w:r>
+        <w:rPr>
+          <w:b/>
+          <w:bCs/>
+          <w:sz w:val="32"/>
+          <w:szCs w:val="32"/>
+        </w:rPr>
+        <w:t xml:space="preserve"> D</w:t>
+      </w:r>
+      <w:r>
+        <w:rPr>
+          <w:b/>
+          <w:bCs/>
+          <w:sz w:val="32"/>
+          <w:szCs w:val="32"/>
+        </w:rPr>
+        <w:t>ecoder Summary</w:t>
+      </w:r>
+    </w:p>
+    <w:p>
+      <w:pPr>
+        <w:jc w:val="both"/>
+        <w:rPr>
+          <w:b/>
+          <w:bCs/>
+          <w:sz w:val="32"/>
+          <w:szCs w:val="32"/>
+        </w:rPr>
+      </w:pPr>
+      <w:r>
+        <w:rPr>
+          <w:b/>
+          <w:bCs/>
+          <w:sz w:val="32"/>
+          <w:szCs w:val="32"/>
+        </w:rPr>
+        <w:drawing>
+          <wp:inline distT="0" distB="0" distL="0" distR="0" wp14:anchorId="274F25D4" wp14:editId="4AB96BAF">
+            <wp:extent cx="5731510" cy="3014980"/>
+            <wp:effectExtent l="0" t="0" r="2540" b="0"/>
+            <wp:docPr id="640530285" name="Picture 1"/>
+            <wp:cNvGraphicFramePr>
+              <a:graphicFrameLocks xmlns:a="http://schemas.openxmlformats.org/drawingml/2006/main" noChangeAspect="1"/>
+            </wp:cNvGraphicFramePr>
+            <a:graphic xmlns:a="http://schemas.openxmlformats.org/drawingml/2006/main">
+              <a:graphicData uri="http://schemas.openxmlformats.org/drawingml/2006/picture">
+                <pic:pic xmlns:pic="http://schemas.openxmlformats.org/drawingml/2006/picture">
+                  <pic:nvPicPr>
+                    <pic:cNvPr id="640530285" name=""/>
+                    <pic:cNvPicPr/>
+                  </pic:nvPicPr>
+                  <pic:blipFill rotWithShape="1">
+                    <a:blip r:embed="rId53"/>
+                    <a:srcRect t="43328"/>
+                    <a:stretch>
+                      <a:fillRect/>
+                    </a:stretch>
+                  </pic:blipFill>
+                  <pic:spPr bwMode="auto">
+                    <a:xfrm>
+                      <a:off x="0" y="0"/>
+                      <a:ext cx="5731510" cy="3014980"/>
+                    </a:xfrm>
+                    <a:prstGeom prst="rect">
+                      <a:avLst/>
+                    </a:prstGeom>
+                    <a:ln>
+                      <a:noFill/>
+                    </a:ln>
+                    <a:extLst>
+                      <a:ext uri="{53640926-AAD7-44D8-BBD7-CCE9431645EC}">
+                        <a14:shadowObscured xmlns:a14="http://schemas.microsoft.com/office/drawing/2010/main"/>
+                      </a:ext>
+                    </a:extLst>
+                  </pic:spPr>
+                </pic:pic>
+              </a:graphicData>
+            </a:graphic>
+          </wp:inline>
+        </w:drawing>
+      </w:r>
+    </w:p>
+    <w:p>
+      <w:pPr>
+        <w:jc w:val="both"/>
+        <w:rPr>
+          <w:b/>
+          <w:bCs/>
+          <w:sz w:val="32"/>
+          <w:szCs w:val="32"/>
+        </w:rPr>
+      </w:pPr>
+      <w:r>
+        <w:rPr>
+          <w:b/>
+          <w:bCs/>
+          <w:sz w:val="32"/>
+          <w:szCs w:val="32"/>
+        </w:rPr>
+        <w:lastRenderedPageBreak/>
+        <w:t>3</w:t>
+      </w:r>
+      <w:r>
+        <w:rPr>
+          <w:b/>
+          <w:bCs/>
+          <w:sz w:val="32"/>
+          <w:szCs w:val="32"/>
+        </w:rPr>
+        <w:t>)</w:t>
+      </w:r>
+      <w:r>
+        <w:rPr>
+          <w:b/>
+          <w:bCs/>
+          <w:sz w:val="32"/>
+          <w:szCs w:val="32"/>
+        </w:rPr>
+        <w:t xml:space="preserve"> </w:t>
+      </w:r>
+      <w:r>
+        <w:rPr>
+          <w:b/>
+          <w:bCs/>
+          <w:sz w:val="32"/>
+          <w:szCs w:val="32"/>
+        </w:rPr>
+        <w:t>Autoencoder</w:t>
+      </w:r>
+      <w:r>
+        <w:rPr>
+          <w:b/>
+          <w:bCs/>
+          <w:sz w:val="32"/>
+          <w:szCs w:val="32"/>
+        </w:rPr>
+        <w:t xml:space="preserve"> Summary</w:t>
+      </w:r>
+    </w:p>
+    <w:p>
+      <w:pPr>
+        <w:jc w:val="both"/>
+        <w:rPr>
+          <w:b/>
+          <w:bCs/>
+          <w:sz w:val="32"/>
+          <w:szCs w:val="32"/>
+        </w:rPr>
+      </w:pPr>
+      <w:r>
+        <w:rPr>
+          <w:b/>
+          <w:bCs/>
+          <w:sz w:val="32"/>
+          <w:szCs w:val="32"/>
+        </w:rPr>
+        <w:drawing>
+          <wp:inline distT="0" distB="0" distL="0" distR="0" wp14:anchorId="3C84170F" wp14:editId="55E70959">
+            <wp:extent cx="5731510" cy="2449830"/>
+            <wp:effectExtent l="0" t="0" r="2540" b="7620"/>
+            <wp:docPr id="325218947" name="Picture 1"/>
+            <wp:cNvGraphicFramePr>
+              <a:graphicFrameLocks xmlns:a="http://schemas.openxmlformats.org/drawingml/2006/main" noChangeAspect="1"/>
+            </wp:cNvGraphicFramePr>
+            <a:graphic xmlns:a="http://schemas.openxmlformats.org/drawingml/2006/main">
+              <a:graphicData uri="http://schemas.openxmlformats.org/drawingml/2006/picture">
+                <pic:pic xmlns:pic="http://schemas.openxmlformats.org/drawingml/2006/picture">
+                  <pic:nvPicPr>
+                    <pic:cNvPr id="325218947" name=""/>
+                    <pic:cNvPicPr/>
+                  </pic:nvPicPr>
+                  <pic:blipFill>
+                    <a:blip r:embed="rId54"/>
+                    <a:stretch>
+                      <a:fillRect/>
+                    </a:stretch>
+                  </pic:blipFill>
+                  <pic:spPr>
+                    <a:xfrm>
+                      <a:off x="0" y="0"/>
+                      <a:ext cx="5731510" cy="2449830"/>
+                    </a:xfrm>
+                    <a:prstGeom prst="rect">
+                      <a:avLst/>
+                    </a:prstGeom>
+                  </pic:spPr>
+                </pic:pic>
+              </a:graphicData>
+            </a:graphic>
+          </wp:inline>
+        </w:drawing>
+      </w:r>
+    </w:p>
+    <w:p>
+      <w:pPr>
+        <w:jc w:val="both"/>
+        <w:rPr>
+          <w:b/>
+          <w:bCs/>
+          <w:sz w:val="44"/>
+          <w:szCs w:val="44"/>
+        </w:rPr>
+      </w:pPr>
+    </w:p>
+    <w:p>
+      <w:pPr>
+        <w:jc w:val="both"/>
+        <w:rPr>
+          <w:b/>
+          <w:bCs/>
+          <w:sz w:val="44"/>
+          <w:szCs w:val="44"/>
+        </w:rPr>
+      </w:pPr>
+    </w:p>
+    <w:p>
+      <w:pPr>
+        <w:jc w:val="both"/>
+        <w:rPr>
+          <w:b/>
+          <w:bCs/>
+          <w:sz w:val="44"/>
+          <w:szCs w:val="44"/>
+        </w:rPr>
+      </w:pPr>
+    </w:p>
+    <w:p>
+      <w:pPr>
+        <w:jc w:val="both"/>
+        <w:rPr>
+          <w:b/>
+          <w:bCs/>
+          <w:sz w:val="44"/>
+          <w:szCs w:val="44"/>
+        </w:rPr>
+      </w:pPr>
+      <w:r>
+        <w:rPr>
+          <w:b/>
+          <w:bCs/>
+          <w:sz w:val="44"/>
+          <w:szCs w:val="44"/>
+        </w:rPr>
+        <w:t>Task 2</w:t>
+      </w:r>
+    </w:p>
+    <w:p>
+      <w:pPr>
+        <w:jc w:val="both"/>
+        <w:rPr>
+          <w:b/>
+          <w:bCs/>
+          <w:sz w:val="32"/>
+          <w:szCs w:val="32"/>
+        </w:rPr>
+      </w:pPr>
+      <w:r>
+        <w:rPr>
+          <w:b/>
+          <w:bCs/>
+          <w:sz w:val="32"/>
+          <w:szCs w:val="32"/>
+        </w:rPr>
+        <w:t>1) Autoencoder Summary</w:t>
+      </w:r>
+    </w:p>
+    <w:p>
+      <w:pPr>
+        <w:jc w:val="both"/>
+        <w:rPr>
+          <w:b/>
+          <w:bCs/>
+          <w:sz w:val="32"/>
+          <w:szCs w:val="32"/>
+        </w:rPr>
+      </w:pPr>
+      <w:r>
+        <w:rPr>
+          <w:b/>
+          <w:bCs/>
+          <w:sz w:val="32"/>
+          <w:szCs w:val="32"/>
+        </w:rPr>
+        <w:drawing>
+          <wp:inline distT="0" distB="0" distL="0" distR="0" wp14:anchorId="235F573B" wp14:editId="1ECBD88A">
+            <wp:extent cx="5731510" cy="2245360"/>
+            <wp:effectExtent l="0" t="0" r="2540" b="2540"/>
+            <wp:docPr id="994117882" name="Picture 1"/>
+            <wp:cNvGraphicFramePr>
+              <a:graphicFrameLocks xmlns:a="http://schemas.openxmlformats.org/drawingml/2006/main" noChangeAspect="1"/>
+            </wp:cNvGraphicFramePr>
+            <a:graphic xmlns:a="http://schemas.openxmlformats.org/drawingml/2006/main">
+              <a:graphicData uri="http://schemas.openxmlformats.org/drawingml/2006/picture">
+                <pic:pic xmlns:pic="http://schemas.openxmlformats.org/drawingml/2006/picture">
+                  <pic:nvPicPr>
+                    <pic:cNvPr id="994117882" name=""/>
+                    <pic:cNvPicPr/>
+                  </pic:nvPicPr>
+                  <pic:blipFill>
+                    <a:blip r:embed="rId55"/>
+                    <a:stretch>
+                      <a:fillRect/>
+                    </a:stretch>
+                  </pic:blipFill>
+                  <pic:spPr>
+                    <a:xfrm>
+                      <a:off x="0" y="0"/>
+                      <a:ext cx="5731510" cy="2245360"/>
+                    </a:xfrm>
+                    <a:prstGeom prst="rect">
+                      <a:avLst/>
+                    </a:prstGeom>
+                  </pic:spPr>
+                </pic:pic>
+              </a:graphicData>
+            </a:graphic>
+          </wp:inline>
+        </w:drawing>
+      </w:r>
+    </w:p>
+    <w:p>
+      <w:pPr>
+        <w:jc w:val="both"/>
+        <w:rPr>
+          <w:b/>
+          <w:bCs/>
+          <w:sz w:val="32"/>
+          <w:szCs w:val="32"/>
+        </w:rPr>
+      </w:pPr>
+    </w:p>
+    <w:p>
+      <w:pPr>
+        <w:jc w:val="both"/>
+        <w:rPr>
+          <w:b/>
+          <w:bCs/>
+          <w:sz w:val="32"/>
+          <w:szCs w:val="32"/>
+        </w:rPr>
+      </w:pPr>
+    </w:p>
+    <w:p>
+      <w:pPr>
+        <w:jc w:val="both"/>
+        <w:rPr>
+          <w:b/>
+          <w:bCs/>
+          <w:sz w:val="32"/>
+          <w:szCs w:val="32"/>
+        </w:rPr>
+      </w:pPr>
+    </w:p>
+    <w:p>
+      <w:pPr>
+        <w:jc w:val="both"/>
+        <w:rPr>
+          <w:b/>
+          <w:bCs/>
+          <w:sz w:val="32"/>
+          <w:szCs w:val="32"/>
+        </w:rPr>
+      </w:pPr>
+      <w:r>
+        <w:rPr>
+          <w:b/>
+          <w:bCs/>
+          <w:sz w:val="32"/>
+          <w:szCs w:val="32"/>
+        </w:rPr>
+        <w:lastRenderedPageBreak/>
+        <w:t xml:space="preserve">2) </w:t>
+      </w:r>
+      <w:r>
+        <w:rPr>
+          <w:b/>
+          <w:bCs/>
+          <w:sz w:val="32"/>
+          <w:szCs w:val="32"/>
+        </w:rPr>
+        <w:t xml:space="preserve">Code of your </w:t>
+      </w:r>
+      <w:proofErr w:type="spellStart"/>
+      <w:r>
+        <w:rPr>
+          <w:b/>
+          <w:bCs/>
+          <w:sz w:val="32"/>
+          <w:szCs w:val="32"/>
+        </w:rPr>
+        <w:t>autoencoder.fit</w:t>
+      </w:r>
+      <w:proofErr w:type="spellEnd"/>
+      <w:r>
+        <w:rPr>
+          <w:b/>
+          <w:bCs/>
+          <w:sz w:val="32"/>
+          <w:szCs w:val="32"/>
+        </w:rPr>
+        <w:t>()</w:t>
+      </w:r>
+    </w:p>
+    <w:p>
+      <w:pPr>
+        <w:jc w:val="both"/>
+        <w:rPr>
+          <w:b/>
+          <w:bCs/>
+          <w:sz w:val="32"/>
+          <w:szCs w:val="32"/>
+        </w:rPr>
+      </w:pPr>
+      <w:r>
+        <w:rPr>
+          <w:b/>
+          <w:bCs/>
+          <w:sz w:val="32"/>
+          <w:szCs w:val="32"/>
+        </w:rPr>
+        <w:drawing>
+          <wp:inline distT="0" distB="0" distL="0" distR="0" wp14:anchorId="11302D47" wp14:editId="015AE27F">
+            <wp:extent cx="5731510" cy="2911475"/>
+            <wp:effectExtent l="0" t="0" r="2540" b="3175"/>
+            <wp:docPr id="23512806" name="Picture 1"/>
+            <wp:cNvGraphicFramePr>
+              <a:graphicFrameLocks xmlns:a="http://schemas.openxmlformats.org/drawingml/2006/main" noChangeAspect="1"/>
+            </wp:cNvGraphicFramePr>
+            <a:graphic xmlns:a="http://schemas.openxmlformats.org/drawingml/2006/main">
+              <a:graphicData uri="http://schemas.openxmlformats.org/drawingml/2006/picture">
+                <pic:pic xmlns:pic="http://schemas.openxmlformats.org/drawingml/2006/picture">
+                  <pic:nvPicPr>
+                    <pic:cNvPr id="23512806" name=""/>
+                    <pic:cNvPicPr/>
+                  </pic:nvPicPr>
+                  <pic:blipFill>
+                    <a:blip r:embed="rId56"/>
+                    <a:stretch>
+                      <a:fillRect/>
+                    </a:stretch>
+                  </pic:blipFill>
+                  <pic:spPr>
+                    <a:xfrm>
+                      <a:off x="0" y="0"/>
+                      <a:ext cx="5731510" cy="2911475"/>
+                    </a:xfrm>
+                    <a:prstGeom prst="rect">
+                      <a:avLst/>
+                    </a:prstGeom>
+                  </pic:spPr>
+                </pic:pic>
+              </a:graphicData>
+            </a:graphic>
+          </wp:inline>
+        </w:drawing>
+      </w:r>
+    </w:p>
+    <w:p>
+      <w:pPr>
+        <w:jc w:val="both"/>
+        <w:rPr>
+          <w:b/>
+          <w:bCs/>
+          <w:sz w:val="32"/>
+          <w:szCs w:val="32"/>
+        </w:rPr>
+      </w:pPr>
+    </w:p>
+    <w:p>
+      <w:pPr>
+        <w:jc w:val="both"/>
+        <w:rPr>
+          <w:b/>
+          <w:bCs/>
+          <w:sz w:val="32"/>
+          <w:szCs w:val="32"/>
+        </w:rPr>
+      </w:pPr>
+      <w:r>
+        <w:rPr>
+          <w:b/>
+          <w:bCs/>
+          <w:sz w:val="32"/>
+          <w:szCs w:val="32"/>
+        </w:rPr>
+        <w:t xml:space="preserve">3) </w:t>
+      </w:r>
+      <w:r>
+        <w:rPr>
+          <w:b/>
+          <w:bCs/>
+          <w:sz w:val="32"/>
+          <w:szCs w:val="32"/>
+        </w:rPr>
+        <w:t>Accuracy detailed graph</w:t>
+      </w:r>
+    </w:p>
+    <w:p>
+      <w:pPr>
+        <w:tabs>
+          <w:tab w:val="left" w:pos="2355"/>
+        </w:tabs>
+        <w:jc w:val="both"/>
+        <w:rPr>
+          <w:b/>
+          <w:bCs/>
+          <w:sz w:val="32"/>
+          <w:szCs w:val="32"/>
+        </w:rPr>
+      </w:pPr>
+      <w:r>
+        <w:rPr>
+          <w:b/>
+          <w:bCs/>
+          <w:sz w:val="32"/>
+          <w:szCs w:val="32"/>
+        </w:rPr>
+        <w:drawing>
+          <wp:inline distT="0" distB="0" distL="0" distR="0" wp14:anchorId="56EA0621" wp14:editId="3B22A318">
+            <wp:extent cx="5731510" cy="2847975"/>
+            <wp:effectExtent l="0" t="0" r="2540" b="9525"/>
+            <wp:docPr id="1167062811" name="Picture 1"/>
+            <wp:cNvGraphicFramePr>
+              <a:graphicFrameLocks xmlns:a="http://schemas.openxmlformats.org/drawingml/2006/main" noChangeAspect="1"/>
+            </wp:cNvGraphicFramePr>
+            <a:graphic xmlns:a="http://schemas.openxmlformats.org/drawingml/2006/main">
+              <a:graphicData uri="http://schemas.openxmlformats.org/drawingml/2006/picture">
+                <pic:pic xmlns:pic="http://schemas.openxmlformats.org/drawingml/2006/picture">
+                  <pic:nvPicPr>
+                    <pic:cNvPr id="1167062811" name=""/>
+                    <pic:cNvPicPr/>
+                  </pic:nvPicPr>
+                  <pic:blipFill>
+                    <a:blip r:embed="rId57"/>
+                    <a:stretch>
+                      <a:fillRect/>
+                    </a:stretch>
+                  </pic:blipFill>
+                  <pic:spPr>
+                    <a:xfrm>
+                      <a:off x="0" y="0"/>
+                      <a:ext cx="5731510" cy="2847975"/>
+                    </a:xfrm>
+                    <a:prstGeom prst="rect">
+                      <a:avLst/>
+                    </a:prstGeom>
+                  </pic:spPr>
+                </pic:pic>
+              </a:graphicData>
+            </a:graphic>
+          </wp:inline>
+        </w:drawing>
+      </w:r>
+    </w:p>
+    <w:p>
+      <w:pPr>
+        <w:jc w:val="both"/>
+        <w:rPr>
+          <w:b/>
+          <w:bCs/>
+          <w:sz w:val="32"/>
+          <w:szCs w:val="32"/>
+        </w:rPr>
+      </w:pPr>
+    </w:p>
+    <w:p>
+      <w:pPr>
+        <w:jc w:val="both"/>
+        <w:rPr>
+          <w:b/>
+          <w:bCs/>
+          <w:sz w:val="32"/>
+          <w:szCs w:val="32"/>
+        </w:rPr>
+      </w:pPr>
+    </w:p>
+    <w:p>
+      <w:pPr>
+        <w:jc w:val="both"/>
+        <w:rPr>
+          <w:b/>
+          <w:bCs/>
+          <w:sz w:val="32"/>
+          <w:szCs w:val="32"/>
+        </w:rPr>
+      </w:pPr>
+    </w:p>
+    <w:p>
+      <w:pPr>
+        <w:jc w:val="both"/>
+        <w:rPr>
+          <w:b/>
+          <w:bCs/>
+          <w:sz w:val="32"/>
+          <w:szCs w:val="32"/>
+        </w:rPr>
+      </w:pPr>
+      <w:r>
+        <w:rPr>
+          <w:b/>
+          <w:bCs/>
+          <w:sz w:val="32"/>
+          <w:szCs w:val="32"/>
+        </w:rPr>
+        <w:lastRenderedPageBreak/>
+        <w:t xml:space="preserve">4) </w:t>
+      </w:r>
+      <w:r>
+        <w:rPr>
+          <w:b/>
+          <w:bCs/>
+          <w:sz w:val="32"/>
+          <w:szCs w:val="32"/>
+        </w:rPr>
+        <w:t xml:space="preserve">Document the plot of the decoded images for task 2. Change the colour, appearance, and shape of the plot according to your own choice (see </w:t>
+      </w:r>
+      <w:proofErr w:type="spellStart"/>
+      <w:r>
+        <w:rPr>
+          <w:b/>
+          <w:bCs/>
+          <w:sz w:val="32"/>
+          <w:szCs w:val="32"/>
+        </w:rPr>
+        <w:t>plt.figure</w:t>
+      </w:r>
+      <w:proofErr w:type="spellEnd"/>
+      <w:r>
+        <w:rPr>
+          <w:b/>
+          <w:bCs/>
+          <w:sz w:val="32"/>
+          <w:szCs w:val="32"/>
+        </w:rPr>
+        <w:t>() parameters).</w:t>
+      </w:r>
+    </w:p>
+    <w:p>
+      <w:pPr>
+        <w:jc w:val="both"/>
+        <w:rPr>
+          <w:b/>
+          <w:bCs/>
+          <w:sz w:val="32"/>
+          <w:szCs w:val="32"/>
+        </w:rPr>
+      </w:pPr>
+      <w:r>
+        <w:rPr>
+          <w:b/>
+          <w:bCs/>
+          <w:sz w:val="32"/>
+          <w:szCs w:val="32"/>
+        </w:rPr>
+        <w:drawing>
+          <wp:inline distT="0" distB="0" distL="0" distR="0" wp14:anchorId="7E06F6CE" wp14:editId="09069A2F">
+            <wp:extent cx="5731510" cy="1800225"/>
+            <wp:effectExtent l="0" t="0" r="2540" b="9525"/>
+            <wp:docPr id="193458968" name="Picture 1"/>
+            <wp:cNvGraphicFramePr>
+              <a:graphicFrameLocks xmlns:a="http://schemas.openxmlformats.org/drawingml/2006/main" noChangeAspect="1"/>
+            </wp:cNvGraphicFramePr>
+            <a:graphic xmlns:a="http://schemas.openxmlformats.org/drawingml/2006/main">
+              <a:graphicData uri="http://schemas.openxmlformats.org/drawingml/2006/picture">
+                <pic:pic xmlns:pic="http://schemas.openxmlformats.org/drawingml/2006/picture">
+                  <pic:nvPicPr>
+                    <pic:cNvPr id="193458968" name=""/>
+                    <pic:cNvPicPr/>
+                  </pic:nvPicPr>
+                  <pic:blipFill>
+                    <a:blip r:embed="rId58"/>
+                    <a:stretch>
+                      <a:fillRect/>
+                    </a:stretch>
+                  </pic:blipFill>
+                  <pic:spPr>
+                    <a:xfrm>
+                      <a:off x="0" y="0"/>
+                      <a:ext cx="5731510" cy="1800225"/>
+                    </a:xfrm>
+                    <a:prstGeom prst="rect">
+                      <a:avLst/>
+                    </a:prstGeom>
+                  </pic:spPr>
+                </pic:pic>
+              </a:graphicData>
+            </a:graphic>
+          </wp:inline>
+        </w:drawing>
+      </w:r>
+    </w:p>
+    <w:p>
+      <w:pPr>
+        <w:jc w:val="both"/>
+        <w:rPr>
+          <w:b/>
+          <w:bCs/>
+          <w:sz w:val="32"/>
+          <w:szCs w:val="32"/>
+        </w:rPr>
+      </w:pPr>
+    </w:p>
+    <w:p>
+      <w:pPr>
+        <w:jc w:val="both"/>
+        <w:rPr>
+          <w:b/>
+          <w:bCs/>
+          <w:sz w:val="44"/>
+          <w:szCs w:val="44"/>
+        </w:rPr>
+      </w:pPr>
+    </w:p>
+    <w:p>
+      <w:pPr>
+        <w:jc w:val="both"/>
+        <w:rPr>
+          <w:b/>
+          <w:bCs/>
+          <w:sz w:val="44"/>
+          <w:szCs w:val="44"/>
+        </w:rPr>
+      </w:pPr>
+    </w:p>
+    <w:p>
+      <w:pPr>
+        <w:jc w:val="both"/>
+        <w:rPr>
+          <w:b/>
+          <w:bCs/>
+          <w:sz w:val="44"/>
+          <w:szCs w:val="44"/>
+        </w:rPr>
+      </w:pPr>
+    </w:p>
+    <w:p>
+      <w:pPr>
+        <w:jc w:val="both"/>
+        <w:rPr>
+          <w:b/>
+          <w:bCs/>
+          <w:sz w:val="44"/>
+          <w:szCs w:val="44"/>
+        </w:rPr>
+      </w:pPr>
+    </w:p>
+    <w:p>
+      <w:pPr>
+        <w:jc w:val="both"/>
+        <w:rPr>
+          <w:b/>
+          <w:bCs/>
+          <w:sz w:val="44"/>
+          <w:szCs w:val="44"/>
+        </w:rPr>
+      </w:pPr>
+    </w:p>
+    <w:p>
+      <w:pPr>
+        <w:jc w:val="both"/>
+        <w:rPr>
+          <w:b/>
+          <w:bCs/>
+          <w:sz w:val="44"/>
+          <w:szCs w:val="44"/>
+        </w:rPr>
+      </w:pPr>
+    </w:p>
+    <w:p>
+      <w:pPr>
+        <w:jc w:val="both"/>
+        <w:rPr>
+          <w:b/>
+          <w:bCs/>
+          <w:sz w:val="44"/>
+          <w:szCs w:val="44"/>
+        </w:rPr>
+      </w:pPr>
+    </w:p>
+    <w:p>
+      <w:pPr>
+        <w:jc w:val="both"/>
+        <w:rPr>
+          <w:b/>
+          <w:bCs/>
+          <w:sz w:val="44"/>
+          <w:szCs w:val="44"/>
+        </w:rPr>
+      </w:pPr>
+    </w:p>
+    <w:p>
+      <w:pPr>
+        <w:jc w:val="both"/>
+        <w:rPr>
+          <w:b/>
+          <w:bCs/>
+          <w:sz w:val="44"/>
+          <w:szCs w:val="44"/>
+        </w:rPr>
+      </w:pPr>
+    </w:p>
+    <w:p>
+      <w:pPr>
+        <w:jc w:val="both"/>
+        <w:rPr>
+          <w:b/>
+          <w:bCs/>
+          <w:sz w:val="44"/>
+          <w:szCs w:val="44"/>
+        </w:rPr>
+      </w:pPr>
+    </w:p>
+    <w:p>
+      <w:pPr>
+        <w:jc w:val="both"/>
+        <w:rPr>
+          <w:b/>
+          <w:bCs/>
+          <w:sz w:val="44"/>
+          <w:szCs w:val="44"/>
+        </w:rPr>
+      </w:pPr>
+    </w:p>
+    <w:p>
+      <w:pPr>
+        <w:jc w:val="both"/>
+        <w:rPr>
+          <w:b/>
+          <w:bCs/>
+          <w:sz w:val="44"/>
+          <w:szCs w:val="44"/>
+        </w:rPr>
+      </w:pPr>
+    </w:p>
+    <w:p>
+      <w:pPr>
+        <w:jc w:val="center"/>
+        <w:rPr>
+          <w:b/>
+          <w:bCs/>
+          <w:sz w:val="44"/>
+          <w:szCs w:val="44"/>
+        </w:rPr>
+      </w:pPr>
+      <w:r>
+        <w:rPr>
+          <w:b/>
+          <w:bCs/>
+          <w:sz w:val="44"/>
+          <w:szCs w:val="44"/>
+        </w:rPr>
+        <w:lastRenderedPageBreak/>
         <w:t>Lab 11</w:t>
       </w:r>
     </w:p>
     <w:p>
       <w:pPr>
-        <w:jc w:val="both"/>
-        <w:rPr>
-          <w:sz w:val="44"/>
-          <w:szCs w:val="44"/>
-          <w:lang w:val="de-DE"/>
-        </w:rPr>
-      </w:pPr>
-    </w:p>
-    <w:p>
-      <w:pPr>
-        <w:jc w:val="both"/>
-        <w:rPr>
-          <w:sz w:val="44"/>
-          <w:szCs w:val="44"/>
-          <w:u w:val="single"/>
-          <w:lang w:val="de-DE"/>
-        </w:rPr>
-      </w:pPr>
-      <w:r>
-        <w:rPr>
-          <w:sz w:val="44"/>
-          <w:szCs w:val="44"/>
-          <w:u w:val="single"/>
-          <w:lang w:val="de-DE"/>
+        <w:rPr>
+          <w:b/>
+          <w:bCs/>
+          <w:sz w:val="44"/>
+          <w:szCs w:val="44"/>
+        </w:rPr>
+      </w:pPr>
+    </w:p>
+    <w:p>
+      <w:pPr>
+        <w:jc w:val="both"/>
+        <w:rPr>
+          <w:sz w:val="44"/>
+          <w:szCs w:val="44"/>
+        </w:rPr>
+      </w:pPr>
+    </w:p>
+    <w:p>
+      <w:pPr>
+        <w:jc w:val="both"/>
+        <w:rPr>
+          <w:sz w:val="44"/>
+          <w:szCs w:val="44"/>
+          <w:u w:val="single"/>
+        </w:rPr>
+      </w:pPr>
+      <w:r>
+        <w:rPr>
+          <w:sz w:val="44"/>
+          <w:szCs w:val="44"/>
+          <w:u w:val="single"/>
         </w:rPr>
         <w:t>Lab 12</w:t>
       </w:r>
@@ -5044,6 +5988,244 @@
     </w:lvl>
   </w:abstractNum>
   <w:abstractNum w:abstractNumId="1" w15:restartNumberingAfterBreak="0">
+    <w:nsid w:val="20C14A08"/>
+    <w:multiLevelType w:val="hybridMultilevel"/>
+    <w:tmpl w:val="2BAAA828"/>
+    <w:lvl w:ilvl="0" w:tplc="08090011">
+      <w:start w:val="1"/>
+      <w:numFmt w:val="decimal"/>
+      <w:lvlText w:val="%1)"/>
+      <w:lvlJc w:val="left"/>
+      <w:pPr>
+        <w:ind w:left="720" w:hanging="360"/>
+      </w:pPr>
+      <w:rPr>
+        <w:rFonts w:hint="default"/>
+      </w:rPr>
+    </w:lvl>
+    <w:lvl w:ilvl="1" w:tplc="08090019" w:tentative="1">
+      <w:start w:val="1"/>
+      <w:numFmt w:val="lowerLetter"/>
+      <w:lvlText w:val="%2."/>
+      <w:lvlJc w:val="left"/>
+      <w:pPr>
+        <w:ind w:left="1440" w:hanging="360"/>
+      </w:pPr>
+    </w:lvl>
+    <w:lvl w:ilvl="2" w:tplc="0809001B" w:tentative="1">
+      <w:start w:val="1"/>
+      <w:numFmt w:val="lowerRoman"/>
+      <w:lvlText w:val="%3."/>
+      <w:lvlJc w:val="right"/>
+      <w:pPr>
+        <w:ind w:left="2160" w:hanging="180"/>
+      </w:pPr>
+    </w:lvl>
+    <w:lvl w:ilvl="3" w:tplc="0809000F" w:tentative="1">
+      <w:start w:val="1"/>
+      <w:numFmt w:val="decimal"/>
+      <w:lvlText w:val="%4."/>
+      <w:lvlJc w:val="left"/>
+      <w:pPr>
+        <w:ind w:left="2880" w:hanging="360"/>
+      </w:pPr>
+    </w:lvl>
+    <w:lvl w:ilvl="4" w:tplc="08090019" w:tentative="1">
+      <w:start w:val="1"/>
+      <w:numFmt w:val="lowerLetter"/>
+      <w:lvlText w:val="%5."/>
+      <w:lvlJc w:val="left"/>
+      <w:pPr>
+        <w:ind w:left="3600" w:hanging="360"/>
+      </w:pPr>
+    </w:lvl>
+    <w:lvl w:ilvl="5" w:tplc="0809001B" w:tentative="1">
+      <w:start w:val="1"/>
+      <w:numFmt w:val="lowerRoman"/>
+      <w:lvlText w:val="%6."/>
+      <w:lvlJc w:val="right"/>
+      <w:pPr>
+        <w:ind w:left="4320" w:hanging="180"/>
+      </w:pPr>
+    </w:lvl>
+    <w:lvl w:ilvl="6" w:tplc="0809000F" w:tentative="1">
+      <w:start w:val="1"/>
+      <w:numFmt w:val="decimal"/>
+      <w:lvlText w:val="%7."/>
+      <w:lvlJc w:val="left"/>
+      <w:pPr>
+        <w:ind w:left="5040" w:hanging="360"/>
+      </w:pPr>
+    </w:lvl>
+    <w:lvl w:ilvl="7" w:tplc="08090019" w:tentative="1">
+      <w:start w:val="1"/>
+      <w:numFmt w:val="lowerLetter"/>
+      <w:lvlText w:val="%8."/>
+      <w:lvlJc w:val="left"/>
+      <w:pPr>
+        <w:ind w:left="5760" w:hanging="360"/>
+      </w:pPr>
+    </w:lvl>
+    <w:lvl w:ilvl="8" w:tplc="0809001B" w:tentative="1">
+      <w:start w:val="1"/>
+      <w:numFmt w:val="lowerRoman"/>
+      <w:lvlText w:val="%9."/>
+      <w:lvlJc w:val="right"/>
+      <w:pPr>
+        <w:ind w:left="6480" w:hanging="180"/>
+      </w:pPr>
+    </w:lvl>
+  </w:abstractNum>
+  <w:abstractNum w:abstractNumId="2" w15:restartNumberingAfterBreak="0">
+    <w:nsid w:val="268E55E5"/>
+    <w:multiLevelType w:val="multilevel"/>
+    <w:tmpl w:val="EBB65748"/>
+    <w:lvl w:ilvl="0">
+      <w:start w:val="1"/>
+      <w:numFmt w:val="bullet"/>
+      <w:lvlText w:val=""/>
+      <w:lvlJc w:val="left"/>
+      <w:pPr>
+        <w:tabs>
+          <w:tab w:val="num" w:pos="720"/>
+        </w:tabs>
+        <w:ind w:left="720" w:hanging="360"/>
+      </w:pPr>
+      <w:rPr>
+        <w:rFonts w:ascii="Symbol" w:hAnsi="Symbol" w:hint="default"/>
+        <w:sz w:val="20"/>
+      </w:rPr>
+    </w:lvl>
+    <w:lvl w:ilvl="1" w:tentative="1">
+      <w:start w:val="1"/>
+      <w:numFmt w:val="bullet"/>
+      <w:lvlText w:val="o"/>
+      <w:lvlJc w:val="left"/>
+      <w:pPr>
+        <w:tabs>
+          <w:tab w:val="num" w:pos="1440"/>
+        </w:tabs>
+        <w:ind w:left="1440" w:hanging="360"/>
+      </w:pPr>
+      <w:rPr>
+        <w:rFonts w:ascii="Courier New" w:hAnsi="Courier New" w:hint="default"/>
+        <w:sz w:val="20"/>
+      </w:rPr>
+    </w:lvl>
+    <w:lvl w:ilvl="2" w:tentative="1">
+      <w:start w:val="1"/>
+      <w:numFmt w:val="bullet"/>
+      <w:lvlText w:val=""/>
+      <w:lvlJc w:val="left"/>
+      <w:pPr>
+        <w:tabs>
+          <w:tab w:val="num" w:pos="2160"/>
+        </w:tabs>
+        <w:ind w:left="2160" w:hanging="360"/>
+      </w:pPr>
+      <w:rPr>
+        <w:rFonts w:ascii="Wingdings" w:hAnsi="Wingdings" w:hint="default"/>
+        <w:sz w:val="20"/>
+      </w:rPr>
+    </w:lvl>
+    <w:lvl w:ilvl="3" w:tentative="1">
+      <w:start w:val="1"/>
+      <w:numFmt w:val="bullet"/>
+      <w:lvlText w:val=""/>
+      <w:lvlJc w:val="left"/>
+      <w:pPr>
+        <w:tabs>
+          <w:tab w:val="num" w:pos="2880"/>
+        </w:tabs>
+        <w:ind w:left="2880" w:hanging="360"/>
+      </w:pPr>
+      <w:rPr>
+        <w:rFonts w:ascii="Wingdings" w:hAnsi="Wingdings" w:hint="default"/>
+        <w:sz w:val="20"/>
+      </w:rPr>
+    </w:lvl>
+    <w:lvl w:ilvl="4" w:tentative="1">
+      <w:start w:val="1"/>
+      <w:numFmt w:val="bullet"/>
+      <w:lvlText w:val=""/>
+      <w:lvlJc w:val="left"/>
+      <w:pPr>
+        <w:tabs>
+          <w:tab w:val="num" w:pos="3600"/>
+        </w:tabs>
+        <w:ind w:left="3600" w:hanging="360"/>
+      </w:pPr>
+      <w:rPr>
+        <w:rFonts w:ascii="Wingdings" w:hAnsi="Wingdings" w:hint="default"/>
+        <w:sz w:val="20"/>
+      </w:rPr>
+    </w:lvl>
+    <w:lvl w:ilvl="5" w:tentative="1">
+      <w:start w:val="1"/>
+      <w:numFmt w:val="bullet"/>
+      <w:lvlText w:val=""/>
+      <w:lvlJc w:val="left"/>
+      <w:pPr>
+        <w:tabs>
+          <w:tab w:val="num" w:pos="4320"/>
+        </w:tabs>
+        <w:ind w:left="4320" w:hanging="360"/>
+      </w:pPr>
+      <w:rPr>
+        <w:rFonts w:ascii="Wingdings" w:hAnsi="Wingdings" w:hint="default"/>
+        <w:sz w:val="20"/>
+      </w:rPr>
+    </w:lvl>
+    <w:lvl w:ilvl="6" w:tentative="1">
+      <w:start w:val="1"/>
+      <w:numFmt w:val="bullet"/>
+      <w:lvlText w:val=""/>
+      <w:lvlJc w:val="left"/>
+      <w:pPr>
+        <w:tabs>
+          <w:tab w:val="num" w:pos="5040"/>
+        </w:tabs>
+        <w:ind w:left="5040" w:hanging="360"/>
+      </w:pPr>
+      <w:rPr>
+        <w:rFonts w:ascii="Wingdings" w:hAnsi="Wingdings" w:hint="default"/>
+        <w:sz w:val="20"/>
+      </w:rPr>
+    </w:lvl>
+    <w:lvl w:ilvl="7" w:tentative="1">
+      <w:start w:val="1"/>
+      <w:numFmt w:val="bullet"/>
+      <w:lvlText w:val=""/>
+      <w:lvlJc w:val="left"/>
+      <w:pPr>
+        <w:tabs>
+          <w:tab w:val="num" w:pos="5760"/>
+        </w:tabs>
+        <w:ind w:left="5760" w:hanging="360"/>
+      </w:pPr>
+      <w:rPr>
+        <w:rFonts w:ascii="Wingdings" w:hAnsi="Wingdings" w:hint="default"/>
+        <w:sz w:val="20"/>
+      </w:rPr>
+    </w:lvl>
+    <w:lvl w:ilvl="8" w:tentative="1">
+      <w:start w:val="1"/>
+      <w:numFmt w:val="bullet"/>
+      <w:lvlText w:val=""/>
+      <w:lvlJc w:val="left"/>
+      <w:pPr>
+        <w:tabs>
+          <w:tab w:val="num" w:pos="6480"/>
+        </w:tabs>
+        <w:ind w:left="6480" w:hanging="360"/>
+      </w:pPr>
+      <w:rPr>
+        <w:rFonts w:ascii="Wingdings" w:hAnsi="Wingdings" w:hint="default"/>
+        <w:sz w:val="20"/>
+      </w:rPr>
+    </w:lvl>
+  </w:abstractNum>
+  <w:abstractNum w:abstractNumId="3" w15:restartNumberingAfterBreak="0">
     <w:nsid w:val="2D537D0F"/>
     <w:multiLevelType w:val="multilevel"/>
     <w:tmpl w:val="1536FAA4"/>
@@ -5156,7 +6338,7 @@
       </w:pPr>
     </w:lvl>
   </w:abstractNum>
-  <w:abstractNum w:abstractNumId="2" w15:restartNumberingAfterBreak="0">
+  <w:abstractNum w:abstractNumId="4" w15:restartNumberingAfterBreak="0">
     <w:nsid w:val="30270288"/>
     <w:multiLevelType w:val="multilevel"/>
     <w:tmpl w:val="A8507A50"/>
@@ -5305,7 +6487,7 @@
       </w:rPr>
     </w:lvl>
   </w:abstractNum>
-  <w:abstractNum w:abstractNumId="3" w15:restartNumberingAfterBreak="0">
+  <w:abstractNum w:abstractNumId="5" w15:restartNumberingAfterBreak="0">
     <w:nsid w:val="3BD76948"/>
     <w:multiLevelType w:val="hybridMultilevel"/>
     <w:tmpl w:val="18666E64"/>
@@ -5394,7 +6576,7 @@
       </w:pPr>
     </w:lvl>
   </w:abstractNum>
-  <w:abstractNum w:abstractNumId="4" w15:restartNumberingAfterBreak="0">
+  <w:abstractNum w:abstractNumId="6" w15:restartNumberingAfterBreak="0">
     <w:nsid w:val="3C206750"/>
     <w:multiLevelType w:val="multilevel"/>
     <w:tmpl w:val="5E52D378"/>
@@ -5507,7 +6689,7 @@
       </w:pPr>
     </w:lvl>
   </w:abstractNum>
-  <w:abstractNum w:abstractNumId="5" w15:restartNumberingAfterBreak="0">
+  <w:abstractNum w:abstractNumId="7" w15:restartNumberingAfterBreak="0">
     <w:nsid w:val="3C430B68"/>
     <w:multiLevelType w:val="multilevel"/>
     <w:tmpl w:val="A54837AE"/>
@@ -5656,7 +6838,245 @@
       </w:rPr>
     </w:lvl>
   </w:abstractNum>
-  <w:abstractNum w:abstractNumId="6" w15:restartNumberingAfterBreak="0">
+  <w:abstractNum w:abstractNumId="8" w15:restartNumberingAfterBreak="0">
+    <w:nsid w:val="3E3360EB"/>
+    <w:multiLevelType w:val="multilevel"/>
+    <w:tmpl w:val="AB02050A"/>
+    <w:lvl w:ilvl="0">
+      <w:start w:val="1"/>
+      <w:numFmt w:val="bullet"/>
+      <w:lvlText w:val=""/>
+      <w:lvlJc w:val="left"/>
+      <w:pPr>
+        <w:tabs>
+          <w:tab w:val="num" w:pos="720"/>
+        </w:tabs>
+        <w:ind w:left="720" w:hanging="360"/>
+      </w:pPr>
+      <w:rPr>
+        <w:rFonts w:ascii="Symbol" w:hAnsi="Symbol" w:hint="default"/>
+        <w:sz w:val="20"/>
+      </w:rPr>
+    </w:lvl>
+    <w:lvl w:ilvl="1" w:tentative="1">
+      <w:start w:val="1"/>
+      <w:numFmt w:val="bullet"/>
+      <w:lvlText w:val="o"/>
+      <w:lvlJc w:val="left"/>
+      <w:pPr>
+        <w:tabs>
+          <w:tab w:val="num" w:pos="1440"/>
+        </w:tabs>
+        <w:ind w:left="1440" w:hanging="360"/>
+      </w:pPr>
+      <w:rPr>
+        <w:rFonts w:ascii="Courier New" w:hAnsi="Courier New" w:hint="default"/>
+        <w:sz w:val="20"/>
+      </w:rPr>
+    </w:lvl>
+    <w:lvl w:ilvl="2" w:tentative="1">
+      <w:start w:val="1"/>
+      <w:numFmt w:val="bullet"/>
+      <w:lvlText w:val=""/>
+      <w:lvlJc w:val="left"/>
+      <w:pPr>
+        <w:tabs>
+          <w:tab w:val="num" w:pos="2160"/>
+        </w:tabs>
+        <w:ind w:left="2160" w:hanging="360"/>
+      </w:pPr>
+      <w:rPr>
+        <w:rFonts w:ascii="Wingdings" w:hAnsi="Wingdings" w:hint="default"/>
+        <w:sz w:val="20"/>
+      </w:rPr>
+    </w:lvl>
+    <w:lvl w:ilvl="3" w:tentative="1">
+      <w:start w:val="1"/>
+      <w:numFmt w:val="bullet"/>
+      <w:lvlText w:val=""/>
+      <w:lvlJc w:val="left"/>
+      <w:pPr>
+        <w:tabs>
+          <w:tab w:val="num" w:pos="2880"/>
+        </w:tabs>
+        <w:ind w:left="2880" w:hanging="360"/>
+      </w:pPr>
+      <w:rPr>
+        <w:rFonts w:ascii="Wingdings" w:hAnsi="Wingdings" w:hint="default"/>
+        <w:sz w:val="20"/>
+      </w:rPr>
+    </w:lvl>
+    <w:lvl w:ilvl="4" w:tentative="1">
+      <w:start w:val="1"/>
+      <w:numFmt w:val="bullet"/>
+      <w:lvlText w:val=""/>
+      <w:lvlJc w:val="left"/>
+      <w:pPr>
+        <w:tabs>
+          <w:tab w:val="num" w:pos="3600"/>
+        </w:tabs>
+        <w:ind w:left="3600" w:hanging="360"/>
+      </w:pPr>
+      <w:rPr>
+        <w:rFonts w:ascii="Wingdings" w:hAnsi="Wingdings" w:hint="default"/>
+        <w:sz w:val="20"/>
+      </w:rPr>
+    </w:lvl>
+    <w:lvl w:ilvl="5" w:tentative="1">
+      <w:start w:val="1"/>
+      <w:numFmt w:val="bullet"/>
+      <w:lvlText w:val=""/>
+      <w:lvlJc w:val="left"/>
+      <w:pPr>
+        <w:tabs>
+          <w:tab w:val="num" w:pos="4320"/>
+        </w:tabs>
+        <w:ind w:left="4320" w:hanging="360"/>
+      </w:pPr>
+      <w:rPr>
+        <w:rFonts w:ascii="Wingdings" w:hAnsi="Wingdings" w:hint="default"/>
+        <w:sz w:val="20"/>
+      </w:rPr>
+    </w:lvl>
+    <w:lvl w:ilvl="6" w:tentative="1">
+      <w:start w:val="1"/>
+      <w:numFmt w:val="bullet"/>
+      <w:lvlText w:val=""/>
+      <w:lvlJc w:val="left"/>
+      <w:pPr>
+        <w:tabs>
+          <w:tab w:val="num" w:pos="5040"/>
+        </w:tabs>
+        <w:ind w:left="5040" w:hanging="360"/>
+      </w:pPr>
+      <w:rPr>
+        <w:rFonts w:ascii="Wingdings" w:hAnsi="Wingdings" w:hint="default"/>
+        <w:sz w:val="20"/>
+      </w:rPr>
+    </w:lvl>
+    <w:lvl w:ilvl="7" w:tentative="1">
+      <w:start w:val="1"/>
+      <w:numFmt w:val="bullet"/>
+      <w:lvlText w:val=""/>
+      <w:lvlJc w:val="left"/>
+      <w:pPr>
+        <w:tabs>
+          <w:tab w:val="num" w:pos="5760"/>
+        </w:tabs>
+        <w:ind w:left="5760" w:hanging="360"/>
+      </w:pPr>
+      <w:rPr>
+        <w:rFonts w:ascii="Wingdings" w:hAnsi="Wingdings" w:hint="default"/>
+        <w:sz w:val="20"/>
+      </w:rPr>
+    </w:lvl>
+    <w:lvl w:ilvl="8" w:tentative="1">
+      <w:start w:val="1"/>
+      <w:numFmt w:val="bullet"/>
+      <w:lvlText w:val=""/>
+      <w:lvlJc w:val="left"/>
+      <w:pPr>
+        <w:tabs>
+          <w:tab w:val="num" w:pos="6480"/>
+        </w:tabs>
+        <w:ind w:left="6480" w:hanging="360"/>
+      </w:pPr>
+      <w:rPr>
+        <w:rFonts w:ascii="Wingdings" w:hAnsi="Wingdings" w:hint="default"/>
+        <w:sz w:val="20"/>
+      </w:rPr>
+    </w:lvl>
+  </w:abstractNum>
+  <w:abstractNum w:abstractNumId="9" w15:restartNumberingAfterBreak="0">
+    <w:nsid w:val="467369B0"/>
+    <w:multiLevelType w:val="hybridMultilevel"/>
+    <w:tmpl w:val="5428F6D8"/>
+    <w:lvl w:ilvl="0" w:tplc="08090011">
+      <w:start w:val="1"/>
+      <w:numFmt w:val="decimal"/>
+      <w:lvlText w:val="%1)"/>
+      <w:lvlJc w:val="left"/>
+      <w:pPr>
+        <w:ind w:left="720" w:hanging="360"/>
+      </w:pPr>
+      <w:rPr>
+        <w:rFonts w:hint="default"/>
+      </w:rPr>
+    </w:lvl>
+    <w:lvl w:ilvl="1" w:tplc="08090019" w:tentative="1">
+      <w:start w:val="1"/>
+      <w:numFmt w:val="lowerLetter"/>
+      <w:lvlText w:val="%2."/>
+      <w:lvlJc w:val="left"/>
+      <w:pPr>
+        <w:ind w:left="1440" w:hanging="360"/>
+      </w:pPr>
+    </w:lvl>
+    <w:lvl w:ilvl="2" w:tplc="0809001B" w:tentative="1">
+      <w:start w:val="1"/>
+      <w:numFmt w:val="lowerRoman"/>
+      <w:lvlText w:val="%3."/>
+      <w:lvlJc w:val="right"/>
+      <w:pPr>
+        <w:ind w:left="2160" w:hanging="180"/>
+      </w:pPr>
+    </w:lvl>
+    <w:lvl w:ilvl="3" w:tplc="0809000F" w:tentative="1">
+      <w:start w:val="1"/>
+      <w:numFmt w:val="decimal"/>
+      <w:lvlText w:val="%4."/>
+      <w:lvlJc w:val="left"/>
+      <w:pPr>
+        <w:ind w:left="2880" w:hanging="360"/>
+      </w:pPr>
+    </w:lvl>
+    <w:lvl w:ilvl="4" w:tplc="08090019" w:tentative="1">
+      <w:start w:val="1"/>
+      <w:numFmt w:val="lowerLetter"/>
+      <w:lvlText w:val="%5."/>
+      <w:lvlJc w:val="left"/>
+      <w:pPr>
+        <w:ind w:left="3600" w:hanging="360"/>
+      </w:pPr>
+    </w:lvl>
+    <w:lvl w:ilvl="5" w:tplc="0809001B" w:tentative="1">
+      <w:start w:val="1"/>
+      <w:numFmt w:val="lowerRoman"/>
+      <w:lvlText w:val="%6."/>
+      <w:lvlJc w:val="right"/>
+      <w:pPr>
+        <w:ind w:left="4320" w:hanging="180"/>
+      </w:pPr>
+    </w:lvl>
+    <w:lvl w:ilvl="6" w:tplc="0809000F" w:tentative="1">
+      <w:start w:val="1"/>
+      <w:numFmt w:val="decimal"/>
+      <w:lvlText w:val="%7."/>
+      <w:lvlJc w:val="left"/>
+      <w:pPr>
+        <w:ind w:left="5040" w:hanging="360"/>
+      </w:pPr>
+    </w:lvl>
+    <w:lvl w:ilvl="7" w:tplc="08090019" w:tentative="1">
+      <w:start w:val="1"/>
+      <w:numFmt w:val="lowerLetter"/>
+      <w:lvlText w:val="%8."/>
+      <w:lvlJc w:val="left"/>
+      <w:pPr>
+        <w:ind w:left="5760" w:hanging="360"/>
+      </w:pPr>
+    </w:lvl>
+    <w:lvl w:ilvl="8" w:tplc="0809001B" w:tentative="1">
+      <w:start w:val="1"/>
+      <w:numFmt w:val="lowerRoman"/>
+      <w:lvlText w:val="%9."/>
+      <w:lvlJc w:val="right"/>
+      <w:pPr>
+        <w:ind w:left="6480" w:hanging="180"/>
+      </w:pPr>
+    </w:lvl>
+  </w:abstractNum>
+  <w:abstractNum w:abstractNumId="10" w15:restartNumberingAfterBreak="0">
     <w:nsid w:val="47CF03E2"/>
     <w:multiLevelType w:val="hybridMultilevel"/>
     <w:tmpl w:val="E144B06C"/>
@@ -5745,7 +7165,7 @@
       </w:pPr>
     </w:lvl>
   </w:abstractNum>
-  <w:abstractNum w:abstractNumId="7" w15:restartNumberingAfterBreak="0">
+  <w:abstractNum w:abstractNumId="11" w15:restartNumberingAfterBreak="0">
     <w:nsid w:val="4B775B9F"/>
     <w:multiLevelType w:val="multilevel"/>
     <w:tmpl w:val="59F0DFC0"/>
@@ -5894,7 +7314,7 @@
       </w:rPr>
     </w:lvl>
   </w:abstractNum>
-  <w:abstractNum w:abstractNumId="8" w15:restartNumberingAfterBreak="0">
+  <w:abstractNum w:abstractNumId="12" w15:restartNumberingAfterBreak="0">
     <w:nsid w:val="4CC853E6"/>
     <w:multiLevelType w:val="hybridMultilevel"/>
     <w:tmpl w:val="EE5A802A"/>
@@ -5983,7 +7403,7 @@
       </w:pPr>
     </w:lvl>
   </w:abstractNum>
-  <w:abstractNum w:abstractNumId="9" w15:restartNumberingAfterBreak="0">
+  <w:abstractNum w:abstractNumId="13" w15:restartNumberingAfterBreak="0">
     <w:nsid w:val="5024467E"/>
     <w:multiLevelType w:val="multilevel"/>
     <w:tmpl w:val="47C2696C"/>
@@ -6096,7 +7516,7 @@
       </w:pPr>
     </w:lvl>
   </w:abstractNum>
-  <w:abstractNum w:abstractNumId="10" w15:restartNumberingAfterBreak="0">
+  <w:abstractNum w:abstractNumId="14" w15:restartNumberingAfterBreak="0">
     <w:nsid w:val="52037C0F"/>
     <w:multiLevelType w:val="hybridMultilevel"/>
     <w:tmpl w:val="79E831D6"/>
@@ -6185,7 +7605,7 @@
       </w:pPr>
     </w:lvl>
   </w:abstractNum>
-  <w:abstractNum w:abstractNumId="11" w15:restartNumberingAfterBreak="0">
+  <w:abstractNum w:abstractNumId="15" w15:restartNumberingAfterBreak="0">
     <w:nsid w:val="57773782"/>
     <w:multiLevelType w:val="multilevel"/>
     <w:tmpl w:val="5CDCD046"/>
@@ -6298,7 +7718,7 @@
       </w:pPr>
     </w:lvl>
   </w:abstractNum>
-  <w:abstractNum w:abstractNumId="12" w15:restartNumberingAfterBreak="0">
+  <w:abstractNum w:abstractNumId="16" w15:restartNumberingAfterBreak="0">
     <w:nsid w:val="6388121E"/>
     <w:multiLevelType w:val="multilevel"/>
     <w:tmpl w:val="9B3E0B22"/>
@@ -6447,7 +7867,7 @@
       </w:rPr>
     </w:lvl>
   </w:abstractNum>
-  <w:abstractNum w:abstractNumId="13" w15:restartNumberingAfterBreak="0">
+  <w:abstractNum w:abstractNumId="17" w15:restartNumberingAfterBreak="0">
     <w:nsid w:val="64CC43D4"/>
     <w:multiLevelType w:val="multilevel"/>
     <w:tmpl w:val="A4C0F546"/>
@@ -6560,7 +7980,7 @@
       </w:pPr>
     </w:lvl>
   </w:abstractNum>
-  <w:abstractNum w:abstractNumId="14" w15:restartNumberingAfterBreak="0">
+  <w:abstractNum w:abstractNumId="18" w15:restartNumberingAfterBreak="0">
     <w:nsid w:val="657807C3"/>
     <w:multiLevelType w:val="multilevel"/>
     <w:tmpl w:val="FFCE35C8"/>
@@ -6673,7 +8093,7 @@
       </w:pPr>
     </w:lvl>
   </w:abstractNum>
-  <w:abstractNum w:abstractNumId="15" w15:restartNumberingAfterBreak="0">
+  <w:abstractNum w:abstractNumId="19" w15:restartNumberingAfterBreak="0">
     <w:nsid w:val="697D2ACE"/>
     <w:multiLevelType w:val="multilevel"/>
     <w:tmpl w:val="9CD40468"/>
@@ -6822,7 +8242,7 @@
       </w:rPr>
     </w:lvl>
   </w:abstractNum>
-  <w:abstractNum w:abstractNumId="16" w15:restartNumberingAfterBreak="0">
+  <w:abstractNum w:abstractNumId="20" w15:restartNumberingAfterBreak="0">
     <w:nsid w:val="6C9B3408"/>
     <w:multiLevelType w:val="hybridMultilevel"/>
     <w:tmpl w:val="8020F4D2"/>
@@ -6911,7 +8331,7 @@
       </w:pPr>
     </w:lvl>
   </w:abstractNum>
-  <w:abstractNum w:abstractNumId="17" w15:restartNumberingAfterBreak="0">
+  <w:abstractNum w:abstractNumId="21" w15:restartNumberingAfterBreak="0">
     <w:nsid w:val="71261FB1"/>
     <w:multiLevelType w:val="multilevel"/>
     <w:tmpl w:val="E9DA0906"/>
@@ -7060,59 +8480,223 @@
       </w:rPr>
     </w:lvl>
   </w:abstractNum>
+  <w:abstractNum w:abstractNumId="22" w15:restartNumberingAfterBreak="0">
+    <w:nsid w:val="76E16EF7"/>
+    <w:multiLevelType w:val="multilevel"/>
+    <w:tmpl w:val="9B86DD72"/>
+    <w:lvl w:ilvl="0">
+      <w:start w:val="1"/>
+      <w:numFmt w:val="bullet"/>
+      <w:lvlText w:val=""/>
+      <w:lvlJc w:val="left"/>
+      <w:pPr>
+        <w:tabs>
+          <w:tab w:val="num" w:pos="720"/>
+        </w:tabs>
+        <w:ind w:left="720" w:hanging="360"/>
+      </w:pPr>
+      <w:rPr>
+        <w:rFonts w:ascii="Symbol" w:hAnsi="Symbol" w:hint="default"/>
+        <w:sz w:val="20"/>
+      </w:rPr>
+    </w:lvl>
+    <w:lvl w:ilvl="1" w:tentative="1">
+      <w:start w:val="1"/>
+      <w:numFmt w:val="bullet"/>
+      <w:lvlText w:val="o"/>
+      <w:lvlJc w:val="left"/>
+      <w:pPr>
+        <w:tabs>
+          <w:tab w:val="num" w:pos="1440"/>
+        </w:tabs>
+        <w:ind w:left="1440" w:hanging="360"/>
+      </w:pPr>
+      <w:rPr>
+        <w:rFonts w:ascii="Courier New" w:hAnsi="Courier New" w:hint="default"/>
+        <w:sz w:val="20"/>
+      </w:rPr>
+    </w:lvl>
+    <w:lvl w:ilvl="2" w:tentative="1">
+      <w:start w:val="1"/>
+      <w:numFmt w:val="bullet"/>
+      <w:lvlText w:val=""/>
+      <w:lvlJc w:val="left"/>
+      <w:pPr>
+        <w:tabs>
+          <w:tab w:val="num" w:pos="2160"/>
+        </w:tabs>
+        <w:ind w:left="2160" w:hanging="360"/>
+      </w:pPr>
+      <w:rPr>
+        <w:rFonts w:ascii="Wingdings" w:hAnsi="Wingdings" w:hint="default"/>
+        <w:sz w:val="20"/>
+      </w:rPr>
+    </w:lvl>
+    <w:lvl w:ilvl="3" w:tentative="1">
+      <w:start w:val="1"/>
+      <w:numFmt w:val="bullet"/>
+      <w:lvlText w:val=""/>
+      <w:lvlJc w:val="left"/>
+      <w:pPr>
+        <w:tabs>
+          <w:tab w:val="num" w:pos="2880"/>
+        </w:tabs>
+        <w:ind w:left="2880" w:hanging="360"/>
+      </w:pPr>
+      <w:rPr>
+        <w:rFonts w:ascii="Wingdings" w:hAnsi="Wingdings" w:hint="default"/>
+        <w:sz w:val="20"/>
+      </w:rPr>
+    </w:lvl>
+    <w:lvl w:ilvl="4" w:tentative="1">
+      <w:start w:val="1"/>
+      <w:numFmt w:val="bullet"/>
+      <w:lvlText w:val=""/>
+      <w:lvlJc w:val="left"/>
+      <w:pPr>
+        <w:tabs>
+          <w:tab w:val="num" w:pos="3600"/>
+        </w:tabs>
+        <w:ind w:left="3600" w:hanging="360"/>
+      </w:pPr>
+      <w:rPr>
+        <w:rFonts w:ascii="Wingdings" w:hAnsi="Wingdings" w:hint="default"/>
+        <w:sz w:val="20"/>
+      </w:rPr>
+    </w:lvl>
+    <w:lvl w:ilvl="5" w:tentative="1">
+      <w:start w:val="1"/>
+      <w:numFmt w:val="bullet"/>
+      <w:lvlText w:val=""/>
+      <w:lvlJc w:val="left"/>
+      <w:pPr>
+        <w:tabs>
+          <w:tab w:val="num" w:pos="4320"/>
+        </w:tabs>
+        <w:ind w:left="4320" w:hanging="360"/>
+      </w:pPr>
+      <w:rPr>
+        <w:rFonts w:ascii="Wingdings" w:hAnsi="Wingdings" w:hint="default"/>
+        <w:sz w:val="20"/>
+      </w:rPr>
+    </w:lvl>
+    <w:lvl w:ilvl="6" w:tentative="1">
+      <w:start w:val="1"/>
+      <w:numFmt w:val="bullet"/>
+      <w:lvlText w:val=""/>
+      <w:lvlJc w:val="left"/>
+      <w:pPr>
+        <w:tabs>
+          <w:tab w:val="num" w:pos="5040"/>
+        </w:tabs>
+        <w:ind w:left="5040" w:hanging="360"/>
+      </w:pPr>
+      <w:rPr>
+        <w:rFonts w:ascii="Wingdings" w:hAnsi="Wingdings" w:hint="default"/>
+        <w:sz w:val="20"/>
+      </w:rPr>
+    </w:lvl>
+    <w:lvl w:ilvl="7" w:tentative="1">
+      <w:start w:val="1"/>
+      <w:numFmt w:val="bullet"/>
+      <w:lvlText w:val=""/>
+      <w:lvlJc w:val="left"/>
+      <w:pPr>
+        <w:tabs>
+          <w:tab w:val="num" w:pos="5760"/>
+        </w:tabs>
+        <w:ind w:left="5760" w:hanging="360"/>
+      </w:pPr>
+      <w:rPr>
+        <w:rFonts w:ascii="Wingdings" w:hAnsi="Wingdings" w:hint="default"/>
+        <w:sz w:val="20"/>
+      </w:rPr>
+    </w:lvl>
+    <w:lvl w:ilvl="8" w:tentative="1">
+      <w:start w:val="1"/>
+      <w:numFmt w:val="bullet"/>
+      <w:lvlText w:val=""/>
+      <w:lvlJc w:val="left"/>
+      <w:pPr>
+        <w:tabs>
+          <w:tab w:val="num" w:pos="6480"/>
+        </w:tabs>
+        <w:ind w:left="6480" w:hanging="360"/>
+      </w:pPr>
+      <w:rPr>
+        <w:rFonts w:ascii="Wingdings" w:hAnsi="Wingdings" w:hint="default"/>
+        <w:sz w:val="20"/>
+      </w:rPr>
+    </w:lvl>
+  </w:abstractNum>
   <w:num w:numId="1" w16cid:durableId="1559707127">
-    <w:abstractNumId w:val="8"/>
+    <w:abstractNumId w:val="12"/>
   </w:num>
   <w:num w:numId="2" w16cid:durableId="1412505344">
-    <w:abstractNumId w:val="16"/>
+    <w:abstractNumId w:val="20"/>
   </w:num>
   <w:num w:numId="3" w16cid:durableId="1720130656">
+    <w:abstractNumId w:val="14"/>
+  </w:num>
+  <w:num w:numId="4" w16cid:durableId="398478300">
+    <w:abstractNumId w:val="3"/>
+  </w:num>
+  <w:num w:numId="5" w16cid:durableId="1594166929">
+    <w:abstractNumId w:val="18"/>
+  </w:num>
+  <w:num w:numId="6" w16cid:durableId="2074574558">
     <w:abstractNumId w:val="10"/>
   </w:num>
-  <w:num w:numId="4" w16cid:durableId="398478300">
-    <w:abstractNumId w:val="1"/>
+  <w:num w:numId="7" w16cid:durableId="25328626">
+    <w:abstractNumId w:val="17"/>
   </w:num>
-  <w:num w:numId="5" w16cid:durableId="1594166929">
-    <w:abstractNumId w:val="14"/>
+  <w:num w:numId="8" w16cid:durableId="1557087885">
+    <w:abstractNumId w:val="15"/>
   </w:num>
-  <w:num w:numId="6" w16cid:durableId="2074574558">
+  <w:num w:numId="9" w16cid:durableId="725224153">
     <w:abstractNumId w:val="6"/>
   </w:num>
-  <w:num w:numId="7" w16cid:durableId="25328626">
+  <w:num w:numId="10" w16cid:durableId="1912740116">
     <w:abstractNumId w:val="13"/>
   </w:num>
-  <w:num w:numId="8" w16cid:durableId="1557087885">
+  <w:num w:numId="11" w16cid:durableId="904074126">
     <w:abstractNumId w:val="11"/>
   </w:num>
-  <w:num w:numId="9" w16cid:durableId="725224153">
-    <w:abstractNumId w:val="4"/>
-  </w:num>
-  <w:num w:numId="10" w16cid:durableId="1912740116">
-    <w:abstractNumId w:val="9"/>
-  </w:num>
-  <w:num w:numId="11" w16cid:durableId="904074126">
-    <w:abstractNumId w:val="7"/>
-  </w:num>
   <w:num w:numId="12" w16cid:durableId="692606710">
-    <w:abstractNumId w:val="15"/>
+    <w:abstractNumId w:val="19"/>
   </w:num>
   <w:num w:numId="13" w16cid:durableId="1740976664">
-    <w:abstractNumId w:val="3"/>
+    <w:abstractNumId w:val="5"/>
   </w:num>
   <w:num w:numId="14" w16cid:durableId="772166234">
-    <w:abstractNumId w:val="5"/>
+    <w:abstractNumId w:val="7"/>
   </w:num>
   <w:num w:numId="15" w16cid:durableId="902183955">
     <w:abstractNumId w:val="0"/>
   </w:num>
   <w:num w:numId="16" w16cid:durableId="1200631374">
-    <w:abstractNumId w:val="12"/>
+    <w:abstractNumId w:val="16"/>
   </w:num>
   <w:num w:numId="17" w16cid:durableId="1567450560">
+    <w:abstractNumId w:val="4"/>
+  </w:num>
+  <w:num w:numId="18" w16cid:durableId="1153185035">
+    <w:abstractNumId w:val="21"/>
+  </w:num>
+  <w:num w:numId="19" w16cid:durableId="2007629974">
+    <w:abstractNumId w:val="9"/>
+  </w:num>
+  <w:num w:numId="20" w16cid:durableId="506098956">
+    <w:abstractNumId w:val="1"/>
+  </w:num>
+  <w:num w:numId="21" w16cid:durableId="2041517171">
     <w:abstractNumId w:val="2"/>
   </w:num>
-  <w:num w:numId="18" w16cid:durableId="1153185035">
-    <w:abstractNumId w:val="17"/>
+  <w:num w:numId="22" w16cid:durableId="1350371167">
+    <w:abstractNumId w:val="8"/>
+  </w:num>
+  <w:num w:numId="23" w16cid:durableId="1887568281">
+    <w:abstractNumId w:val="22"/>
   </w:num>
 </w:numbering>
 </file>
@@ -7517,7 +9101,7 @@
   <w:style w:type="paragraph" w:default="1" w:styleId="Normal">
     <w:name w:val="Normal"/>
     <w:qFormat/>
-    <w:rsid w:val="005B0A40"/>
+    <w:rsid w:val="00726625"/>
   </w:style>
   <w:style w:type="character" w:default="1" w:styleId="DefaultParagraphFont">
     <w:name w:val="Default Paragraph Font"/>

</xml_diff>

<commit_message>
Week 10 Lab Requirement Updated
</commit_message>
<xml_diff>
--- a/LABlogbook.docx
+++ b/LABlogbook.docx
@@ -4782,7 +4782,10 @@
     </w:p>
     <w:p>
       <w:pPr>
-        <w:jc w:val="center"/>
+        <w:tabs>
+          <w:tab w:val="center" w:pos="4513"/>
+          <w:tab w:val="left" w:pos="7185"/>
+        </w:tabs>
         <w:rPr>
           <w:b/>
           <w:bCs/>
@@ -4800,7 +4803,27 @@
           <w:lang w:val="de-DE"/>
         </w:rPr>
         <w:lastRenderedPageBreak/>
+        <w:tab/>
+      </w:r>
+      <w:r>
+        <w:rPr>
+          <w:b/>
+          <w:bCs/>
+          <w:sz w:val="44"/>
+          <w:szCs w:val="44"/>
+          <w:lang w:val="de-DE"/>
+        </w:rPr>
         <w:t>Lab 10</w:t>
+      </w:r>
+      <w:r>
+        <w:rPr>
+          <w:b/>
+          <w:bCs/>
+          <w:sz w:val="44"/>
+          <w:szCs w:val="44"/>
+          <w:lang w:val="de-DE"/>
+        </w:rPr>
+        <w:tab/>
       </w:r>
     </w:p>
     <w:p>

</xml_diff>